<commit_message>
Actualización de docs/brief.md para incluir la V3. Correcciones de formato de TP3.
</commit_message>
<xml_diff>
--- a/docs/entregas/TP3-Summate.docx
+++ b/docs/entregas/TP3-Summate.docx
@@ -4,7 +4,7 @@
   <w:body>
     <w:p>
       <w:pPr>
-        <w:spacing w:before="520" w:after="260"/>
+        <w:spacing w:before="700" w:after="240" w:line="240" w:lineRule="auto"/>
         <w:jc w:val="center"/>
       </w:pPr>
       <w:r>
@@ -12,10 +12,10 @@
           <w:noProof/>
         </w:rPr>
         <w:drawing>
-          <wp:inline distT="0" distB="0" distL="0" distR="0" wp14:anchorId="7FADFBB4" wp14:editId="509E279E">
-            <wp:extent cx="1188000" cy="1188000"/>
+          <wp:inline distT="0" distB="0" distL="0" distR="0" wp14:anchorId="4A3130CE" wp14:editId="5C2A3676">
+            <wp:extent cx="1620000" cy="1620000"/>
             <wp:effectExtent l="0" t="0" r="0" b="0"/>
-            <wp:docPr id="1" name="Picture 1" descr="Isologotipo de la Universidad Nacional de La Matanza" title="Isologotipo de la Universidad Nacional de La Matanza"/>
+            <wp:docPr id="90" name="Logo UNLaM" descr="Logotipo de la Universidad Nacional de La Matanza" title="UNLaM"/>
             <wp:cNvGraphicFramePr>
               <a:graphicFrameLocks xmlns:a="http://schemas.openxmlformats.org/drawingml/2006/main" noChangeAspect="1"/>
             </wp:cNvGraphicFramePr>
@@ -23,7 +23,7 @@
               <a:graphicData uri="http://schemas.openxmlformats.org/drawingml/2006/picture">
                 <pic:pic xmlns:pic="http://schemas.openxmlformats.org/drawingml/2006/picture">
                   <pic:nvPicPr>
-                    <pic:cNvPr id="0" name="unlam-logo.png"/>
+                    <pic:cNvPr id="0" name="logo-unlam.png"/>
                     <pic:cNvPicPr/>
                   </pic:nvPicPr>
                   <pic:blipFill>
@@ -35,7 +35,7 @@
                   <pic:spPr>
                     <a:xfrm>
                       <a:off x="0" y="0"/>
-                      <a:ext cx="1188000" cy="1188000"/>
+                      <a:ext cx="1620000" cy="1620000"/>
                     </a:xfrm>
                     <a:prstGeom prst="rect">
                       <a:avLst/>
@@ -50,215 +50,261 @@
     </w:p>
     <w:p>
       <w:pPr>
-        <w:spacing w:after="60"/>
+        <w:spacing w:after="80" w:line="240" w:lineRule="auto"/>
         <w:jc w:val="center"/>
         <w:rPr>
-          <w:lang w:val="es-US"/>
+          <w:lang w:val="es-AR"/>
         </w:rPr>
       </w:pPr>
       <w:r>
         <w:rPr>
+          <w:rFonts w:cs="Arial"/>
           <w:b/>
-          <w:color w:val="1F4E78"/>
-          <w:sz w:val="32"/>
-          <w:lang w:val="es-US"/>
+          <w:color w:val="1F4E79"/>
+          <w:spacing w:val="30"/>
+          <w:sz w:val="30"/>
+          <w:szCs w:val="30"/>
+          <w:lang w:val="es-AR"/>
         </w:rPr>
         <w:t>UNIVERSIDAD NACIONAL DE LA MATANZA</w:t>
       </w:r>
     </w:p>
     <w:p>
       <w:pPr>
-        <w:spacing w:after="0"/>
+        <w:spacing w:after="20" w:line="240" w:lineRule="auto"/>
         <w:jc w:val="center"/>
         <w:rPr>
-          <w:lang w:val="es-US"/>
+          <w:lang w:val="es-AR"/>
         </w:rPr>
       </w:pPr>
       <w:r>
         <w:rPr>
-          <w:lang w:val="es-US"/>
+          <w:rFonts w:cs="Arial"/>
+          <w:color w:val="111111"/>
+          <w:szCs w:val="21"/>
+          <w:lang w:val="es-AR"/>
         </w:rPr>
         <w:t>Departamento de Ingeniería e Investigaciones Tecnológicas</w:t>
       </w:r>
     </w:p>
     <w:p>
       <w:pPr>
-        <w:spacing w:after="0"/>
+        <w:spacing w:after="20" w:line="240" w:lineRule="auto"/>
         <w:jc w:val="center"/>
         <w:rPr>
-          <w:lang w:val="es-US"/>
+          <w:lang w:val="es-AR"/>
         </w:rPr>
       </w:pPr>
       <w:r>
         <w:rPr>
-          <w:lang w:val="es-US"/>
+          <w:rFonts w:cs="Arial"/>
+          <w:color w:val="111111"/>
+          <w:szCs w:val="21"/>
+          <w:lang w:val="es-AR"/>
         </w:rPr>
         <w:t>Ingeniería Informática</w:t>
       </w:r>
     </w:p>
     <w:p>
       <w:pPr>
-        <w:spacing w:after="0"/>
+        <w:pBdr>
+          <w:bottom w:val="single" w:sz="6" w:space="6" w:color="B7B7B7"/>
+        </w:pBdr>
+        <w:spacing w:after="0" w:line="240" w:lineRule="auto"/>
         <w:jc w:val="center"/>
         <w:rPr>
-          <w:lang w:val="es-US"/>
+          <w:lang w:val="es-AR"/>
         </w:rPr>
       </w:pPr>
       <w:r>
         <w:rPr>
+          <w:rFonts w:cs="Arial"/>
           <w:i/>
-          <w:sz w:val="20"/>
-          <w:lang w:val="es-US"/>
+          <w:color w:val="111111"/>
+          <w:szCs w:val="21"/>
+          <w:lang w:val="es-AR"/>
         </w:rPr>
         <w:t>Gestión Aplicada al Desarrollo de Software II (3665)</w:t>
       </w:r>
     </w:p>
     <w:p>
       <w:pPr>
-        <w:pBdr>
-          <w:bottom w:val="single" w:sz="5" w:space="2" w:color="B7B7B7"/>
-        </w:pBdr>
-        <w:spacing w:before="100" w:after="680"/>
-        <w:rPr>
-          <w:lang w:val="es-US"/>
-        </w:rPr>
-      </w:pPr>
-    </w:p>
-    <w:p>
-      <w:pPr>
-        <w:spacing w:after="140"/>
+        <w:spacing w:before="1100" w:line="240" w:lineRule="auto"/>
         <w:jc w:val="center"/>
         <w:rPr>
-          <w:lang w:val="es-US"/>
+          <w:lang w:val="es-AR"/>
         </w:rPr>
       </w:pPr>
       <w:r>
         <w:rPr>
+          <w:rFonts w:cs="Arial"/>
           <w:b/>
           <w:color w:val="666666"/>
-          <w:sz w:val="23"/>
-          <w:lang w:val="es-US"/>
+          <w:spacing w:val="30"/>
+          <w:sz w:val="20"/>
+          <w:szCs w:val="20"/>
+          <w:lang w:val="es-AR"/>
         </w:rPr>
         <w:t>TRABAJO PRÁCTICO N.º 3</w:t>
       </w:r>
     </w:p>
     <w:p>
       <w:pPr>
-        <w:spacing w:after="360"/>
+        <w:spacing w:after="420" w:line="240" w:lineRule="auto"/>
         <w:jc w:val="center"/>
         <w:rPr>
-          <w:lang w:val="es-US"/>
+          <w:lang w:val="es-AR"/>
         </w:rPr>
       </w:pPr>
       <w:r>
         <w:rPr>
+          <w:rFonts w:cs="Arial"/>
           <w:b/>
-          <w:color w:val="1F4E78"/>
-          <w:sz w:val="39"/>
-          <w:lang w:val="es-US"/>
+          <w:color w:val="1F4E79"/>
+          <w:sz w:val="40"/>
+          <w:szCs w:val="40"/>
+          <w:lang w:val="es-AR"/>
         </w:rPr>
         <w:t>Scope del MVP y Diseño de la Interacción</w:t>
       </w:r>
     </w:p>
     <w:p>
       <w:pPr>
-        <w:spacing w:after="460"/>
+        <w:spacing w:after="0" w:line="240" w:lineRule="auto"/>
         <w:jc w:val="center"/>
+        <w:rPr>
+          <w:lang w:val="es-AR"/>
+        </w:rPr>
       </w:pPr>
       <w:r>
         <w:rPr>
-          <w:sz w:val="25"/>
+          <w:rFonts w:cs="Arial"/>
+          <w:color w:val="111111"/>
+          <w:sz w:val="26"/>
+          <w:szCs w:val="26"/>
+          <w:lang w:val="es-AR"/>
         </w:rPr>
         <w:t xml:space="preserve">Equipo: </w:t>
       </w:r>
+      <w:proofErr w:type="spellStart"/>
       <w:r>
         <w:rPr>
+          <w:rFonts w:cs="Arial"/>
           <w:b/>
-          <w:sz w:val="25"/>
+          <w:sz w:val="26"/>
+          <w:szCs w:val="26"/>
+          <w:lang w:val="es-AR"/>
         </w:rPr>
         <w:t>Summate</w:t>
       </w:r>
+      <w:proofErr w:type="spellEnd"/>
     </w:p>
     <w:p>
+      <w:pPr>
+        <w:spacing w:before="700" w:line="240" w:lineRule="auto"/>
+        <w:rPr>
+          <w:lang w:val="es-AR"/>
+        </w:rPr>
+      </w:pPr>
       <w:r>
         <w:rPr>
+          <w:rFonts w:cs="Arial"/>
           <w:b/>
-          <w:color w:val="1F4E78"/>
-          <w:sz w:val="23"/>
+          <w:color w:val="1F4E79"/>
+          <w:sz w:val="24"/>
+          <w:szCs w:val="24"/>
+          <w:lang w:val="es-AR"/>
         </w:rPr>
         <w:t>Integrantes</w:t>
       </w:r>
     </w:p>
     <w:tbl>
       <w:tblPr>
-        <w:tblStyle w:val="Tablaconcuadrcula"/>
-        <w:tblW w:w="9080" w:type="dxa"/>
-        <w:tblBorders>
-          <w:top w:val="single" w:sz="5" w:space="0" w:color="B7B7B7"/>
-          <w:left w:val="single" w:sz="5" w:space="0" w:color="B7B7B7"/>
-          <w:bottom w:val="single" w:sz="5" w:space="0" w:color="B7B7B7"/>
-          <w:right w:val="single" w:sz="5" w:space="0" w:color="B7B7B7"/>
-          <w:insideH w:val="single" w:sz="5" w:space="0" w:color="B7B7B7"/>
-          <w:insideV w:val="single" w:sz="5" w:space="0" w:color="B7B7B7"/>
-        </w:tblBorders>
+        <w:tblW w:w="9014" w:type="dxa"/>
         <w:tblLayout w:type="fixed"/>
-        <w:tblLook w:val="04A0" w:firstRow="1" w:lastRow="0" w:firstColumn="1" w:lastColumn="0" w:noHBand="0" w:noVBand="1"/>
+        <w:tblLook w:val="0420" w:firstRow="1" w:lastRow="0" w:firstColumn="0" w:lastColumn="0" w:noHBand="0" w:noVBand="1"/>
       </w:tblPr>
       <w:tblGrid>
         <w:gridCol w:w="2100"/>
         <w:gridCol w:w="2100"/>
         <w:gridCol w:w="1400"/>
-        <w:gridCol w:w="3480"/>
+        <w:gridCol w:w="3414"/>
       </w:tblGrid>
       <w:tr>
         <w:trPr>
-          <w:tblHeader/>
+          <w:cantSplit/>
         </w:trPr>
         <w:tc>
           <w:tcPr>
             <w:tcW w:w="2100" w:type="dxa"/>
-            <w:shd w:val="clear" w:color="auto" w:fill="1F4E78"/>
+            <w:tcBorders>
+              <w:top w:val="single" w:sz="4" w:space="0" w:color="B7B7B7"/>
+              <w:left w:val="single" w:sz="4" w:space="0" w:color="B7B7B7"/>
+              <w:bottom w:val="single" w:sz="4" w:space="0" w:color="B7B7B7"/>
+              <w:right w:val="single" w:sz="4" w:space="0" w:color="B7B7B7"/>
+            </w:tcBorders>
+            <w:shd w:val="clear" w:color="auto" w:fill="1F4E79"/>
             <w:tcMar>
-              <w:top w:w="75" w:type="dxa"/>
-              <w:left w:w="110" w:type="dxa"/>
-              <w:bottom w:w="75" w:type="dxa"/>
-              <w:right w:w="110" w:type="dxa"/>
+              <w:top w:w="80" w:type="dxa"/>
+              <w:left w:w="113" w:type="dxa"/>
+              <w:bottom w:w="80" w:type="dxa"/>
+              <w:right w:w="113" w:type="dxa"/>
             </w:tcMar>
+            <w:vAlign w:val="center"/>
           </w:tcPr>
           <w:p>
             <w:pPr>
               <w:spacing w:after="0" w:line="240" w:lineRule="auto"/>
+              <w:rPr>
+                <w:lang w:val="es-AR"/>
+              </w:rPr>
             </w:pPr>
             <w:r>
               <w:rPr>
+                <w:rFonts w:cs="Arial"/>
                 <w:b/>
                 <w:color w:val="FFFFFF"/>
-                <w:sz w:val="18"/>
-              </w:rPr>
-              <w:t>Apellido</w:t>
+                <w:sz w:val="19"/>
+                <w:szCs w:val="19"/>
+                <w:lang w:val="es-AR"/>
+              </w:rPr>
+              <w:t xml:space="preserve">Apellido </w:t>
             </w:r>
           </w:p>
         </w:tc>
         <w:tc>
           <w:tcPr>
             <w:tcW w:w="2100" w:type="dxa"/>
-            <w:shd w:val="clear" w:color="auto" w:fill="1F4E78"/>
+            <w:tcBorders>
+              <w:top w:val="single" w:sz="4" w:space="0" w:color="B7B7B7"/>
+              <w:left w:val="single" w:sz="4" w:space="0" w:color="B7B7B7"/>
+              <w:bottom w:val="single" w:sz="4" w:space="0" w:color="B7B7B7"/>
+              <w:right w:val="single" w:sz="4" w:space="0" w:color="B7B7B7"/>
+            </w:tcBorders>
+            <w:shd w:val="clear" w:color="auto" w:fill="1F4E79"/>
             <w:tcMar>
-              <w:top w:w="75" w:type="dxa"/>
-              <w:left w:w="110" w:type="dxa"/>
-              <w:bottom w:w="75" w:type="dxa"/>
-              <w:right w:w="110" w:type="dxa"/>
+              <w:top w:w="80" w:type="dxa"/>
+              <w:left w:w="113" w:type="dxa"/>
+              <w:bottom w:w="80" w:type="dxa"/>
+              <w:right w:w="113" w:type="dxa"/>
             </w:tcMar>
+            <w:vAlign w:val="center"/>
           </w:tcPr>
           <w:p>
             <w:pPr>
               <w:spacing w:after="0" w:line="240" w:lineRule="auto"/>
+              <w:rPr>
+                <w:lang w:val="es-AR"/>
+              </w:rPr>
             </w:pPr>
             <w:r>
               <w:rPr>
+                <w:rFonts w:cs="Arial"/>
                 <w:b/>
                 <w:color w:val="FFFFFF"/>
-                <w:sz w:val="18"/>
+                <w:sz w:val="19"/>
+                <w:szCs w:val="19"/>
+                <w:lang w:val="es-AR"/>
               </w:rPr>
               <w:t>Nombre</w:t>
             </w:r>
@@ -267,23 +313,36 @@
         <w:tc>
           <w:tcPr>
             <w:tcW w:w="1400" w:type="dxa"/>
-            <w:shd w:val="clear" w:color="auto" w:fill="1F4E78"/>
+            <w:tcBorders>
+              <w:top w:val="single" w:sz="4" w:space="0" w:color="B7B7B7"/>
+              <w:left w:val="single" w:sz="4" w:space="0" w:color="B7B7B7"/>
+              <w:bottom w:val="single" w:sz="4" w:space="0" w:color="B7B7B7"/>
+              <w:right w:val="single" w:sz="4" w:space="0" w:color="B7B7B7"/>
+            </w:tcBorders>
+            <w:shd w:val="clear" w:color="auto" w:fill="1F4E79"/>
             <w:tcMar>
-              <w:top w:w="75" w:type="dxa"/>
-              <w:left w:w="110" w:type="dxa"/>
-              <w:bottom w:w="75" w:type="dxa"/>
-              <w:right w:w="110" w:type="dxa"/>
+              <w:top w:w="80" w:type="dxa"/>
+              <w:left w:w="113" w:type="dxa"/>
+              <w:bottom w:w="80" w:type="dxa"/>
+              <w:right w:w="113" w:type="dxa"/>
             </w:tcMar>
+            <w:vAlign w:val="center"/>
           </w:tcPr>
           <w:p>
             <w:pPr>
               <w:spacing w:after="0" w:line="240" w:lineRule="auto"/>
+              <w:rPr>
+                <w:lang w:val="es-AR"/>
+              </w:rPr>
             </w:pPr>
             <w:r>
               <w:rPr>
+                <w:rFonts w:cs="Arial"/>
                 <w:b/>
                 <w:color w:val="FFFFFF"/>
-                <w:sz w:val="18"/>
+                <w:sz w:val="19"/>
+                <w:szCs w:val="19"/>
+                <w:lang w:val="es-AR"/>
               </w:rPr>
               <w:t>DNI</w:t>
             </w:r>
@@ -291,24 +350,37 @@
         </w:tc>
         <w:tc>
           <w:tcPr>
-            <w:tcW w:w="3480" w:type="dxa"/>
-            <w:shd w:val="clear" w:color="auto" w:fill="1F4E78"/>
+            <w:tcW w:w="3414" w:type="dxa"/>
+            <w:tcBorders>
+              <w:top w:val="single" w:sz="4" w:space="0" w:color="B7B7B7"/>
+              <w:left w:val="single" w:sz="4" w:space="0" w:color="B7B7B7"/>
+              <w:bottom w:val="single" w:sz="4" w:space="0" w:color="B7B7B7"/>
+              <w:right w:val="single" w:sz="4" w:space="0" w:color="B7B7B7"/>
+            </w:tcBorders>
+            <w:shd w:val="clear" w:color="auto" w:fill="1F4E79"/>
             <w:tcMar>
-              <w:top w:w="75" w:type="dxa"/>
-              <w:left w:w="110" w:type="dxa"/>
-              <w:bottom w:w="75" w:type="dxa"/>
-              <w:right w:w="110" w:type="dxa"/>
+              <w:top w:w="80" w:type="dxa"/>
+              <w:left w:w="113" w:type="dxa"/>
+              <w:bottom w:w="80" w:type="dxa"/>
+              <w:right w:w="113" w:type="dxa"/>
             </w:tcMar>
+            <w:vAlign w:val="center"/>
           </w:tcPr>
           <w:p>
             <w:pPr>
               <w:spacing w:after="0" w:line="240" w:lineRule="auto"/>
+              <w:rPr>
+                <w:lang w:val="es-AR"/>
+              </w:rPr>
             </w:pPr>
             <w:r>
               <w:rPr>
+                <w:rFonts w:cs="Arial"/>
                 <w:b/>
                 <w:color w:val="FFFFFF"/>
-                <w:sz w:val="18"/>
+                <w:sz w:val="19"/>
+                <w:szCs w:val="19"/>
+                <w:lang w:val="es-AR"/>
               </w:rPr>
               <w:t>Correo electrónico</w:t>
             </w:r>
@@ -316,47 +388,70 @@
         </w:tc>
       </w:tr>
       <w:tr>
+        <w:trPr>
+          <w:cantSplit/>
+        </w:trPr>
         <w:tc>
           <w:tcPr>
             <w:tcW w:w="2100" w:type="dxa"/>
+            <w:tcBorders>
+              <w:top w:val="single" w:sz="4" w:space="0" w:color="B7B7B7"/>
+              <w:left w:val="single" w:sz="4" w:space="0" w:color="B7B7B7"/>
+              <w:bottom w:val="single" w:sz="4" w:space="0" w:color="B7B7B7"/>
+              <w:right w:val="single" w:sz="4" w:space="0" w:color="B7B7B7"/>
+            </w:tcBorders>
             <w:tcMar>
-              <w:top w:w="75" w:type="dxa"/>
-              <w:left w:w="110" w:type="dxa"/>
-              <w:bottom w:w="75" w:type="dxa"/>
-              <w:right w:w="110" w:type="dxa"/>
+              <w:top w:w="80" w:type="dxa"/>
+              <w:left w:w="113" w:type="dxa"/>
+              <w:bottom w:w="80" w:type="dxa"/>
+              <w:right w:w="113" w:type="dxa"/>
             </w:tcMar>
             <w:vAlign w:val="center"/>
           </w:tcPr>
           <w:p>
             <w:pPr>
               <w:spacing w:after="0" w:line="240" w:lineRule="auto"/>
+              <w:rPr>
+                <w:lang w:val="es-AR"/>
+              </w:rPr>
             </w:pPr>
+            <w:proofErr w:type="spellStart"/>
             <w:r>
               <w:rPr>
-                <w:sz w:val="18"/>
+                <w:lang w:val="es-AR"/>
               </w:rPr>
               <w:t>Agasi</w:t>
             </w:r>
+            <w:proofErr w:type="spellEnd"/>
           </w:p>
         </w:tc>
         <w:tc>
           <w:tcPr>
             <w:tcW w:w="2100" w:type="dxa"/>
+            <w:tcBorders>
+              <w:top w:val="single" w:sz="4" w:space="0" w:color="B7B7B7"/>
+              <w:left w:val="single" w:sz="4" w:space="0" w:color="B7B7B7"/>
+              <w:bottom w:val="single" w:sz="4" w:space="0" w:color="B7B7B7"/>
+              <w:right w:val="single" w:sz="4" w:space="0" w:color="B7B7B7"/>
+            </w:tcBorders>
             <w:tcMar>
-              <w:top w:w="75" w:type="dxa"/>
-              <w:left w:w="110" w:type="dxa"/>
-              <w:bottom w:w="75" w:type="dxa"/>
-              <w:right w:w="110" w:type="dxa"/>
+              <w:top w:w="80" w:type="dxa"/>
+              <w:left w:w="113" w:type="dxa"/>
+              <w:bottom w:w="80" w:type="dxa"/>
+              <w:right w:w="113" w:type="dxa"/>
             </w:tcMar>
             <w:vAlign w:val="center"/>
           </w:tcPr>
           <w:p>
             <w:pPr>
               <w:spacing w:after="0" w:line="240" w:lineRule="auto"/>
+              <w:rPr>
+                <w:lang w:val="es-AR"/>
+              </w:rPr>
             </w:pPr>
             <w:r>
               <w:rPr>
-                <w:sz w:val="18"/>
+                <w:lang w:val="es-AR"/>
               </w:rPr>
               <w:t>Alejo</w:t>
             </w:r>
@@ -365,22 +460,34 @@
         <w:tc>
           <w:tcPr>
             <w:tcW w:w="1400" w:type="dxa"/>
+            <w:tcBorders>
+              <w:top w:val="single" w:sz="4" w:space="0" w:color="B7B7B7"/>
+              <w:left w:val="single" w:sz="4" w:space="0" w:color="B7B7B7"/>
+              <w:bottom w:val="single" w:sz="4" w:space="0" w:color="B7B7B7"/>
+              <w:right w:val="single" w:sz="4" w:space="0" w:color="B7B7B7"/>
+            </w:tcBorders>
             <w:tcMar>
-              <w:top w:w="75" w:type="dxa"/>
-              <w:left w:w="110" w:type="dxa"/>
-              <w:bottom w:w="75" w:type="dxa"/>
-              <w:right w:w="110" w:type="dxa"/>
+              <w:top w:w="80" w:type="dxa"/>
+              <w:left w:w="113" w:type="dxa"/>
+              <w:bottom w:w="80" w:type="dxa"/>
+              <w:right w:w="113" w:type="dxa"/>
             </w:tcMar>
             <w:vAlign w:val="center"/>
           </w:tcPr>
           <w:p>
             <w:pPr>
               <w:spacing w:after="0" w:line="240" w:lineRule="auto"/>
+              <w:rPr>
+                <w:lang w:val="es-AR"/>
+              </w:rPr>
             </w:pPr>
             <w:r>
               <w:rPr>
+                <w:rFonts w:cs="Arial"/>
                 <w:i/>
-                <w:sz w:val="18"/>
+                <w:sz w:val="19"/>
+                <w:szCs w:val="19"/>
+                <w:lang w:val="es-AR"/>
               </w:rPr>
               <w:t>43034043</w:t>
             </w:r>
@@ -388,26 +495,36 @@
         </w:tc>
         <w:tc>
           <w:tcPr>
-            <w:tcW w:w="3480" w:type="dxa"/>
+            <w:tcW w:w="3414" w:type="dxa"/>
+            <w:tcBorders>
+              <w:top w:val="single" w:sz="4" w:space="0" w:color="B7B7B7"/>
+              <w:left w:val="single" w:sz="4" w:space="0" w:color="B7B7B7"/>
+              <w:bottom w:val="single" w:sz="4" w:space="0" w:color="B7B7B7"/>
+              <w:right w:val="single" w:sz="4" w:space="0" w:color="B7B7B7"/>
+            </w:tcBorders>
             <w:tcMar>
-              <w:top w:w="75" w:type="dxa"/>
-              <w:left w:w="110" w:type="dxa"/>
-              <w:bottom w:w="75" w:type="dxa"/>
-              <w:right w:w="110" w:type="dxa"/>
+              <w:top w:w="80" w:type="dxa"/>
+              <w:left w:w="113" w:type="dxa"/>
+              <w:bottom w:w="80" w:type="dxa"/>
+              <w:right w:w="113" w:type="dxa"/>
             </w:tcMar>
-            <w:vAlign w:val="center"/>
           </w:tcPr>
           <w:p>
             <w:pPr>
               <w:spacing w:after="0" w:line="240" w:lineRule="auto"/>
+              <w:rPr>
+                <w:lang w:val="es-AR"/>
+              </w:rPr>
             </w:pPr>
             <w:hyperlink r:id="rId9">
               <w:r>
                 <w:rPr>
+                  <w:rStyle w:val="Hipervnculo"/>
+                  <w:rFonts w:cs="Arial"/>
                   <w:i/>
-                  <w:color w:val="0000FF"/>
-                  <w:sz w:val="20"/>
-                  <w:u w:val="single"/>
+                  <w:sz w:val="19"/>
+                  <w:szCs w:val="19"/>
+                  <w:lang w:val="es-AR"/>
                 </w:rPr>
                 <w:t>aagasi@alumno.unlam.edu.ar</w:t>
               </w:r>
@@ -416,24 +533,36 @@
         </w:tc>
       </w:tr>
       <w:tr>
+        <w:trPr>
+          <w:cantSplit/>
+        </w:trPr>
         <w:tc>
           <w:tcPr>
             <w:tcW w:w="2100" w:type="dxa"/>
+            <w:tcBorders>
+              <w:top w:val="single" w:sz="4" w:space="0" w:color="B7B7B7"/>
+              <w:left w:val="single" w:sz="4" w:space="0" w:color="B7B7B7"/>
+              <w:bottom w:val="single" w:sz="4" w:space="0" w:color="B7B7B7"/>
+              <w:right w:val="single" w:sz="4" w:space="0" w:color="B7B7B7"/>
+            </w:tcBorders>
             <w:tcMar>
-              <w:top w:w="75" w:type="dxa"/>
-              <w:left w:w="110" w:type="dxa"/>
-              <w:bottom w:w="75" w:type="dxa"/>
-              <w:right w:w="110" w:type="dxa"/>
+              <w:top w:w="80" w:type="dxa"/>
+              <w:left w:w="113" w:type="dxa"/>
+              <w:bottom w:w="80" w:type="dxa"/>
+              <w:right w:w="113" w:type="dxa"/>
             </w:tcMar>
             <w:vAlign w:val="center"/>
           </w:tcPr>
           <w:p>
             <w:pPr>
               <w:spacing w:after="0" w:line="240" w:lineRule="auto"/>
+              <w:rPr>
+                <w:lang w:val="es-AR"/>
+              </w:rPr>
             </w:pPr>
             <w:r>
               <w:rPr>
-                <w:sz w:val="18"/>
+                <w:lang w:val="es-AR"/>
               </w:rPr>
               <w:t>Huergo</w:t>
             </w:r>
@@ -442,21 +571,30 @@
         <w:tc>
           <w:tcPr>
             <w:tcW w:w="2100" w:type="dxa"/>
+            <w:tcBorders>
+              <w:top w:val="single" w:sz="4" w:space="0" w:color="B7B7B7"/>
+              <w:left w:val="single" w:sz="4" w:space="0" w:color="B7B7B7"/>
+              <w:bottom w:val="single" w:sz="4" w:space="0" w:color="B7B7B7"/>
+              <w:right w:val="single" w:sz="4" w:space="0" w:color="B7B7B7"/>
+            </w:tcBorders>
             <w:tcMar>
-              <w:top w:w="75" w:type="dxa"/>
-              <w:left w:w="110" w:type="dxa"/>
-              <w:bottom w:w="75" w:type="dxa"/>
-              <w:right w:w="110" w:type="dxa"/>
+              <w:top w:w="80" w:type="dxa"/>
+              <w:left w:w="113" w:type="dxa"/>
+              <w:bottom w:w="80" w:type="dxa"/>
+              <w:right w:w="113" w:type="dxa"/>
             </w:tcMar>
             <w:vAlign w:val="center"/>
           </w:tcPr>
           <w:p>
             <w:pPr>
               <w:spacing w:after="0" w:line="240" w:lineRule="auto"/>
+              <w:rPr>
+                <w:lang w:val="es-AR"/>
+              </w:rPr>
             </w:pPr>
             <w:r>
               <w:rPr>
-                <w:sz w:val="18"/>
+                <w:lang w:val="es-AR"/>
               </w:rPr>
               <w:t>Estefanía</w:t>
             </w:r>
@@ -465,22 +603,34 @@
         <w:tc>
           <w:tcPr>
             <w:tcW w:w="1400" w:type="dxa"/>
+            <w:tcBorders>
+              <w:top w:val="single" w:sz="4" w:space="0" w:color="B7B7B7"/>
+              <w:left w:val="single" w:sz="4" w:space="0" w:color="B7B7B7"/>
+              <w:bottom w:val="single" w:sz="4" w:space="0" w:color="B7B7B7"/>
+              <w:right w:val="single" w:sz="4" w:space="0" w:color="B7B7B7"/>
+            </w:tcBorders>
             <w:tcMar>
-              <w:top w:w="75" w:type="dxa"/>
-              <w:left w:w="110" w:type="dxa"/>
-              <w:bottom w:w="75" w:type="dxa"/>
-              <w:right w:w="110" w:type="dxa"/>
+              <w:top w:w="80" w:type="dxa"/>
+              <w:left w:w="113" w:type="dxa"/>
+              <w:bottom w:w="80" w:type="dxa"/>
+              <w:right w:w="113" w:type="dxa"/>
             </w:tcMar>
             <w:vAlign w:val="center"/>
           </w:tcPr>
           <w:p>
             <w:pPr>
               <w:spacing w:after="0" w:line="240" w:lineRule="auto"/>
+              <w:rPr>
+                <w:lang w:val="es-AR"/>
+              </w:rPr>
             </w:pPr>
             <w:r>
               <w:rPr>
+                <w:rFonts w:cs="Arial"/>
                 <w:i/>
-                <w:sz w:val="18"/>
+                <w:sz w:val="19"/>
+                <w:szCs w:val="19"/>
+                <w:lang w:val="es-AR"/>
               </w:rPr>
               <w:t>44787976</w:t>
             </w:r>
@@ -488,26 +638,36 @@
         </w:tc>
         <w:tc>
           <w:tcPr>
-            <w:tcW w:w="3480" w:type="dxa"/>
+            <w:tcW w:w="3414" w:type="dxa"/>
+            <w:tcBorders>
+              <w:top w:val="single" w:sz="4" w:space="0" w:color="B7B7B7"/>
+              <w:left w:val="single" w:sz="4" w:space="0" w:color="B7B7B7"/>
+              <w:bottom w:val="single" w:sz="4" w:space="0" w:color="B7B7B7"/>
+              <w:right w:val="single" w:sz="4" w:space="0" w:color="B7B7B7"/>
+            </w:tcBorders>
             <w:tcMar>
-              <w:top w:w="75" w:type="dxa"/>
-              <w:left w:w="110" w:type="dxa"/>
-              <w:bottom w:w="75" w:type="dxa"/>
-              <w:right w:w="110" w:type="dxa"/>
+              <w:top w:w="80" w:type="dxa"/>
+              <w:left w:w="113" w:type="dxa"/>
+              <w:bottom w:w="80" w:type="dxa"/>
+              <w:right w:w="113" w:type="dxa"/>
             </w:tcMar>
-            <w:vAlign w:val="center"/>
           </w:tcPr>
           <w:p>
             <w:pPr>
               <w:spacing w:after="0" w:line="240" w:lineRule="auto"/>
+              <w:rPr>
+                <w:lang w:val="es-AR"/>
+              </w:rPr>
             </w:pPr>
             <w:hyperlink r:id="rId10">
               <w:r>
                 <w:rPr>
+                  <w:rStyle w:val="Hipervnculo"/>
+                  <w:rFonts w:cs="Arial"/>
                   <w:i/>
-                  <w:color w:val="0000FF"/>
-                  <w:sz w:val="20"/>
-                  <w:u w:val="single"/>
+                  <w:sz w:val="19"/>
+                  <w:szCs w:val="19"/>
+                  <w:lang w:val="es-AR"/>
                 </w:rPr>
                 <w:t>ehuergo@alumno.unlam.edu.ar</w:t>
               </w:r>
@@ -516,24 +676,36 @@
         </w:tc>
       </w:tr>
       <w:tr>
+        <w:trPr>
+          <w:cantSplit/>
+        </w:trPr>
         <w:tc>
           <w:tcPr>
             <w:tcW w:w="2100" w:type="dxa"/>
+            <w:tcBorders>
+              <w:top w:val="single" w:sz="4" w:space="0" w:color="B7B7B7"/>
+              <w:left w:val="single" w:sz="4" w:space="0" w:color="B7B7B7"/>
+              <w:bottom w:val="single" w:sz="4" w:space="0" w:color="B7B7B7"/>
+              <w:right w:val="single" w:sz="4" w:space="0" w:color="B7B7B7"/>
+            </w:tcBorders>
             <w:tcMar>
-              <w:top w:w="75" w:type="dxa"/>
-              <w:left w:w="110" w:type="dxa"/>
-              <w:bottom w:w="75" w:type="dxa"/>
-              <w:right w:w="110" w:type="dxa"/>
+              <w:top w:w="80" w:type="dxa"/>
+              <w:left w:w="113" w:type="dxa"/>
+              <w:bottom w:w="80" w:type="dxa"/>
+              <w:right w:w="113" w:type="dxa"/>
             </w:tcMar>
             <w:vAlign w:val="center"/>
           </w:tcPr>
           <w:p>
             <w:pPr>
               <w:spacing w:after="0" w:line="240" w:lineRule="auto"/>
+              <w:rPr>
+                <w:lang w:val="es-AR"/>
+              </w:rPr>
             </w:pPr>
             <w:r>
               <w:rPr>
-                <w:sz w:val="18"/>
+                <w:lang w:val="es-AR"/>
               </w:rPr>
               <w:t>Naspleda</w:t>
             </w:r>
@@ -542,21 +714,30 @@
         <w:tc>
           <w:tcPr>
             <w:tcW w:w="2100" w:type="dxa"/>
+            <w:tcBorders>
+              <w:top w:val="single" w:sz="4" w:space="0" w:color="B7B7B7"/>
+              <w:left w:val="single" w:sz="4" w:space="0" w:color="B7B7B7"/>
+              <w:bottom w:val="single" w:sz="4" w:space="0" w:color="B7B7B7"/>
+              <w:right w:val="single" w:sz="4" w:space="0" w:color="B7B7B7"/>
+            </w:tcBorders>
             <w:tcMar>
-              <w:top w:w="75" w:type="dxa"/>
-              <w:left w:w="110" w:type="dxa"/>
-              <w:bottom w:w="75" w:type="dxa"/>
-              <w:right w:w="110" w:type="dxa"/>
+              <w:top w:w="80" w:type="dxa"/>
+              <w:left w:w="113" w:type="dxa"/>
+              <w:bottom w:w="80" w:type="dxa"/>
+              <w:right w:w="113" w:type="dxa"/>
             </w:tcMar>
             <w:vAlign w:val="center"/>
           </w:tcPr>
           <w:p>
             <w:pPr>
               <w:spacing w:after="0" w:line="240" w:lineRule="auto"/>
+              <w:rPr>
+                <w:lang w:val="es-AR"/>
+              </w:rPr>
             </w:pPr>
             <w:r>
               <w:rPr>
-                <w:sz w:val="18"/>
+                <w:lang w:val="es-AR"/>
               </w:rPr>
               <w:t>Julián</w:t>
             </w:r>
@@ -565,22 +746,34 @@
         <w:tc>
           <w:tcPr>
             <w:tcW w:w="1400" w:type="dxa"/>
+            <w:tcBorders>
+              <w:top w:val="single" w:sz="4" w:space="0" w:color="B7B7B7"/>
+              <w:left w:val="single" w:sz="4" w:space="0" w:color="B7B7B7"/>
+              <w:bottom w:val="single" w:sz="4" w:space="0" w:color="B7B7B7"/>
+              <w:right w:val="single" w:sz="4" w:space="0" w:color="B7B7B7"/>
+            </w:tcBorders>
             <w:tcMar>
-              <w:top w:w="75" w:type="dxa"/>
-              <w:left w:w="110" w:type="dxa"/>
-              <w:bottom w:w="75" w:type="dxa"/>
-              <w:right w:w="110" w:type="dxa"/>
+              <w:top w:w="80" w:type="dxa"/>
+              <w:left w:w="113" w:type="dxa"/>
+              <w:bottom w:w="80" w:type="dxa"/>
+              <w:right w:w="113" w:type="dxa"/>
             </w:tcMar>
             <w:vAlign w:val="center"/>
           </w:tcPr>
           <w:p>
             <w:pPr>
               <w:spacing w:after="0" w:line="240" w:lineRule="auto"/>
+              <w:rPr>
+                <w:lang w:val="es-AR"/>
+              </w:rPr>
             </w:pPr>
             <w:r>
               <w:rPr>
+                <w:rFonts w:cs="Arial"/>
                 <w:i/>
-                <w:sz w:val="18"/>
+                <w:sz w:val="19"/>
+                <w:szCs w:val="19"/>
+                <w:lang w:val="es-AR"/>
               </w:rPr>
               <w:t>44391303</w:t>
             </w:r>
@@ -588,26 +781,37 @@
         </w:tc>
         <w:tc>
           <w:tcPr>
-            <w:tcW w:w="3480" w:type="dxa"/>
+            <w:tcW w:w="3414" w:type="dxa"/>
+            <w:tcBorders>
+              <w:top w:val="single" w:sz="4" w:space="0" w:color="B7B7B7"/>
+              <w:left w:val="single" w:sz="4" w:space="0" w:color="B7B7B7"/>
+              <w:bottom w:val="single" w:sz="4" w:space="0" w:color="B7B7B7"/>
+              <w:right w:val="single" w:sz="4" w:space="0" w:color="B7B7B7"/>
+            </w:tcBorders>
             <w:tcMar>
-              <w:top w:w="75" w:type="dxa"/>
-              <w:left w:w="110" w:type="dxa"/>
-              <w:bottom w:w="75" w:type="dxa"/>
-              <w:right w:w="110" w:type="dxa"/>
+              <w:top w:w="80" w:type="dxa"/>
+              <w:left w:w="113" w:type="dxa"/>
+              <w:bottom w:w="80" w:type="dxa"/>
+              <w:right w:w="113" w:type="dxa"/>
             </w:tcMar>
             <w:vAlign w:val="center"/>
           </w:tcPr>
           <w:p>
             <w:pPr>
               <w:spacing w:after="0" w:line="240" w:lineRule="auto"/>
+              <w:rPr>
+                <w:lang w:val="es-AR"/>
+              </w:rPr>
             </w:pPr>
             <w:hyperlink r:id="rId11">
               <w:r>
                 <w:rPr>
+                  <w:rStyle w:val="Hipervnculo"/>
+                  <w:rFonts w:cs="Arial"/>
                   <w:i/>
-                  <w:color w:val="0000FF"/>
-                  <w:sz w:val="20"/>
-                  <w:u w:val="single"/>
+                  <w:sz w:val="19"/>
+                  <w:szCs w:val="19"/>
+                  <w:lang w:val="es-AR"/>
                 </w:rPr>
                 <w:t>jnaspleda@alumno.unlam.edu.ar</w:t>
               </w:r>
@@ -616,47 +820,70 @@
         </w:tc>
       </w:tr>
       <w:tr>
+        <w:trPr>
+          <w:cantSplit/>
+        </w:trPr>
         <w:tc>
           <w:tcPr>
             <w:tcW w:w="2100" w:type="dxa"/>
+            <w:tcBorders>
+              <w:top w:val="single" w:sz="4" w:space="0" w:color="B7B7B7"/>
+              <w:left w:val="single" w:sz="4" w:space="0" w:color="B7B7B7"/>
+              <w:bottom w:val="single" w:sz="4" w:space="0" w:color="B7B7B7"/>
+              <w:right w:val="single" w:sz="4" w:space="0" w:color="B7B7B7"/>
+            </w:tcBorders>
             <w:tcMar>
-              <w:top w:w="75" w:type="dxa"/>
-              <w:left w:w="110" w:type="dxa"/>
-              <w:bottom w:w="75" w:type="dxa"/>
-              <w:right w:w="110" w:type="dxa"/>
+              <w:top w:w="80" w:type="dxa"/>
+              <w:left w:w="113" w:type="dxa"/>
+              <w:bottom w:w="80" w:type="dxa"/>
+              <w:right w:w="113" w:type="dxa"/>
             </w:tcMar>
             <w:vAlign w:val="center"/>
           </w:tcPr>
           <w:p>
             <w:pPr>
               <w:spacing w:after="0" w:line="240" w:lineRule="auto"/>
+              <w:rPr>
+                <w:lang w:val="es-AR"/>
+              </w:rPr>
             </w:pPr>
+            <w:proofErr w:type="spellStart"/>
             <w:r>
               <w:rPr>
-                <w:sz w:val="18"/>
+                <w:lang w:val="es-AR"/>
               </w:rPr>
               <w:t>Panigazzi</w:t>
             </w:r>
+            <w:proofErr w:type="spellEnd"/>
           </w:p>
         </w:tc>
         <w:tc>
           <w:tcPr>
             <w:tcW w:w="2100" w:type="dxa"/>
+            <w:tcBorders>
+              <w:top w:val="single" w:sz="4" w:space="0" w:color="B7B7B7"/>
+              <w:left w:val="single" w:sz="4" w:space="0" w:color="B7B7B7"/>
+              <w:bottom w:val="single" w:sz="4" w:space="0" w:color="B7B7B7"/>
+              <w:right w:val="single" w:sz="4" w:space="0" w:color="B7B7B7"/>
+            </w:tcBorders>
             <w:tcMar>
-              <w:top w:w="75" w:type="dxa"/>
-              <w:left w:w="110" w:type="dxa"/>
-              <w:bottom w:w="75" w:type="dxa"/>
-              <w:right w:w="110" w:type="dxa"/>
+              <w:top w:w="80" w:type="dxa"/>
+              <w:left w:w="113" w:type="dxa"/>
+              <w:bottom w:w="80" w:type="dxa"/>
+              <w:right w:w="113" w:type="dxa"/>
             </w:tcMar>
             <w:vAlign w:val="center"/>
           </w:tcPr>
           <w:p>
             <w:pPr>
               <w:spacing w:after="0" w:line="240" w:lineRule="auto"/>
+              <w:rPr>
+                <w:lang w:val="es-AR"/>
+              </w:rPr>
             </w:pPr>
             <w:r>
               <w:rPr>
-                <w:sz w:val="18"/>
+                <w:lang w:val="es-AR"/>
               </w:rPr>
               <w:t>Agustín</w:t>
             </w:r>
@@ -665,22 +892,34 @@
         <w:tc>
           <w:tcPr>
             <w:tcW w:w="1400" w:type="dxa"/>
+            <w:tcBorders>
+              <w:top w:val="single" w:sz="4" w:space="0" w:color="B7B7B7"/>
+              <w:left w:val="single" w:sz="4" w:space="0" w:color="B7B7B7"/>
+              <w:bottom w:val="single" w:sz="4" w:space="0" w:color="B7B7B7"/>
+              <w:right w:val="single" w:sz="4" w:space="0" w:color="B7B7B7"/>
+            </w:tcBorders>
             <w:tcMar>
-              <w:top w:w="75" w:type="dxa"/>
-              <w:left w:w="110" w:type="dxa"/>
-              <w:bottom w:w="75" w:type="dxa"/>
-              <w:right w:w="110" w:type="dxa"/>
+              <w:top w:w="80" w:type="dxa"/>
+              <w:left w:w="113" w:type="dxa"/>
+              <w:bottom w:w="80" w:type="dxa"/>
+              <w:right w:w="113" w:type="dxa"/>
             </w:tcMar>
             <w:vAlign w:val="center"/>
           </w:tcPr>
           <w:p>
             <w:pPr>
               <w:spacing w:after="0" w:line="240" w:lineRule="auto"/>
+              <w:rPr>
+                <w:lang w:val="es-AR"/>
+              </w:rPr>
             </w:pPr>
             <w:r>
               <w:rPr>
+                <w:rFonts w:cs="Arial"/>
                 <w:i/>
-                <w:sz w:val="18"/>
+                <w:sz w:val="19"/>
+                <w:szCs w:val="19"/>
+                <w:lang w:val="es-AR"/>
               </w:rPr>
               <w:t>43744593</w:t>
             </w:r>
@@ -688,26 +927,36 @@
         </w:tc>
         <w:tc>
           <w:tcPr>
-            <w:tcW w:w="3480" w:type="dxa"/>
+            <w:tcW w:w="3414" w:type="dxa"/>
+            <w:tcBorders>
+              <w:top w:val="single" w:sz="4" w:space="0" w:color="B7B7B7"/>
+              <w:left w:val="single" w:sz="4" w:space="0" w:color="B7B7B7"/>
+              <w:bottom w:val="single" w:sz="4" w:space="0" w:color="B7B7B7"/>
+              <w:right w:val="single" w:sz="4" w:space="0" w:color="B7B7B7"/>
+            </w:tcBorders>
             <w:tcMar>
-              <w:top w:w="75" w:type="dxa"/>
-              <w:left w:w="110" w:type="dxa"/>
-              <w:bottom w:w="75" w:type="dxa"/>
-              <w:right w:w="110" w:type="dxa"/>
+              <w:top w:w="80" w:type="dxa"/>
+              <w:left w:w="113" w:type="dxa"/>
+              <w:bottom w:w="80" w:type="dxa"/>
+              <w:right w:w="113" w:type="dxa"/>
             </w:tcMar>
-            <w:vAlign w:val="center"/>
           </w:tcPr>
           <w:p>
             <w:pPr>
               <w:spacing w:after="0" w:line="240" w:lineRule="auto"/>
+              <w:rPr>
+                <w:lang w:val="es-AR"/>
+              </w:rPr>
             </w:pPr>
             <w:hyperlink r:id="rId12">
               <w:r>
                 <w:rPr>
+                  <w:rStyle w:val="Hipervnculo"/>
+                  <w:rFonts w:cs="Arial"/>
                   <w:i/>
-                  <w:color w:val="0000FF"/>
-                  <w:sz w:val="20"/>
-                  <w:u w:val="single"/>
+                  <w:sz w:val="19"/>
+                  <w:szCs w:val="19"/>
+                  <w:lang w:val="es-AR"/>
                 </w:rPr>
                 <w:t>apanigazzi@alumno.unlam.edu.ar</w:t>
               </w:r>
@@ -716,47 +965,70 @@
         </w:tc>
       </w:tr>
       <w:tr>
+        <w:trPr>
+          <w:cantSplit/>
+        </w:trPr>
         <w:tc>
           <w:tcPr>
             <w:tcW w:w="2100" w:type="dxa"/>
+            <w:tcBorders>
+              <w:top w:val="single" w:sz="4" w:space="0" w:color="B7B7B7"/>
+              <w:left w:val="single" w:sz="4" w:space="0" w:color="B7B7B7"/>
+              <w:bottom w:val="single" w:sz="4" w:space="0" w:color="B7B7B7"/>
+              <w:right w:val="single" w:sz="4" w:space="0" w:color="B7B7B7"/>
+            </w:tcBorders>
             <w:tcMar>
-              <w:top w:w="75" w:type="dxa"/>
-              <w:left w:w="110" w:type="dxa"/>
-              <w:bottom w:w="75" w:type="dxa"/>
-              <w:right w:w="110" w:type="dxa"/>
+              <w:top w:w="80" w:type="dxa"/>
+              <w:left w:w="113" w:type="dxa"/>
+              <w:bottom w:w="80" w:type="dxa"/>
+              <w:right w:w="113" w:type="dxa"/>
             </w:tcMar>
             <w:vAlign w:val="center"/>
           </w:tcPr>
           <w:p>
             <w:pPr>
               <w:spacing w:after="0" w:line="240" w:lineRule="auto"/>
+              <w:rPr>
+                <w:lang w:val="es-AR"/>
+              </w:rPr>
             </w:pPr>
+            <w:proofErr w:type="spellStart"/>
             <w:r>
               <w:rPr>
-                <w:sz w:val="18"/>
+                <w:lang w:val="es-AR"/>
               </w:rPr>
               <w:t>Rios</w:t>
             </w:r>
+            <w:proofErr w:type="spellEnd"/>
           </w:p>
         </w:tc>
         <w:tc>
           <w:tcPr>
             <w:tcW w:w="2100" w:type="dxa"/>
+            <w:tcBorders>
+              <w:top w:val="single" w:sz="4" w:space="0" w:color="B7B7B7"/>
+              <w:left w:val="single" w:sz="4" w:space="0" w:color="B7B7B7"/>
+              <w:bottom w:val="single" w:sz="4" w:space="0" w:color="B7B7B7"/>
+              <w:right w:val="single" w:sz="4" w:space="0" w:color="B7B7B7"/>
+            </w:tcBorders>
             <w:tcMar>
-              <w:top w:w="75" w:type="dxa"/>
-              <w:left w:w="110" w:type="dxa"/>
-              <w:bottom w:w="75" w:type="dxa"/>
-              <w:right w:w="110" w:type="dxa"/>
+              <w:top w:w="80" w:type="dxa"/>
+              <w:left w:w="113" w:type="dxa"/>
+              <w:bottom w:w="80" w:type="dxa"/>
+              <w:right w:w="113" w:type="dxa"/>
             </w:tcMar>
             <w:vAlign w:val="center"/>
           </w:tcPr>
           <w:p>
             <w:pPr>
               <w:spacing w:after="0" w:line="240" w:lineRule="auto"/>
+              <w:rPr>
+                <w:lang w:val="es-AR"/>
+              </w:rPr>
             </w:pPr>
             <w:r>
               <w:rPr>
-                <w:sz w:val="18"/>
+                <w:lang w:val="es-AR"/>
               </w:rPr>
               <w:t>Cristian</w:t>
             </w:r>
@@ -765,49 +1037,81 @@
         <w:tc>
           <w:tcPr>
             <w:tcW w:w="1400" w:type="dxa"/>
+            <w:tcBorders>
+              <w:top w:val="single" w:sz="4" w:space="0" w:color="B7B7B7"/>
+              <w:left w:val="single" w:sz="4" w:space="0" w:color="B7B7B7"/>
+              <w:bottom w:val="single" w:sz="4" w:space="0" w:color="B7B7B7"/>
+              <w:right w:val="single" w:sz="4" w:space="0" w:color="B7B7B7"/>
+            </w:tcBorders>
             <w:tcMar>
-              <w:top w:w="75" w:type="dxa"/>
-              <w:left w:w="110" w:type="dxa"/>
-              <w:bottom w:w="75" w:type="dxa"/>
-              <w:right w:w="110" w:type="dxa"/>
+              <w:top w:w="80" w:type="dxa"/>
+              <w:left w:w="113" w:type="dxa"/>
+              <w:bottom w:w="80" w:type="dxa"/>
+              <w:right w:w="113" w:type="dxa"/>
             </w:tcMar>
             <w:vAlign w:val="center"/>
           </w:tcPr>
           <w:p>
             <w:pPr>
               <w:spacing w:after="0" w:line="240" w:lineRule="auto"/>
+              <w:rPr>
+                <w:lang w:val="es-AR"/>
+              </w:rPr>
             </w:pPr>
             <w:r>
               <w:rPr>
+                <w:rFonts w:cs="Arial"/>
                 <w:i/>
-                <w:sz w:val="18"/>
-              </w:rPr>
-              <w:t>40015557</w:t>
+                <w:sz w:val="19"/>
+                <w:szCs w:val="19"/>
+                <w:lang w:val="es-AR"/>
+              </w:rPr>
+              <w:t>4</w:t>
+            </w:r>
+            <w:r>
+              <w:rPr>
+                <w:rFonts w:cs="Arial"/>
+                <w:i/>
+                <w:sz w:val="19"/>
+                <w:szCs w:val="19"/>
+                <w:lang w:val="es-AR"/>
+              </w:rPr>
+              <w:t>0015557</w:t>
             </w:r>
           </w:p>
         </w:tc>
         <w:tc>
           <w:tcPr>
-            <w:tcW w:w="3480" w:type="dxa"/>
+            <w:tcW w:w="3414" w:type="dxa"/>
+            <w:tcBorders>
+              <w:top w:val="single" w:sz="4" w:space="0" w:color="B7B7B7"/>
+              <w:left w:val="single" w:sz="4" w:space="0" w:color="B7B7B7"/>
+              <w:bottom w:val="single" w:sz="4" w:space="0" w:color="B7B7B7"/>
+              <w:right w:val="single" w:sz="4" w:space="0" w:color="B7B7B7"/>
+            </w:tcBorders>
             <w:tcMar>
-              <w:top w:w="75" w:type="dxa"/>
-              <w:left w:w="110" w:type="dxa"/>
-              <w:bottom w:w="75" w:type="dxa"/>
-              <w:right w:w="110" w:type="dxa"/>
+              <w:top w:w="80" w:type="dxa"/>
+              <w:left w:w="113" w:type="dxa"/>
+              <w:bottom w:w="80" w:type="dxa"/>
+              <w:right w:w="113" w:type="dxa"/>
             </w:tcMar>
-            <w:vAlign w:val="center"/>
           </w:tcPr>
           <w:p>
             <w:pPr>
               <w:spacing w:after="0" w:line="240" w:lineRule="auto"/>
+              <w:rPr>
+                <w:lang w:val="es-AR"/>
+              </w:rPr>
             </w:pPr>
             <w:hyperlink r:id="rId13">
               <w:r>
                 <w:rPr>
+                  <w:rStyle w:val="Hipervnculo"/>
+                  <w:rFonts w:cs="Arial"/>
                   <w:i/>
-                  <w:color w:val="0000FF"/>
-                  <w:sz w:val="20"/>
-                  <w:u w:val="single"/>
+                  <w:sz w:val="19"/>
+                  <w:szCs w:val="19"/>
+                  <w:lang w:val="es-AR"/>
                 </w:rPr>
                 <w:t>crrios@alumno.unlam.edu.ar</w:t>
               </w:r>
@@ -818,243 +1122,437 @@
     </w:tbl>
     <w:p>
       <w:pPr>
-        <w:spacing w:before="320"/>
+        <w:spacing w:before="620" w:line="240" w:lineRule="auto"/>
+        <w:rPr>
+          <w:lang w:val="es-AR"/>
+        </w:rPr>
       </w:pPr>
       <w:r>
         <w:rPr>
+          <w:rFonts w:cs="Arial"/>
           <w:b/>
-          <w:color w:val="1F4E78"/>
-          <w:sz w:val="23"/>
+          <w:color w:val="1F4E79"/>
+          <w:sz w:val="24"/>
+          <w:szCs w:val="24"/>
+          <w:lang w:val="es-AR"/>
         </w:rPr>
         <w:t>Repositorio del equipo</w:t>
       </w:r>
     </w:p>
-    <w:tbl>
-      <w:tblPr>
-        <w:tblStyle w:val="Tablaconcuadrcula"/>
-        <w:tblW w:w="9080" w:type="dxa"/>
-        <w:tblBorders>
-          <w:top w:val="single" w:sz="5" w:space="0" w:color="B7B7B7"/>
-          <w:left w:val="single" w:sz="5" w:space="0" w:color="B7B7B7"/>
-          <w:bottom w:val="single" w:sz="5" w:space="0" w:color="B7B7B7"/>
-          <w:right w:val="single" w:sz="5" w:space="0" w:color="B7B7B7"/>
-          <w:insideH w:val="single" w:sz="5" w:space="0" w:color="B7B7B7"/>
-          <w:insideV w:val="single" w:sz="5" w:space="0" w:color="B7B7B7"/>
-        </w:tblBorders>
-        <w:tblLayout w:type="fixed"/>
-        <w:tblLook w:val="04A0" w:firstRow="1" w:lastRow="0" w:firstColumn="1" w:lastColumn="0" w:noHBand="0" w:noVBand="1"/>
-      </w:tblPr>
-      <w:tblGrid>
-        <w:gridCol w:w="9080"/>
-      </w:tblGrid>
-      <w:tr>
-        <w:tc>
-          <w:tcPr>
-            <w:tcW w:w="9080" w:type="dxa"/>
-            <w:shd w:val="clear" w:color="auto" w:fill="F1F4F8"/>
-            <w:tcMar>
-              <w:top w:w="75" w:type="dxa"/>
-              <w:left w:w="110" w:type="dxa"/>
-              <w:bottom w:w="75" w:type="dxa"/>
-              <w:right w:w="110" w:type="dxa"/>
-            </w:tcMar>
-          </w:tcPr>
-          <w:p>
-            <w:pPr>
-              <w:spacing w:after="0" w:line="240" w:lineRule="auto"/>
-            </w:pPr>
-            <w:hyperlink r:id="rId14">
-              <w:r>
-                <w:rPr>
-                  <w:i/>
-                  <w:color w:val="0000FF"/>
-                  <w:sz w:val="20"/>
-                  <w:u w:val="single"/>
-                </w:rPr>
-                <w:t>https://github.com/gadsii-unlam/gadsii-summate</w:t>
-              </w:r>
-            </w:hyperlink>
-          </w:p>
-        </w:tc>
-      </w:tr>
-    </w:tbl>
     <w:p>
       <w:pPr>
-        <w:spacing w:before="600"/>
+        <w:pBdr>
+          <w:top w:val="single" w:sz="6" w:space="6" w:color="B7B7B7"/>
+          <w:left w:val="single" w:sz="6" w:space="6" w:color="B7B7B7"/>
+          <w:bottom w:val="single" w:sz="6" w:space="6" w:color="B7B7B7"/>
+          <w:right w:val="single" w:sz="6" w:space="6" w:color="B7B7B7"/>
+        </w:pBdr>
+        <w:shd w:val="clear" w:color="auto" w:fill="F4F7FA"/>
+        <w:spacing w:after="0" w:line="240" w:lineRule="auto"/>
+        <w:ind w:left="113" w:right="113"/>
+        <w:rPr>
+          <w:lang w:val="es-AR"/>
+        </w:rPr>
+      </w:pPr>
+      <w:hyperlink r:id="rId14">
+        <w:r>
+          <w:rPr>
+            <w:rStyle w:val="Hipervnculo"/>
+            <w:rFonts w:cs="Arial"/>
+            <w:i/>
+            <w:sz w:val="20"/>
+            <w:szCs w:val="20"/>
+            <w:lang w:val="es-AR"/>
+          </w:rPr>
+          <w:t>https://github.com/gadsii-unlam/gadsii-summate</w:t>
+        </w:r>
+      </w:hyperlink>
+    </w:p>
+    <w:p>
+      <w:pPr>
+        <w:spacing w:before="800" w:after="0" w:line="240" w:lineRule="auto"/>
         <w:jc w:val="center"/>
         <w:rPr>
-          <w:lang w:val="es-US"/>
+          <w:lang w:val="es-AR"/>
+        </w:rPr>
+        <w:sectPr>
+          <w:pgSz w:w="11906" w:h="16838"/>
+          <w:pgMar w:top="1304" w:right="1446" w:bottom="1020" w:left="1446" w:header="312" w:footer="425" w:gutter="0"/>
+          <w:cols w:space="720"/>
+          <w:docGrid w:linePitch="360"/>
+        </w:sectPr>
+      </w:pPr>
+      <w:r>
+        <w:rPr>
+          <w:rFonts w:cs="Arial"/>
+          <w:color w:val="666666"/>
+          <w:sz w:val="20"/>
+          <w:szCs w:val="20"/>
+          <w:lang w:val="es-AR"/>
+        </w:rPr>
+        <w:t>Fecha de entrega: 08/09/2026</w:t>
+      </w:r>
+    </w:p>
+    <w:p>
+      <w:pPr>
+        <w:pStyle w:val="TtuloTDC"/>
+        <w:spacing w:before="0" w:after="240" w:line="240" w:lineRule="auto"/>
+        <w:rPr>
+          <w:lang w:val="es-AR"/>
         </w:rPr>
       </w:pPr>
       <w:r>
         <w:rPr>
-          <w:color w:val="666666"/>
-          <w:sz w:val="19"/>
-          <w:lang w:val="es-US"/>
-        </w:rPr>
-        <w:t>Fecha de entrega: 08/09/2026</w:t>
-      </w:r>
-      <w:r>
-        <w:rPr>
-          <w:lang w:val="es-US"/>
-        </w:rPr>
-        <w:br w:type="page"/>
-      </w:r>
-    </w:p>
-    <w:p>
-      <w:pPr>
-        <w:pStyle w:val="Ttulo1"/>
-        <w:spacing w:before="0" w:after="40"/>
-        <w:rPr>
-          <w:lang w:val="es-US"/>
-        </w:rPr>
-      </w:pPr>
-      <w:r>
-        <w:rPr>
-          <w:rFonts w:ascii="Arial" w:hAnsi="Arial"/>
-          <w:lang w:val="es-US"/>
+          <w:rFonts w:ascii="Arial" w:hAnsi="Arial" w:cs="Arial"/>
+          <w:sz w:val="28"/>
+          <w:lang w:val="es-AR"/>
         </w:rPr>
         <w:lastRenderedPageBreak/>
         <w:t>Índice</w:t>
       </w:r>
     </w:p>
+    <w:sdt>
+      <w:sdtPr>
+        <w:id w:val="-1662998058"/>
+        <w:docPartObj>
+          <w:docPartGallery w:val="Table of Contents"/>
+          <w:docPartUnique/>
+        </w:docPartObj>
+      </w:sdtPr>
+      <w:sdtContent>
+        <w:p>
+          <w:pPr>
+            <w:pStyle w:val="TDC1"/>
+            <w:rPr>
+              <w:rFonts w:asciiTheme="minorHAnsi" w:hAnsiTheme="minorHAnsi"/>
+              <w:b w:val="0"/>
+              <w:noProof/>
+              <w:color w:val="auto"/>
+              <w:kern w:val="2"/>
+              <w:sz w:val="24"/>
+              <w:szCs w:val="24"/>
+              <w:lang w:val="es-AR" w:eastAsia="es-AR"/>
+              <w14:ligatures w14:val="standardContextual"/>
+            </w:rPr>
+          </w:pPr>
+          <w:r>
+            <w:fldChar w:fldCharType="begin"/>
+          </w:r>
+          <w:r>
+            <w:instrText xml:space="preserve"> TOC \o "1-2" \h \z \u </w:instrText>
+          </w:r>
+          <w:r>
+            <w:fldChar w:fldCharType="separate"/>
+          </w:r>
+          <w:hyperlink w:anchor="_Toc239613980" w:history="1">
+            <w:r>
+              <w:rPr>
+                <w:rStyle w:val="Hipervnculo"/>
+                <w:noProof/>
+                <w:lang w:val="es-AR"/>
+              </w:rPr>
+              <w:t>1. Scope del MVP</w:t>
+            </w:r>
+            <w:r>
+              <w:rPr>
+                <w:noProof/>
+                <w:webHidden/>
+              </w:rPr>
+              <w:tab/>
+            </w:r>
+            <w:r>
+              <w:rPr>
+                <w:noProof/>
+                <w:webHidden/>
+              </w:rPr>
+              <w:fldChar w:fldCharType="begin"/>
+            </w:r>
+            <w:r>
+              <w:rPr>
+                <w:noProof/>
+                <w:webHidden/>
+              </w:rPr>
+              <w:instrText xml:space="preserve"> PAGEREF _Toc239613980 \h </w:instrText>
+            </w:r>
+            <w:r>
+              <w:rPr>
+                <w:noProof/>
+                <w:webHidden/>
+              </w:rPr>
+            </w:r>
+            <w:r>
+              <w:rPr>
+                <w:noProof/>
+                <w:webHidden/>
+              </w:rPr>
+              <w:fldChar w:fldCharType="separate"/>
+            </w:r>
+            <w:r>
+              <w:rPr>
+                <w:noProof/>
+                <w:webHidden/>
+              </w:rPr>
+              <w:t>3</w:t>
+            </w:r>
+            <w:r>
+              <w:rPr>
+                <w:noProof/>
+                <w:webHidden/>
+              </w:rPr>
+              <w:fldChar w:fldCharType="end"/>
+            </w:r>
+          </w:hyperlink>
+        </w:p>
+        <w:p>
+          <w:pPr>
+            <w:pStyle w:val="TDC1"/>
+            <w:rPr>
+              <w:rFonts w:asciiTheme="minorHAnsi" w:hAnsiTheme="minorHAnsi"/>
+              <w:b w:val="0"/>
+              <w:noProof/>
+              <w:color w:val="auto"/>
+              <w:kern w:val="2"/>
+              <w:sz w:val="24"/>
+              <w:szCs w:val="24"/>
+              <w:lang w:val="es-AR" w:eastAsia="es-AR"/>
+              <w14:ligatures w14:val="standardContextual"/>
+            </w:rPr>
+          </w:pPr>
+          <w:hyperlink w:anchor="_Toc239613981" w:history="1">
+            <w:r>
+              <w:rPr>
+                <w:rStyle w:val="Hipervnculo"/>
+                <w:noProof/>
+                <w:lang w:val="es-AR"/>
+              </w:rPr>
+              <w:t>2. Qué se construye y qué se simula</w:t>
+            </w:r>
+            <w:r>
+              <w:rPr>
+                <w:noProof/>
+                <w:webHidden/>
+              </w:rPr>
+              <w:tab/>
+            </w:r>
+            <w:r>
+              <w:rPr>
+                <w:noProof/>
+                <w:webHidden/>
+              </w:rPr>
+              <w:fldChar w:fldCharType="begin"/>
+            </w:r>
+            <w:r>
+              <w:rPr>
+                <w:noProof/>
+                <w:webHidden/>
+              </w:rPr>
+              <w:instrText xml:space="preserve"> PAGEREF _Toc239613981 \h </w:instrText>
+            </w:r>
+            <w:r>
+              <w:rPr>
+                <w:noProof/>
+                <w:webHidden/>
+              </w:rPr>
+            </w:r>
+            <w:r>
+              <w:rPr>
+                <w:noProof/>
+                <w:webHidden/>
+              </w:rPr>
+              <w:fldChar w:fldCharType="separate"/>
+            </w:r>
+            <w:r>
+              <w:rPr>
+                <w:noProof/>
+                <w:webHidden/>
+              </w:rPr>
+              <w:t>3</w:t>
+            </w:r>
+            <w:r>
+              <w:rPr>
+                <w:noProof/>
+                <w:webHidden/>
+              </w:rPr>
+              <w:fldChar w:fldCharType="end"/>
+            </w:r>
+          </w:hyperlink>
+        </w:p>
+        <w:p>
+          <w:pPr>
+            <w:pStyle w:val="TDC1"/>
+            <w:rPr>
+              <w:rFonts w:asciiTheme="minorHAnsi" w:hAnsiTheme="minorHAnsi"/>
+              <w:b w:val="0"/>
+              <w:noProof/>
+              <w:color w:val="auto"/>
+              <w:kern w:val="2"/>
+              <w:sz w:val="24"/>
+              <w:szCs w:val="24"/>
+              <w:lang w:val="es-AR" w:eastAsia="es-AR"/>
+              <w14:ligatures w14:val="standardContextual"/>
+            </w:rPr>
+          </w:pPr>
+          <w:hyperlink w:anchor="_Toc239613982" w:history="1">
+            <w:r>
+              <w:rPr>
+                <w:rStyle w:val="Hipervnculo"/>
+                <w:noProof/>
+                <w:lang w:val="es-AR"/>
+              </w:rPr>
+              <w:t>3. Flujo principal del MVP</w:t>
+            </w:r>
+            <w:r>
+              <w:rPr>
+                <w:noProof/>
+                <w:webHidden/>
+              </w:rPr>
+              <w:tab/>
+            </w:r>
+            <w:r>
+              <w:rPr>
+                <w:noProof/>
+                <w:webHidden/>
+              </w:rPr>
+              <w:fldChar w:fldCharType="begin"/>
+            </w:r>
+            <w:r>
+              <w:rPr>
+                <w:noProof/>
+                <w:webHidden/>
+              </w:rPr>
+              <w:instrText xml:space="preserve"> PAGEREF _Toc239613982 \h </w:instrText>
+            </w:r>
+            <w:r>
+              <w:rPr>
+                <w:noProof/>
+                <w:webHidden/>
+              </w:rPr>
+            </w:r>
+            <w:r>
+              <w:rPr>
+                <w:noProof/>
+                <w:webHidden/>
+              </w:rPr>
+              <w:fldChar w:fldCharType="separate"/>
+            </w:r>
+            <w:r>
+              <w:rPr>
+                <w:noProof/>
+                <w:webHidden/>
+              </w:rPr>
+              <w:t>4</w:t>
+            </w:r>
+            <w:r>
+              <w:rPr>
+                <w:noProof/>
+                <w:webHidden/>
+              </w:rPr>
+              <w:fldChar w:fldCharType="end"/>
+            </w:r>
+          </w:hyperlink>
+        </w:p>
+        <w:p>
+          <w:pPr>
+            <w:pStyle w:val="TDC1"/>
+            <w:rPr>
+              <w:rFonts w:asciiTheme="minorHAnsi" w:hAnsiTheme="minorHAnsi"/>
+              <w:b w:val="0"/>
+              <w:noProof/>
+              <w:color w:val="auto"/>
+              <w:kern w:val="2"/>
+              <w:sz w:val="24"/>
+              <w:szCs w:val="24"/>
+              <w:lang w:val="es-AR" w:eastAsia="es-AR"/>
+              <w14:ligatures w14:val="standardContextual"/>
+            </w:rPr>
+          </w:pPr>
+          <w:hyperlink w:anchor="_Toc239613983" w:history="1">
+            <w:r>
+              <w:rPr>
+                <w:rStyle w:val="Hipervnculo"/>
+                <w:noProof/>
+                <w:lang w:val="es-AR"/>
+              </w:rPr>
+              <w:t>4. Atributos de usabilidad priorizados</w:t>
+            </w:r>
+            <w:r>
+              <w:rPr>
+                <w:noProof/>
+                <w:webHidden/>
+              </w:rPr>
+              <w:tab/>
+            </w:r>
+            <w:r>
+              <w:rPr>
+                <w:noProof/>
+                <w:webHidden/>
+              </w:rPr>
+              <w:fldChar w:fldCharType="begin"/>
+            </w:r>
+            <w:r>
+              <w:rPr>
+                <w:noProof/>
+                <w:webHidden/>
+              </w:rPr>
+              <w:instrText xml:space="preserve"> PAGEREF _Toc239613983 \h </w:instrText>
+            </w:r>
+            <w:r>
+              <w:rPr>
+                <w:noProof/>
+                <w:webHidden/>
+              </w:rPr>
+            </w:r>
+            <w:r>
+              <w:rPr>
+                <w:noProof/>
+                <w:webHidden/>
+              </w:rPr>
+              <w:fldChar w:fldCharType="separate"/>
+            </w:r>
+            <w:r>
+              <w:rPr>
+                <w:noProof/>
+                <w:webHidden/>
+              </w:rPr>
+              <w:t>4</w:t>
+            </w:r>
+            <w:r>
+              <w:rPr>
+                <w:noProof/>
+                <w:webHidden/>
+              </w:rPr>
+              <w:fldChar w:fldCharType="end"/>
+            </w:r>
+          </w:hyperlink>
+        </w:p>
+        <w:p>
+          <w:pPr>
+            <w:pStyle w:val="TDC1"/>
+            <w:rPr>
+              <w:lang w:val="es-AR"/>
+            </w:rPr>
+          </w:pPr>
+          <w:r>
+            <w:fldChar w:fldCharType="end"/>
+          </w:r>
+        </w:p>
+      </w:sdtContent>
+    </w:sdt>
     <w:p>
       <w:pPr>
-        <w:tabs>
-          <w:tab w:val="right" w:leader="dot" w:pos="8901"/>
-        </w:tabs>
-        <w:spacing w:after="80"/>
+        <w:keepNext/>
+        <w:pageBreakBefore/>
+        <w:spacing w:before="80" w:after="60" w:line="240" w:lineRule="auto"/>
         <w:rPr>
-          <w:lang w:val="es-US"/>
+          <w:lang w:val="es-AR"/>
         </w:rPr>
       </w:pPr>
       <w:r>
         <w:rPr>
           <w:b/>
-          <w:color w:val="1F4E78"/>
-          <w:lang w:val="es-US"/>
-        </w:rPr>
-        <w:t>1. Scope del MVP</w:t>
-      </w:r>
-      <w:r>
-        <w:rPr>
-          <w:b/>
-          <w:color w:val="1F4E78"/>
-          <w:lang w:val="es-US"/>
-        </w:rPr>
-        <w:tab/>
-        <w:t>3</w:t>
-      </w:r>
-    </w:p>
-    <w:p>
-      <w:pPr>
-        <w:tabs>
-          <w:tab w:val="right" w:leader="dot" w:pos="8901"/>
-        </w:tabs>
-        <w:spacing w:after="80"/>
-        <w:rPr>
-          <w:lang w:val="es-US"/>
-        </w:rPr>
-      </w:pPr>
-      <w:r>
-        <w:rPr>
-          <w:b/>
-          <w:color w:val="1F4E78"/>
-          <w:lang w:val="es-US"/>
-        </w:rPr>
-        <w:t>2. Qué se construye y qué se simula</w:t>
-      </w:r>
-      <w:r>
-        <w:rPr>
-          <w:b/>
-          <w:color w:val="1F4E78"/>
-          <w:lang w:val="es-US"/>
-        </w:rPr>
-        <w:tab/>
-        <w:t>3</w:t>
-      </w:r>
-    </w:p>
-    <w:p>
-      <w:pPr>
-        <w:tabs>
-          <w:tab w:val="right" w:leader="dot" w:pos="8901"/>
-        </w:tabs>
-        <w:spacing w:after="80"/>
-        <w:rPr>
-          <w:lang w:val="es-US"/>
-        </w:rPr>
-      </w:pPr>
-      <w:r>
-        <w:rPr>
-          <w:b/>
-          <w:color w:val="1F4E78"/>
-          <w:lang w:val="es-US"/>
-        </w:rPr>
-        <w:t>3. Flujo principal del MVP</w:t>
-      </w:r>
-      <w:r>
-        <w:rPr>
-          <w:b/>
-          <w:color w:val="1F4E78"/>
-          <w:lang w:val="es-US"/>
-        </w:rPr>
-        <w:tab/>
-        <w:t>4</w:t>
-      </w:r>
-    </w:p>
-    <w:p>
-      <w:pPr>
-        <w:tabs>
-          <w:tab w:val="right" w:leader="dot" w:pos="8901"/>
-        </w:tabs>
-        <w:spacing w:after="80"/>
-        <w:rPr>
-          <w:lang w:val="es-US"/>
-        </w:rPr>
-      </w:pPr>
-      <w:r>
-        <w:rPr>
-          <w:b/>
-          <w:color w:val="1F4E78"/>
-          <w:lang w:val="es-US"/>
-        </w:rPr>
-        <w:t>4. Atributos de usabilidad priorizados</w:t>
-      </w:r>
-      <w:r>
-        <w:rPr>
-          <w:b/>
-          <w:color w:val="1F4E78"/>
-          <w:lang w:val="es-US"/>
-        </w:rPr>
-        <w:tab/>
-        <w:t>4</w:t>
-      </w:r>
-    </w:p>
-    <w:p>
-      <w:pPr>
-        <w:rPr>
-          <w:lang w:val="es-US"/>
-        </w:rPr>
-      </w:pPr>
-      <w:r>
-        <w:rPr>
-          <w:lang w:val="es-US"/>
-        </w:rPr>
-        <w:br w:type="page"/>
-      </w:r>
-    </w:p>
-    <w:p>
-      <w:pPr>
-        <w:pStyle w:val="Ttulo1"/>
-        <w:spacing w:before="0"/>
-        <w:rPr>
-          <w:lang w:val="es-US"/>
-        </w:rPr>
-      </w:pPr>
-      <w:r>
-        <w:rPr>
-          <w:rFonts w:ascii="Arial" w:hAnsi="Arial"/>
-          <w:lang w:val="es-US"/>
+          <w:color w:val="1F4E79"/>
+          <w:sz w:val="36"/>
+          <w:lang w:val="es-AR"/>
         </w:rPr>
         <w:lastRenderedPageBreak/>
         <w:t>TP3. Scope del MVP y Diseño de la Interacción</w:t>
@@ -1062,58 +1560,57 @@
     </w:p>
     <w:p>
       <w:pPr>
-        <w:pStyle w:val="Ttulo2"/>
+        <w:pStyle w:val="Ttulo1"/>
         <w:spacing w:before="80"/>
         <w:rPr>
-          <w:lang w:val="es-US"/>
+          <w:lang w:val="es-AR"/>
         </w:rPr>
       </w:pPr>
+      <w:bookmarkStart w:id="0" w:name="_Toc239613980"/>
       <w:r>
         <w:rPr>
-          <w:rFonts w:ascii="Arial" w:hAnsi="Arial"/>
-          <w:lang w:val="es-US"/>
+          <w:lang w:val="es-AR"/>
         </w:rPr>
         <w:t>1. Scope del MVP</w:t>
       </w:r>
+      <w:bookmarkEnd w:id="0"/>
     </w:p>
     <w:tbl>
       <w:tblPr>
-        <w:tblStyle w:val="Tablaconcuadrcula"/>
-        <w:tblW w:w="9080" w:type="dxa"/>
+        <w:tblW w:w="9000" w:type="dxa"/>
         <w:tblBorders>
-          <w:top w:val="single" w:sz="5" w:space="0" w:color="B7B7B7"/>
-          <w:left w:val="single" w:sz="5" w:space="0" w:color="B7B7B7"/>
-          <w:bottom w:val="single" w:sz="5" w:space="0" w:color="B7B7B7"/>
-          <w:right w:val="single" w:sz="5" w:space="0" w:color="B7B7B7"/>
-          <w:insideH w:val="single" w:sz="5" w:space="0" w:color="B7B7B7"/>
-          <w:insideV w:val="single" w:sz="5" w:space="0" w:color="B7B7B7"/>
+          <w:top w:val="single" w:sz="4" w:space="0" w:color="auto"/>
+          <w:left w:val="single" w:sz="4" w:space="0" w:color="auto"/>
+          <w:bottom w:val="single" w:sz="4" w:space="0" w:color="auto"/>
+          <w:right w:val="single" w:sz="4" w:space="0" w:color="auto"/>
+          <w:insideH w:val="single" w:sz="4" w:space="0" w:color="auto"/>
+          <w:insideV w:val="single" w:sz="4" w:space="0" w:color="auto"/>
         </w:tblBorders>
         <w:tblLayout w:type="fixed"/>
-        <w:tblLook w:val="04A0" w:firstRow="1" w:lastRow="0" w:firstColumn="1" w:lastColumn="0" w:noHBand="0" w:noVBand="1"/>
+        <w:tblCellMar>
+          <w:left w:w="70" w:type="dxa"/>
+          <w:right w:w="70" w:type="dxa"/>
+        </w:tblCellMar>
+        <w:tblLook w:val="0000" w:firstRow="0" w:lastRow="0" w:firstColumn="0" w:lastColumn="0" w:noHBand="0" w:noVBand="0"/>
       </w:tblPr>
       <w:tblGrid>
-        <w:gridCol w:w="3600"/>
-        <w:gridCol w:w="5480"/>
+        <w:gridCol w:w="3568"/>
+        <w:gridCol w:w="5432"/>
       </w:tblGrid>
       <w:tr>
         <w:trPr>
+          <w:cantSplit/>
           <w:tblHeader/>
         </w:trPr>
         <w:tc>
           <w:tcPr>
-            <w:tcW w:w="3600" w:type="dxa"/>
-            <w:shd w:val="clear" w:color="auto" w:fill="1F4E78"/>
-            <w:tcMar>
-              <w:top w:w="75" w:type="dxa"/>
-              <w:left w:w="110" w:type="dxa"/>
-              <w:bottom w:w="75" w:type="dxa"/>
-              <w:right w:w="110" w:type="dxa"/>
-            </w:tcMar>
+            <w:tcW w:w="3568" w:type="dxa"/>
+            <w:shd w:val="clear" w:color="auto" w:fill="1F4E79"/>
             <w:vAlign w:val="center"/>
           </w:tcPr>
           <w:p>
             <w:pPr>
-              <w:spacing w:after="0" w:line="240" w:lineRule="auto"/>
+              <w:spacing w:after="40"/>
             </w:pPr>
             <w:r>
               <w:rPr>
@@ -1127,21 +1624,16 @@
         </w:tc>
         <w:tc>
           <w:tcPr>
-            <w:tcW w:w="5480" w:type="dxa"/>
-            <w:shd w:val="clear" w:color="auto" w:fill="1F4E78"/>
-            <w:tcMar>
-              <w:top w:w="75" w:type="dxa"/>
-              <w:left w:w="110" w:type="dxa"/>
-              <w:bottom w:w="75" w:type="dxa"/>
-              <w:right w:w="110" w:type="dxa"/>
-            </w:tcMar>
+            <w:tcW w:w="5432" w:type="dxa"/>
+            <w:shd w:val="clear" w:color="auto" w:fill="1F4E79"/>
             <w:vAlign w:val="center"/>
           </w:tcPr>
           <w:p>
             <w:pPr>
-              <w:spacing w:after="0" w:line="240" w:lineRule="auto"/>
-              <w:rPr>
-                <w:lang w:val="es-US"/>
+              <w:spacing w:after="40"/>
+              <w:rPr>
+                <w:sz w:val="17"/>
+                <w:lang w:val="es-AR"/>
               </w:rPr>
             </w:pPr>
             <w:r>
@@ -1149,7 +1641,7 @@
                 <w:b/>
                 <w:color w:val="FFFFFF"/>
                 <w:sz w:val="17"/>
-                <w:lang w:val="es-US"/>
+                <w:lang w:val="es-AR"/>
               </w:rPr>
               <w:t>Para qué parte de la hipótesis sirve</w:t>
             </w:r>
@@ -1157,28 +1649,26 @@
         </w:tc>
       </w:tr>
       <w:tr>
+        <w:trPr>
+          <w:cantSplit/>
+        </w:trPr>
         <w:tc>
           <w:tcPr>
-            <w:tcW w:w="3600" w:type="dxa"/>
-            <w:tcMar>
-              <w:top w:w="75" w:type="dxa"/>
-              <w:left w:w="110" w:type="dxa"/>
-              <w:bottom w:w="75" w:type="dxa"/>
-              <w:right w:w="110" w:type="dxa"/>
-            </w:tcMar>
+            <w:tcW w:w="3568" w:type="dxa"/>
             <w:vAlign w:val="center"/>
           </w:tcPr>
           <w:p>
             <w:pPr>
-              <w:spacing w:after="0" w:line="247" w:lineRule="auto"/>
-              <w:rPr>
-                <w:lang w:val="es-US"/>
+              <w:spacing w:after="40"/>
+              <w:rPr>
+                <w:sz w:val="17"/>
+                <w:lang w:val="es-AR"/>
               </w:rPr>
             </w:pPr>
             <w:r>
               <w:rPr>
                 <w:sz w:val="17"/>
-                <w:lang w:val="es-US"/>
+                <w:lang w:val="es-AR"/>
               </w:rPr>
               <w:t>Selección de origen y destino desde el celular.</w:t>
             </w:r>
@@ -1186,26 +1676,21 @@
         </w:tc>
         <w:tc>
           <w:tcPr>
-            <w:tcW w:w="5480" w:type="dxa"/>
-            <w:tcMar>
-              <w:top w:w="75" w:type="dxa"/>
-              <w:left w:w="110" w:type="dxa"/>
-              <w:bottom w:w="75" w:type="dxa"/>
-              <w:right w:w="110" w:type="dxa"/>
-            </w:tcMar>
+            <w:tcW w:w="5432" w:type="dxa"/>
             <w:vAlign w:val="center"/>
           </w:tcPr>
           <w:p>
             <w:pPr>
-              <w:spacing w:after="0" w:line="247" w:lineRule="auto"/>
-              <w:rPr>
-                <w:lang w:val="es-US"/>
+              <w:spacing w:after="40"/>
+              <w:rPr>
+                <w:sz w:val="17"/>
+                <w:lang w:val="es-AR"/>
               </w:rPr>
             </w:pPr>
             <w:r>
               <w:rPr>
                 <w:sz w:val="17"/>
-                <w:lang w:val="es-US"/>
+                <w:lang w:val="es-AR"/>
               </w:rPr>
               <w:t>Permite plantear el recorrido concreto que el usuario necesita resolver.</w:t>
             </w:r>
@@ -1213,28 +1698,26 @@
         </w:tc>
       </w:tr>
       <w:tr>
+        <w:trPr>
+          <w:cantSplit/>
+        </w:trPr>
         <w:tc>
           <w:tcPr>
-            <w:tcW w:w="3600" w:type="dxa"/>
-            <w:tcMar>
-              <w:top w:w="75" w:type="dxa"/>
-              <w:left w:w="110" w:type="dxa"/>
-              <w:bottom w:w="75" w:type="dxa"/>
-              <w:right w:w="110" w:type="dxa"/>
-            </w:tcMar>
+            <w:tcW w:w="3568" w:type="dxa"/>
             <w:vAlign w:val="center"/>
           </w:tcPr>
           <w:p>
             <w:pPr>
-              <w:spacing w:after="0" w:line="247" w:lineRule="auto"/>
-              <w:rPr>
-                <w:lang w:val="es-US"/>
+              <w:spacing w:after="40"/>
+              <w:rPr>
+                <w:sz w:val="17"/>
+                <w:lang w:val="es-AR"/>
               </w:rPr>
             </w:pPr>
             <w:r>
               <w:rPr>
                 <w:sz w:val="17"/>
-                <w:lang w:val="es-US"/>
+                <w:lang w:val="es-AR"/>
               </w:rPr>
               <w:t>Cálculo y dibujo de una ruta clara sobre el mapa.</w:t>
             </w:r>
@@ -1242,26 +1725,21 @@
         </w:tc>
         <w:tc>
           <w:tcPr>
-            <w:tcW w:w="5480" w:type="dxa"/>
-            <w:tcMar>
-              <w:top w:w="75" w:type="dxa"/>
-              <w:left w:w="110" w:type="dxa"/>
-              <w:bottom w:w="75" w:type="dxa"/>
-              <w:right w:w="110" w:type="dxa"/>
-            </w:tcMar>
+            <w:tcW w:w="5432" w:type="dxa"/>
             <w:vAlign w:val="center"/>
           </w:tcPr>
           <w:p>
             <w:pPr>
-              <w:spacing w:after="0" w:line="247" w:lineRule="auto"/>
-              <w:rPr>
-                <w:lang w:val="es-US"/>
+              <w:spacing w:after="40"/>
+              <w:rPr>
+                <w:sz w:val="17"/>
+                <w:lang w:val="es-AR"/>
               </w:rPr>
             </w:pPr>
             <w:r>
               <w:rPr>
                 <w:sz w:val="17"/>
-                <w:lang w:val="es-US"/>
+                <w:lang w:val="es-AR"/>
               </w:rPr>
               <w:t>Prueba si las indicaciones permiten llegar sin ayuda y dentro del tiempo definido.</w:t>
             </w:r>
@@ -1269,28 +1747,26 @@
         </w:tc>
       </w:tr>
       <w:tr>
+        <w:trPr>
+          <w:cantSplit/>
+        </w:trPr>
         <w:tc>
           <w:tcPr>
-            <w:tcW w:w="3600" w:type="dxa"/>
-            <w:tcMar>
-              <w:top w:w="75" w:type="dxa"/>
-              <w:left w:w="110" w:type="dxa"/>
-              <w:bottom w:w="75" w:type="dxa"/>
-              <w:right w:w="110" w:type="dxa"/>
-            </w:tcMar>
+            <w:tcW w:w="3568" w:type="dxa"/>
             <w:vAlign w:val="center"/>
           </w:tcPr>
           <w:p>
             <w:pPr>
-              <w:spacing w:after="0" w:line="247" w:lineRule="auto"/>
-              <w:rPr>
-                <w:lang w:val="es-US"/>
+              <w:spacing w:after="40"/>
+              <w:rPr>
+                <w:sz w:val="17"/>
+                <w:lang w:val="es-AR"/>
               </w:rPr>
             </w:pPr>
             <w:r>
               <w:rPr>
                 <w:sz w:val="17"/>
-                <w:lang w:val="es-US"/>
+                <w:lang w:val="es-AR"/>
               </w:rPr>
               <w:t>Exclusión de tramos cerrados al calcular la ruta.</w:t>
             </w:r>
@@ -1298,26 +1774,21 @@
         </w:tc>
         <w:tc>
           <w:tcPr>
-            <w:tcW w:w="5480" w:type="dxa"/>
-            <w:tcMar>
-              <w:top w:w="75" w:type="dxa"/>
-              <w:left w:w="110" w:type="dxa"/>
-              <w:bottom w:w="75" w:type="dxa"/>
-              <w:right w:w="110" w:type="dxa"/>
-            </w:tcMar>
+            <w:tcW w:w="5432" w:type="dxa"/>
             <w:vAlign w:val="center"/>
           </w:tcPr>
           <w:p>
             <w:pPr>
-              <w:spacing w:after="0" w:line="247" w:lineRule="auto"/>
-              <w:rPr>
-                <w:lang w:val="es-US"/>
+              <w:spacing w:after="40"/>
+              <w:rPr>
+                <w:sz w:val="17"/>
+                <w:lang w:val="es-AR"/>
               </w:rPr>
             </w:pPr>
             <w:r>
               <w:rPr>
                 <w:sz w:val="17"/>
-                <w:lang w:val="es-US"/>
+                <w:lang w:val="es-AR"/>
               </w:rPr>
               <w:t>Permite verificar que el usuario no sea dirigido por un acceso no disponible.</w:t>
             </w:r>
@@ -1325,28 +1796,26 @@
         </w:tc>
       </w:tr>
       <w:tr>
+        <w:trPr>
+          <w:cantSplit/>
+        </w:trPr>
         <w:tc>
           <w:tcPr>
-            <w:tcW w:w="3600" w:type="dxa"/>
-            <w:tcMar>
-              <w:top w:w="75" w:type="dxa"/>
-              <w:left w:w="110" w:type="dxa"/>
-              <w:bottom w:w="75" w:type="dxa"/>
-              <w:right w:w="110" w:type="dxa"/>
-            </w:tcMar>
+            <w:tcW w:w="3568" w:type="dxa"/>
             <w:vAlign w:val="center"/>
           </w:tcPr>
           <w:p>
             <w:pPr>
-              <w:spacing w:after="0" w:line="247" w:lineRule="auto"/>
-              <w:rPr>
-                <w:lang w:val="es-US"/>
+              <w:spacing w:after="40"/>
+              <w:rPr>
+                <w:sz w:val="17"/>
+                <w:lang w:val="es-AR"/>
               </w:rPr>
             </w:pPr>
             <w:r>
               <w:rPr>
                 <w:sz w:val="17"/>
-                <w:lang w:val="es-US"/>
+                <w:lang w:val="es-AR"/>
               </w:rPr>
               <w:t>Consulta de una API meteorológica simulada y adaptación de la ruta.</w:t>
             </w:r>
@@ -1354,26 +1823,21 @@
         </w:tc>
         <w:tc>
           <w:tcPr>
-            <w:tcW w:w="5480" w:type="dxa"/>
-            <w:tcMar>
-              <w:top w:w="75" w:type="dxa"/>
-              <w:left w:w="110" w:type="dxa"/>
-              <w:bottom w:w="75" w:type="dxa"/>
-              <w:right w:w="110" w:type="dxa"/>
-            </w:tcMar>
+            <w:tcW w:w="5432" w:type="dxa"/>
             <w:vAlign w:val="center"/>
           </w:tcPr>
           <w:p>
             <w:pPr>
-              <w:spacing w:after="0" w:line="247" w:lineRule="auto"/>
-              <w:rPr>
-                <w:lang w:val="es-US"/>
+              <w:spacing w:after="40"/>
+              <w:rPr>
+                <w:sz w:val="17"/>
+                <w:lang w:val="es-AR"/>
               </w:rPr>
             </w:pPr>
             <w:r>
               <w:rPr>
                 <w:sz w:val="17"/>
-                <w:lang w:val="es-US"/>
+                <w:lang w:val="es-AR"/>
               </w:rPr>
               <w:t>Permite probar la propuesta de ofrecer un recorrido más resguardado cuando llueve sin depender todavía de un servicio externo real.</w:t>
             </w:r>
@@ -1384,82 +1848,98 @@
     <w:p>
       <w:pPr>
         <w:spacing w:after="20" w:line="24" w:lineRule="auto"/>
+        <w:jc w:val="both"/>
         <w:rPr>
-          <w:lang w:val="es-US"/>
+          <w:sz w:val="28"/>
+          <w:szCs w:val="28"/>
+          <w:lang w:val="es-AR"/>
         </w:rPr>
       </w:pPr>
       <w:r>
         <w:rPr>
           <w:sz w:val="4"/>
-          <w:lang w:val="es-US"/>
+          <w:lang w:val="es-AR"/>
         </w:rPr>
         <w:t xml:space="preserve"> </w:t>
       </w:r>
     </w:p>
+    <w:p>
+      <w:pPr>
+        <w:spacing w:after="20" w:line="24" w:lineRule="auto"/>
+        <w:jc w:val="both"/>
+        <w:rPr>
+          <w:sz w:val="28"/>
+          <w:szCs w:val="28"/>
+          <w:lang w:val="es-AR"/>
+        </w:rPr>
+      </w:pPr>
+    </w:p>
     <w:tbl>
       <w:tblPr>
-        <w:tblStyle w:val="Tablaconcuadrcula"/>
-        <w:tblW w:w="9080" w:type="dxa"/>
+        <w:tblW w:w="9000" w:type="dxa"/>
         <w:tblBorders>
-          <w:top w:val="single" w:sz="5" w:space="0" w:color="B7B7B7"/>
-          <w:left w:val="single" w:sz="5" w:space="0" w:color="B7B7B7"/>
-          <w:bottom w:val="single" w:sz="5" w:space="0" w:color="B7B7B7"/>
-          <w:right w:val="single" w:sz="5" w:space="0" w:color="B7B7B7"/>
-          <w:insideH w:val="single" w:sz="5" w:space="0" w:color="B7B7B7"/>
-          <w:insideV w:val="single" w:sz="5" w:space="0" w:color="B7B7B7"/>
+          <w:top w:val="single" w:sz="4" w:space="0" w:color="auto"/>
+          <w:left w:val="single" w:sz="4" w:space="0" w:color="auto"/>
+          <w:bottom w:val="single" w:sz="4" w:space="0" w:color="auto"/>
+          <w:right w:val="single" w:sz="4" w:space="0" w:color="auto"/>
+          <w:insideH w:val="single" w:sz="4" w:space="0" w:color="auto"/>
+          <w:insideV w:val="single" w:sz="4" w:space="0" w:color="auto"/>
         </w:tblBorders>
         <w:tblLayout w:type="fixed"/>
-        <w:tblLook w:val="04A0" w:firstRow="1" w:lastRow="0" w:firstColumn="1" w:lastColumn="0" w:noHBand="0" w:noVBand="1"/>
+        <w:tblCellMar>
+          <w:left w:w="70" w:type="dxa"/>
+          <w:right w:w="70" w:type="dxa"/>
+        </w:tblCellMar>
+        <w:tblLook w:val="0000" w:firstRow="0" w:lastRow="0" w:firstColumn="0" w:lastColumn="0" w:noHBand="0" w:noVBand="0"/>
       </w:tblPr>
       <w:tblGrid>
-        <w:gridCol w:w="3600"/>
-        <w:gridCol w:w="5480"/>
+        <w:gridCol w:w="3568"/>
+        <w:gridCol w:w="5432"/>
       </w:tblGrid>
       <w:tr>
         <w:trPr>
+          <w:cantSplit/>
           <w:tblHeader/>
         </w:trPr>
         <w:tc>
           <w:tcPr>
-            <w:tcW w:w="3600" w:type="dxa"/>
-            <w:shd w:val="clear" w:color="auto" w:fill="1F4E78"/>
-            <w:tcMar>
-              <w:top w:w="75" w:type="dxa"/>
-              <w:left w:w="110" w:type="dxa"/>
-              <w:bottom w:w="75" w:type="dxa"/>
-              <w:right w:w="110" w:type="dxa"/>
-            </w:tcMar>
+            <w:tcW w:w="3568" w:type="dxa"/>
+            <w:shd w:val="clear" w:color="auto" w:fill="1F4E79"/>
             <w:vAlign w:val="center"/>
           </w:tcPr>
           <w:p>
             <w:pPr>
-              <w:spacing w:after="0" w:line="240" w:lineRule="auto"/>
+              <w:spacing w:after="40"/>
             </w:pPr>
+            <w:proofErr w:type="spellStart"/>
             <w:r>
               <w:rPr>
                 <w:b/>
                 <w:color w:val="FFFFFF"/>
                 <w:sz w:val="17"/>
               </w:rPr>
-              <w:t>Excluido del MVP</w:t>
+              <w:t>Excluido</w:t>
+            </w:r>
+            <w:proofErr w:type="spellEnd"/>
+            <w:r>
+              <w:rPr>
+                <w:b/>
+                <w:color w:val="FFFFFF"/>
+                <w:sz w:val="17"/>
+              </w:rPr>
+              <w:t xml:space="preserve"> del MVP</w:t>
             </w:r>
           </w:p>
         </w:tc>
         <w:tc>
           <w:tcPr>
-            <w:tcW w:w="5480" w:type="dxa"/>
-            <w:shd w:val="clear" w:color="auto" w:fill="1F4E78"/>
-            <w:tcMar>
-              <w:top w:w="75" w:type="dxa"/>
-              <w:left w:w="110" w:type="dxa"/>
-              <w:bottom w:w="75" w:type="dxa"/>
-              <w:right w:w="110" w:type="dxa"/>
-            </w:tcMar>
+            <w:tcW w:w="5432" w:type="dxa"/>
+            <w:shd w:val="clear" w:color="auto" w:fill="1F4E79"/>
             <w:vAlign w:val="center"/>
           </w:tcPr>
           <w:p>
             <w:pPr>
-              <w:spacing w:after="0" w:line="240" w:lineRule="auto"/>
+              <w:spacing w:after="40"/>
             </w:pPr>
             <w:r>
               <w:rPr>
@@ -1473,28 +1953,26 @@
         </w:tc>
       </w:tr>
       <w:tr>
+        <w:trPr>
+          <w:cantSplit/>
+        </w:trPr>
         <w:tc>
           <w:tcPr>
-            <w:tcW w:w="3600" w:type="dxa"/>
-            <w:tcMar>
-              <w:top w:w="75" w:type="dxa"/>
-              <w:left w:w="110" w:type="dxa"/>
-              <w:bottom w:w="75" w:type="dxa"/>
-              <w:right w:w="110" w:type="dxa"/>
-            </w:tcMar>
+            <w:tcW w:w="3568" w:type="dxa"/>
             <w:vAlign w:val="center"/>
           </w:tcPr>
           <w:p>
             <w:pPr>
-              <w:spacing w:after="0" w:line="247" w:lineRule="auto"/>
-              <w:rPr>
-                <w:lang w:val="es-US"/>
+              <w:spacing w:after="40"/>
+              <w:rPr>
+                <w:sz w:val="17"/>
+                <w:lang w:val="es-AR"/>
               </w:rPr>
             </w:pPr>
             <w:r>
               <w:rPr>
                 <w:sz w:val="17"/>
-                <w:lang w:val="es-US"/>
+                <w:lang w:val="es-AR"/>
               </w:rPr>
               <w:t>Conexión real con una API meteorológica externa.</w:t>
             </w:r>
@@ -1502,26 +1980,21 @@
         </w:tc>
         <w:tc>
           <w:tcPr>
-            <w:tcW w:w="5480" w:type="dxa"/>
-            <w:tcMar>
-              <w:top w:w="75" w:type="dxa"/>
-              <w:left w:w="110" w:type="dxa"/>
-              <w:bottom w:w="75" w:type="dxa"/>
-              <w:right w:w="110" w:type="dxa"/>
-            </w:tcMar>
+            <w:tcW w:w="5432" w:type="dxa"/>
             <w:vAlign w:val="center"/>
           </w:tcPr>
           <w:p>
             <w:pPr>
-              <w:spacing w:after="0" w:line="247" w:lineRule="auto"/>
-              <w:rPr>
-                <w:lang w:val="es-US"/>
+              <w:spacing w:after="40"/>
+              <w:rPr>
+                <w:sz w:val="17"/>
+                <w:lang w:val="es-AR"/>
               </w:rPr>
             </w:pPr>
             <w:r>
               <w:rPr>
                 <w:sz w:val="17"/>
-                <w:lang w:val="es-US"/>
+                <w:lang w:val="es-AR"/>
               </w:rPr>
               <w:t>Para el MVP se simulan respuestas de lluvia y ausencia de lluvia; así se prueba la adaptación de la ruta sin depender de la disponibilidad del servicio.</w:t>
             </w:r>
@@ -1529,28 +2002,26 @@
         </w:tc>
       </w:tr>
       <w:tr>
+        <w:trPr>
+          <w:cantSplit/>
+        </w:trPr>
         <w:tc>
           <w:tcPr>
-            <w:tcW w:w="3600" w:type="dxa"/>
-            <w:tcMar>
-              <w:top w:w="75" w:type="dxa"/>
-              <w:left w:w="110" w:type="dxa"/>
-              <w:bottom w:w="75" w:type="dxa"/>
-              <w:right w:w="110" w:type="dxa"/>
-            </w:tcMar>
+            <w:tcW w:w="3568" w:type="dxa"/>
             <w:vAlign w:val="center"/>
           </w:tcPr>
           <w:p>
             <w:pPr>
-              <w:spacing w:after="0" w:line="247" w:lineRule="auto"/>
-              <w:rPr>
-                <w:lang w:val="es-US"/>
+              <w:spacing w:after="40"/>
+              <w:rPr>
+                <w:sz w:val="17"/>
+                <w:lang w:val="es-AR"/>
               </w:rPr>
             </w:pPr>
             <w:r>
               <w:rPr>
                 <w:sz w:val="17"/>
-                <w:lang w:val="es-US"/>
+                <w:lang w:val="es-AR"/>
               </w:rPr>
               <w:t>Búsqueda del servicio más cercano y horarios de puntos de interés.</w:t>
             </w:r>
@@ -1558,26 +2029,21 @@
         </w:tc>
         <w:tc>
           <w:tcPr>
-            <w:tcW w:w="5480" w:type="dxa"/>
-            <w:tcMar>
-              <w:top w:w="75" w:type="dxa"/>
-              <w:left w:w="110" w:type="dxa"/>
-              <w:bottom w:w="75" w:type="dxa"/>
-              <w:right w:w="110" w:type="dxa"/>
-            </w:tcMar>
+            <w:tcW w:w="5432" w:type="dxa"/>
             <w:vAlign w:val="center"/>
           </w:tcPr>
           <w:p>
             <w:pPr>
-              <w:spacing w:after="0" w:line="247" w:lineRule="auto"/>
-              <w:rPr>
-                <w:lang w:val="es-US"/>
+              <w:spacing w:after="40"/>
+              <w:rPr>
+                <w:sz w:val="17"/>
+                <w:lang w:val="es-AR"/>
               </w:rPr>
             </w:pPr>
             <w:r>
               <w:rPr>
                 <w:sz w:val="17"/>
-                <w:lang w:val="es-US"/>
+                <w:lang w:val="es-AR"/>
               </w:rPr>
               <w:t>Amplía los casos de uso, pero no es necesaria para probar que el usuario llegue a un destino asignado.</w:t>
             </w:r>
@@ -1585,28 +2051,26 @@
         </w:tc>
       </w:tr>
       <w:tr>
+        <w:trPr>
+          <w:cantSplit/>
+        </w:trPr>
         <w:tc>
           <w:tcPr>
-            <w:tcW w:w="3600" w:type="dxa"/>
-            <w:tcMar>
-              <w:top w:w="75" w:type="dxa"/>
-              <w:left w:w="110" w:type="dxa"/>
-              <w:bottom w:w="75" w:type="dxa"/>
-              <w:right w:w="110" w:type="dxa"/>
-            </w:tcMar>
+            <w:tcW w:w="3568" w:type="dxa"/>
             <w:vAlign w:val="center"/>
           </w:tcPr>
           <w:p>
             <w:pPr>
-              <w:spacing w:after="0" w:line="247" w:lineRule="auto"/>
-              <w:rPr>
-                <w:lang w:val="es-US"/>
+              <w:spacing w:after="40"/>
+              <w:rPr>
+                <w:sz w:val="17"/>
+                <w:lang w:val="es-AR"/>
               </w:rPr>
             </w:pPr>
             <w:r>
               <w:rPr>
                 <w:sz w:val="17"/>
-                <w:lang w:val="es-US"/>
+                <w:lang w:val="es-AR"/>
               </w:rPr>
               <w:t>Panel de administración de cierres.</w:t>
             </w:r>
@@ -1614,26 +2078,21 @@
         </w:tc>
         <w:tc>
           <w:tcPr>
-            <w:tcW w:w="5480" w:type="dxa"/>
-            <w:tcMar>
-              <w:top w:w="75" w:type="dxa"/>
-              <w:left w:w="110" w:type="dxa"/>
-              <w:bottom w:w="75" w:type="dxa"/>
-              <w:right w:w="110" w:type="dxa"/>
-            </w:tcMar>
+            <w:tcW w:w="5432" w:type="dxa"/>
             <w:vAlign w:val="center"/>
           </w:tcPr>
           <w:p>
             <w:pPr>
-              <w:spacing w:after="0" w:line="247" w:lineRule="auto"/>
-              <w:rPr>
-                <w:lang w:val="es-US"/>
+              <w:spacing w:after="40"/>
+              <w:rPr>
+                <w:sz w:val="17"/>
+                <w:lang w:val="es-AR"/>
               </w:rPr>
             </w:pPr>
             <w:r>
               <w:rPr>
                 <w:sz w:val="17"/>
-                <w:lang w:val="es-US"/>
+                <w:lang w:val="es-AR"/>
               </w:rPr>
               <w:t>Los tramos cerrados se precargan manualmente antes de la prueba. El MVP debe respetarlos al calcular, pero no necesita una interfaz para gestionarlos.</w:t>
             </w:r>
@@ -1644,80 +2103,80 @@
     <w:p>
       <w:pPr>
         <w:spacing w:after="20" w:line="24" w:lineRule="auto"/>
+        <w:jc w:val="both"/>
         <w:rPr>
-          <w:lang w:val="es-US"/>
+          <w:lang w:val="es-AR"/>
         </w:rPr>
       </w:pPr>
       <w:r>
         <w:rPr>
           <w:sz w:val="4"/>
-          <w:lang w:val="es-US"/>
+          <w:lang w:val="es-AR"/>
         </w:rPr>
         <w:t xml:space="preserve"> </w:t>
       </w:r>
     </w:p>
     <w:p>
       <w:pPr>
-        <w:pStyle w:val="Ttulo2"/>
+        <w:pStyle w:val="Ttulo1"/>
         <w:spacing w:before="100" w:after="60"/>
         <w:rPr>
-          <w:lang w:val="es-US"/>
+          <w:lang w:val="es-AR"/>
         </w:rPr>
       </w:pPr>
+      <w:bookmarkStart w:id="1" w:name="_Toc239613981"/>
       <w:r>
         <w:rPr>
-          <w:rFonts w:ascii="Arial" w:hAnsi="Arial"/>
-          <w:lang w:val="es-US"/>
+          <w:lang w:val="es-AR"/>
         </w:rPr>
         <w:t>2. Qué se construye y qué se simula</w:t>
       </w:r>
+      <w:bookmarkEnd w:id="1"/>
     </w:p>
     <w:tbl>
       <w:tblPr>
-        <w:tblStyle w:val="Tablaconcuadrcula"/>
-        <w:tblW w:w="9080" w:type="dxa"/>
+        <w:tblW w:w="9000" w:type="dxa"/>
         <w:tblBorders>
-          <w:top w:val="single" w:sz="5" w:space="0" w:color="B7B7B7"/>
-          <w:left w:val="single" w:sz="5" w:space="0" w:color="B7B7B7"/>
-          <w:bottom w:val="single" w:sz="5" w:space="0" w:color="B7B7B7"/>
-          <w:right w:val="single" w:sz="5" w:space="0" w:color="B7B7B7"/>
-          <w:insideH w:val="single" w:sz="5" w:space="0" w:color="B7B7B7"/>
-          <w:insideV w:val="single" w:sz="5" w:space="0" w:color="B7B7B7"/>
+          <w:top w:val="single" w:sz="4" w:space="0" w:color="auto"/>
+          <w:left w:val="single" w:sz="4" w:space="0" w:color="auto"/>
+          <w:bottom w:val="single" w:sz="4" w:space="0" w:color="auto"/>
+          <w:right w:val="single" w:sz="4" w:space="0" w:color="auto"/>
+          <w:insideH w:val="single" w:sz="4" w:space="0" w:color="auto"/>
+          <w:insideV w:val="single" w:sz="4" w:space="0" w:color="auto"/>
         </w:tblBorders>
         <w:tblLayout w:type="fixed"/>
-        <w:tblLook w:val="04A0" w:firstRow="1" w:lastRow="0" w:firstColumn="1" w:lastColumn="0" w:noHBand="0" w:noVBand="1"/>
+        <w:tblCellMar>
+          <w:left w:w="70" w:type="dxa"/>
+          <w:right w:w="70" w:type="dxa"/>
+        </w:tblCellMar>
+        <w:tblLook w:val="0000" w:firstRow="0" w:lastRow="0" w:firstColumn="0" w:lastColumn="0" w:noHBand="0" w:noVBand="0"/>
       </w:tblPr>
       <w:tblGrid>
-        <w:gridCol w:w="1400"/>
-        <w:gridCol w:w="2510"/>
-        <w:gridCol w:w="2400"/>
-        <w:gridCol w:w="2770"/>
+        <w:gridCol w:w="1388"/>
+        <w:gridCol w:w="2488"/>
+        <w:gridCol w:w="2379"/>
+        <w:gridCol w:w="2745"/>
       </w:tblGrid>
       <w:tr>
         <w:trPr>
+          <w:cantSplit/>
           <w:tblHeader/>
         </w:trPr>
         <w:tc>
           <w:tcPr>
-            <w:tcW w:w="1400" w:type="dxa"/>
-            <w:shd w:val="clear" w:color="auto" w:fill="1F4E78"/>
-            <w:tcMar>
-              <w:top w:w="75" w:type="dxa"/>
-              <w:left w:w="110" w:type="dxa"/>
-              <w:bottom w:w="75" w:type="dxa"/>
-              <w:right w:w="110" w:type="dxa"/>
-            </w:tcMar>
+            <w:tcW w:w="1388" w:type="dxa"/>
+            <w:shd w:val="clear" w:color="auto" w:fill="1F4E79"/>
             <w:vAlign w:val="center"/>
           </w:tcPr>
           <w:p>
             <w:pPr>
-              <w:spacing w:after="0" w:line="240" w:lineRule="auto"/>
+              <w:spacing w:after="40"/>
             </w:pPr>
             <w:r>
               <w:rPr>
                 <w:b/>
                 <w:color w:val="FFFFFF"/>
-                <w:sz w:val="15"/>
+                <w:sz w:val="17"/>
               </w:rPr>
               <w:t>Elemento</w:t>
             </w:r>
@@ -1725,25 +2184,19 @@
         </w:tc>
         <w:tc>
           <w:tcPr>
-            <w:tcW w:w="2510" w:type="dxa"/>
-            <w:shd w:val="clear" w:color="auto" w:fill="1F4E78"/>
-            <w:tcMar>
-              <w:top w:w="75" w:type="dxa"/>
-              <w:left w:w="110" w:type="dxa"/>
-              <w:bottom w:w="75" w:type="dxa"/>
-              <w:right w:w="110" w:type="dxa"/>
-            </w:tcMar>
+            <w:tcW w:w="2488" w:type="dxa"/>
+            <w:shd w:val="clear" w:color="auto" w:fill="1F4E79"/>
             <w:vAlign w:val="center"/>
           </w:tcPr>
           <w:p>
             <w:pPr>
-              <w:spacing w:after="0" w:line="240" w:lineRule="auto"/>
+              <w:spacing w:after="40"/>
             </w:pPr>
             <w:r>
               <w:rPr>
                 <w:b/>
                 <w:color w:val="FFFFFF"/>
-                <w:sz w:val="15"/>
+                <w:sz w:val="17"/>
               </w:rPr>
               <w:t>Se construye</w:t>
             </w:r>
@@ -1751,29 +2204,24 @@
         </w:tc>
         <w:tc>
           <w:tcPr>
-            <w:tcW w:w="2400" w:type="dxa"/>
-            <w:shd w:val="clear" w:color="auto" w:fill="1F4E78"/>
-            <w:tcMar>
-              <w:top w:w="75" w:type="dxa"/>
-              <w:left w:w="110" w:type="dxa"/>
-              <w:bottom w:w="75" w:type="dxa"/>
-              <w:right w:w="110" w:type="dxa"/>
-            </w:tcMar>
+            <w:tcW w:w="2379" w:type="dxa"/>
+            <w:shd w:val="clear" w:color="auto" w:fill="1F4E79"/>
             <w:vAlign w:val="center"/>
           </w:tcPr>
           <w:p>
             <w:pPr>
-              <w:spacing w:after="0" w:line="240" w:lineRule="auto"/>
-              <w:rPr>
-                <w:lang w:val="es-US"/>
+              <w:spacing w:after="40"/>
+              <w:rPr>
+                <w:sz w:val="17"/>
+                <w:lang w:val="es-AR"/>
               </w:rPr>
             </w:pPr>
             <w:r>
               <w:rPr>
                 <w:b/>
                 <w:color w:val="FFFFFF"/>
-                <w:sz w:val="15"/>
-                <w:lang w:val="es-US"/>
+                <w:sz w:val="17"/>
+                <w:lang w:val="es-AR"/>
               </w:rPr>
               <w:t>Se simula / se resuelve a mano</w:t>
             </w:r>
@@ -1781,25 +2229,19 @@
         </w:tc>
         <w:tc>
           <w:tcPr>
-            <w:tcW w:w="2770" w:type="dxa"/>
-            <w:shd w:val="clear" w:color="auto" w:fill="1F4E78"/>
-            <w:tcMar>
-              <w:top w:w="75" w:type="dxa"/>
-              <w:left w:w="110" w:type="dxa"/>
-              <w:bottom w:w="75" w:type="dxa"/>
-              <w:right w:w="110" w:type="dxa"/>
-            </w:tcMar>
+            <w:tcW w:w="2745" w:type="dxa"/>
+            <w:shd w:val="clear" w:color="auto" w:fill="1F4E79"/>
             <w:vAlign w:val="center"/>
           </w:tcPr>
           <w:p>
             <w:pPr>
-              <w:spacing w:after="0" w:line="240" w:lineRule="auto"/>
+              <w:spacing w:after="40"/>
             </w:pPr>
             <w:r>
               <w:rPr>
                 <w:b/>
                 <w:color w:val="FFFFFF"/>
-                <w:sz w:val="15"/>
+                <w:sz w:val="17"/>
               </w:rPr>
               <w:t>Por qué</w:t>
             </w:r>
@@ -1807,24 +2249,21 @@
         </w:tc>
       </w:tr>
       <w:tr>
+        <w:trPr>
+          <w:cantSplit/>
+        </w:trPr>
         <w:tc>
           <w:tcPr>
-            <w:tcW w:w="1400" w:type="dxa"/>
-            <w:tcMar>
-              <w:top w:w="75" w:type="dxa"/>
-              <w:left w:w="110" w:type="dxa"/>
-              <w:bottom w:w="75" w:type="dxa"/>
-              <w:right w:w="110" w:type="dxa"/>
-            </w:tcMar>
+            <w:tcW w:w="1388" w:type="dxa"/>
             <w:vAlign w:val="center"/>
           </w:tcPr>
           <w:p>
             <w:pPr>
-              <w:spacing w:after="0" w:line="247" w:lineRule="auto"/>
+              <w:spacing w:after="40"/>
             </w:pPr>
             <w:r>
               <w:rPr>
-                <w:sz w:val="15"/>
+                <w:sz w:val="17"/>
               </w:rPr>
               <w:t>Interfaz web móvil</w:t>
             </w:r>
@@ -1832,26 +2271,21 @@
         </w:tc>
         <w:tc>
           <w:tcPr>
-            <w:tcW w:w="2510" w:type="dxa"/>
-            <w:tcMar>
-              <w:top w:w="75" w:type="dxa"/>
-              <w:left w:w="110" w:type="dxa"/>
-              <w:bottom w:w="75" w:type="dxa"/>
-              <w:right w:w="110" w:type="dxa"/>
-            </w:tcMar>
+            <w:tcW w:w="2488" w:type="dxa"/>
             <w:vAlign w:val="center"/>
           </w:tcPr>
           <w:p>
             <w:pPr>
-              <w:spacing w:after="0" w:line="247" w:lineRule="auto"/>
-              <w:rPr>
-                <w:lang w:val="es-US"/>
+              <w:spacing w:after="40"/>
+              <w:rPr>
+                <w:sz w:val="17"/>
+                <w:lang w:val="es-AR"/>
               </w:rPr>
             </w:pPr>
             <w:r>
               <w:rPr>
-                <w:sz w:val="15"/>
-                <w:lang w:val="es-US"/>
+                <w:sz w:val="17"/>
+                <w:lang w:val="es-AR"/>
               </w:rPr>
               <w:t>Pantallas y controles para elegir origen, destino y solicitar la ruta.</w:t>
             </w:r>
@@ -1859,22 +2293,16 @@
         </w:tc>
         <w:tc>
           <w:tcPr>
-            <w:tcW w:w="2400" w:type="dxa"/>
-            <w:tcMar>
-              <w:top w:w="75" w:type="dxa"/>
-              <w:left w:w="110" w:type="dxa"/>
-              <w:bottom w:w="75" w:type="dxa"/>
-              <w:right w:w="110" w:type="dxa"/>
-            </w:tcMar>
+            <w:tcW w:w="2379" w:type="dxa"/>
             <w:vAlign w:val="center"/>
           </w:tcPr>
           <w:p>
             <w:pPr>
-              <w:spacing w:after="0" w:line="247" w:lineRule="auto"/>
+              <w:spacing w:after="40"/>
             </w:pPr>
             <w:r>
               <w:rPr>
-                <w:sz w:val="15"/>
+                <w:sz w:val="17"/>
               </w:rPr>
               <w:t>No se simula.</w:t>
             </w:r>
@@ -1882,26 +2310,21 @@
         </w:tc>
         <w:tc>
           <w:tcPr>
-            <w:tcW w:w="2770" w:type="dxa"/>
-            <w:tcMar>
-              <w:top w:w="75" w:type="dxa"/>
-              <w:left w:w="110" w:type="dxa"/>
-              <w:bottom w:w="75" w:type="dxa"/>
-              <w:right w:w="110" w:type="dxa"/>
-            </w:tcMar>
+            <w:tcW w:w="2745" w:type="dxa"/>
             <w:vAlign w:val="center"/>
           </w:tcPr>
           <w:p>
             <w:pPr>
-              <w:spacing w:after="0" w:line="247" w:lineRule="auto"/>
-              <w:rPr>
-                <w:lang w:val="es-US"/>
+              <w:spacing w:after="40"/>
+              <w:rPr>
+                <w:sz w:val="17"/>
+                <w:lang w:val="es-AR"/>
               </w:rPr>
             </w:pPr>
             <w:r>
               <w:rPr>
-                <w:sz w:val="15"/>
-                <w:lang w:val="es-US"/>
+                <w:sz w:val="17"/>
+                <w:lang w:val="es-AR"/>
               </w:rPr>
               <w:t>Es el componente de software propio con el que interactúa el usuario.</w:t>
             </w:r>
@@ -1909,28 +2332,26 @@
         </w:tc>
       </w:tr>
       <w:tr>
+        <w:trPr>
+          <w:cantSplit/>
+        </w:trPr>
         <w:tc>
           <w:tcPr>
-            <w:tcW w:w="1400" w:type="dxa"/>
-            <w:tcMar>
-              <w:top w:w="75" w:type="dxa"/>
-              <w:left w:w="110" w:type="dxa"/>
-              <w:bottom w:w="75" w:type="dxa"/>
-              <w:right w:w="110" w:type="dxa"/>
-            </w:tcMar>
+            <w:tcW w:w="1388" w:type="dxa"/>
             <w:vAlign w:val="center"/>
           </w:tcPr>
           <w:p>
             <w:pPr>
-              <w:spacing w:after="0" w:line="247" w:lineRule="auto"/>
-              <w:rPr>
-                <w:lang w:val="es-US"/>
+              <w:spacing w:after="40"/>
+              <w:rPr>
+                <w:sz w:val="17"/>
+                <w:lang w:val="es-AR"/>
               </w:rPr>
             </w:pPr>
             <w:r>
               <w:rPr>
-                <w:sz w:val="15"/>
-                <w:lang w:val="es-US"/>
+                <w:sz w:val="17"/>
+                <w:lang w:val="es-AR"/>
               </w:rPr>
               <w:t>Mapa y motor de rutas</w:t>
             </w:r>
@@ -1938,26 +2359,21 @@
         </w:tc>
         <w:tc>
           <w:tcPr>
-            <w:tcW w:w="2510" w:type="dxa"/>
-            <w:tcMar>
-              <w:top w:w="75" w:type="dxa"/>
-              <w:left w:w="110" w:type="dxa"/>
-              <w:bottom w:w="75" w:type="dxa"/>
-              <w:right w:w="110" w:type="dxa"/>
-            </w:tcMar>
+            <w:tcW w:w="2488" w:type="dxa"/>
             <w:vAlign w:val="center"/>
           </w:tcPr>
           <w:p>
             <w:pPr>
-              <w:spacing w:after="0" w:line="247" w:lineRule="auto"/>
-              <w:rPr>
-                <w:lang w:val="es-US"/>
+              <w:spacing w:after="40"/>
+              <w:rPr>
+                <w:sz w:val="17"/>
+                <w:lang w:val="es-AR"/>
               </w:rPr>
             </w:pPr>
             <w:r>
               <w:rPr>
-                <w:sz w:val="15"/>
-                <w:lang w:val="es-US"/>
+                <w:sz w:val="17"/>
+                <w:lang w:val="es-AR"/>
               </w:rPr>
               <w:t>Cálculo del recorrido y representación visual sobre el mapa.</w:t>
             </w:r>
@@ -1965,26 +2381,21 @@
         </w:tc>
         <w:tc>
           <w:tcPr>
-            <w:tcW w:w="2400" w:type="dxa"/>
-            <w:tcMar>
-              <w:top w:w="75" w:type="dxa"/>
-              <w:left w:w="110" w:type="dxa"/>
-              <w:bottom w:w="75" w:type="dxa"/>
-              <w:right w:w="110" w:type="dxa"/>
-            </w:tcMar>
+            <w:tcW w:w="2379" w:type="dxa"/>
             <w:vAlign w:val="center"/>
           </w:tcPr>
           <w:p>
             <w:pPr>
-              <w:spacing w:after="0" w:line="247" w:lineRule="auto"/>
-              <w:rPr>
-                <w:lang w:val="es-US"/>
+              <w:spacing w:after="40"/>
+              <w:rPr>
+                <w:sz w:val="17"/>
+                <w:lang w:val="es-AR"/>
               </w:rPr>
             </w:pPr>
             <w:r>
               <w:rPr>
-                <w:sz w:val="15"/>
-                <w:lang w:val="es-US"/>
+                <w:sz w:val="17"/>
+                <w:lang w:val="es-AR"/>
               </w:rPr>
               <w:t>No se simula.</w:t>
             </w:r>
@@ -1992,26 +2403,21 @@
         </w:tc>
         <w:tc>
           <w:tcPr>
-            <w:tcW w:w="2770" w:type="dxa"/>
-            <w:tcMar>
-              <w:top w:w="75" w:type="dxa"/>
-              <w:left w:w="110" w:type="dxa"/>
-              <w:bottom w:w="75" w:type="dxa"/>
-              <w:right w:w="110" w:type="dxa"/>
-            </w:tcMar>
+            <w:tcW w:w="2745" w:type="dxa"/>
             <w:vAlign w:val="center"/>
           </w:tcPr>
           <w:p>
             <w:pPr>
-              <w:spacing w:after="0" w:line="247" w:lineRule="auto"/>
-              <w:rPr>
-                <w:lang w:val="es-US"/>
+              <w:spacing w:after="40"/>
+              <w:rPr>
+                <w:sz w:val="17"/>
+                <w:lang w:val="es-AR"/>
               </w:rPr>
             </w:pPr>
             <w:r>
               <w:rPr>
-                <w:sz w:val="15"/>
-                <w:lang w:val="es-US"/>
+                <w:sz w:val="17"/>
+                <w:lang w:val="es-AR"/>
               </w:rPr>
               <w:t>Permite evaluar si la ruta guía al usuario.</w:t>
             </w:r>
@@ -2019,51 +2425,59 @@
         </w:tc>
       </w:tr>
       <w:tr>
+        <w:trPr>
+          <w:cantSplit/>
+        </w:trPr>
         <w:tc>
           <w:tcPr>
-            <w:tcW w:w="1400" w:type="dxa"/>
-            <w:tcMar>
-              <w:top w:w="75" w:type="dxa"/>
-              <w:left w:w="110" w:type="dxa"/>
-              <w:bottom w:w="75" w:type="dxa"/>
-              <w:right w:w="110" w:type="dxa"/>
-            </w:tcMar>
+            <w:tcW w:w="1388" w:type="dxa"/>
             <w:vAlign w:val="center"/>
           </w:tcPr>
           <w:p>
             <w:pPr>
-              <w:spacing w:after="0" w:line="247" w:lineRule="auto"/>
+              <w:spacing w:after="40"/>
             </w:pPr>
+            <w:proofErr w:type="spellStart"/>
             <w:r>
               <w:rPr>
-                <w:sz w:val="15"/>
-              </w:rPr>
-              <w:t>Cierres temporales</w:t>
+                <w:sz w:val="17"/>
+              </w:rPr>
+              <w:t>Cierres</w:t>
             </w:r>
+            <w:proofErr w:type="spellEnd"/>
+            <w:r>
+              <w:rPr>
+                <w:sz w:val="17"/>
+              </w:rPr>
+              <w:t xml:space="preserve"> </w:t>
+            </w:r>
+            <w:proofErr w:type="spellStart"/>
+            <w:r>
+              <w:rPr>
+                <w:sz w:val="17"/>
+              </w:rPr>
+              <w:t>temporales</w:t>
+            </w:r>
+            <w:proofErr w:type="spellEnd"/>
           </w:p>
         </w:tc>
         <w:tc>
           <w:tcPr>
-            <w:tcW w:w="2510" w:type="dxa"/>
-            <w:tcMar>
-              <w:top w:w="75" w:type="dxa"/>
-              <w:left w:w="110" w:type="dxa"/>
-              <w:bottom w:w="75" w:type="dxa"/>
-              <w:right w:w="110" w:type="dxa"/>
-            </w:tcMar>
+            <w:tcW w:w="2488" w:type="dxa"/>
             <w:vAlign w:val="center"/>
           </w:tcPr>
           <w:p>
             <w:pPr>
-              <w:spacing w:after="0" w:line="247" w:lineRule="auto"/>
-              <w:rPr>
-                <w:lang w:val="es-US"/>
+              <w:spacing w:after="40"/>
+              <w:rPr>
+                <w:sz w:val="17"/>
+                <w:lang w:val="es-AR"/>
               </w:rPr>
             </w:pPr>
             <w:r>
               <w:rPr>
-                <w:sz w:val="15"/>
-                <w:lang w:val="es-US"/>
+                <w:sz w:val="17"/>
+                <w:lang w:val="es-AR"/>
               </w:rPr>
               <w:t>El algoritmo evita los tramos marcados como no disponibles.</w:t>
             </w:r>
@@ -2071,26 +2485,21 @@
         </w:tc>
         <w:tc>
           <w:tcPr>
-            <w:tcW w:w="2400" w:type="dxa"/>
-            <w:tcMar>
-              <w:top w:w="75" w:type="dxa"/>
-              <w:left w:w="110" w:type="dxa"/>
-              <w:bottom w:w="75" w:type="dxa"/>
-              <w:right w:w="110" w:type="dxa"/>
-            </w:tcMar>
+            <w:tcW w:w="2379" w:type="dxa"/>
             <w:vAlign w:val="center"/>
           </w:tcPr>
           <w:p>
             <w:pPr>
-              <w:spacing w:after="0" w:line="247" w:lineRule="auto"/>
-              <w:rPr>
-                <w:lang w:val="es-US"/>
+              <w:spacing w:after="40"/>
+              <w:rPr>
+                <w:sz w:val="17"/>
+                <w:lang w:val="es-AR"/>
               </w:rPr>
             </w:pPr>
             <w:r>
               <w:rPr>
-                <w:sz w:val="15"/>
-                <w:lang w:val="es-US"/>
+                <w:sz w:val="17"/>
+                <w:lang w:val="es-AR"/>
               </w:rPr>
               <w:t>El equipo precarga los cierres; no hay panel administrador.</w:t>
             </w:r>
@@ -2098,26 +2507,21 @@
         </w:tc>
         <w:tc>
           <w:tcPr>
-            <w:tcW w:w="2770" w:type="dxa"/>
-            <w:tcMar>
-              <w:top w:w="75" w:type="dxa"/>
-              <w:left w:w="110" w:type="dxa"/>
-              <w:bottom w:w="75" w:type="dxa"/>
-              <w:right w:w="110" w:type="dxa"/>
-            </w:tcMar>
+            <w:tcW w:w="2745" w:type="dxa"/>
             <w:vAlign w:val="center"/>
           </w:tcPr>
           <w:p>
             <w:pPr>
-              <w:spacing w:after="0" w:line="247" w:lineRule="auto"/>
-              <w:rPr>
-                <w:lang w:val="es-US"/>
+              <w:spacing w:after="40"/>
+              <w:rPr>
+                <w:sz w:val="17"/>
+                <w:lang w:val="es-AR"/>
               </w:rPr>
             </w:pPr>
             <w:r>
               <w:rPr>
-                <w:sz w:val="15"/>
-                <w:lang w:val="es-US"/>
+                <w:sz w:val="17"/>
+                <w:lang w:val="es-AR"/>
               </w:rPr>
               <w:t>Se construye el comportamiento que recibe el Navegante; sólo se simula la gestión previa del dato.</w:t>
             </w:r>
@@ -2125,55 +2529,57 @@
         </w:tc>
       </w:tr>
       <w:tr>
+        <w:trPr>
+          <w:cantSplit/>
+        </w:trPr>
         <w:tc>
           <w:tcPr>
-            <w:tcW w:w="1400" w:type="dxa"/>
-            <w:tcMar>
-              <w:top w:w="75" w:type="dxa"/>
-              <w:left w:w="110" w:type="dxa"/>
-              <w:bottom w:w="75" w:type="dxa"/>
-              <w:right w:w="110" w:type="dxa"/>
-            </w:tcMar>
+            <w:tcW w:w="1388" w:type="dxa"/>
             <w:vAlign w:val="center"/>
           </w:tcPr>
           <w:p>
             <w:pPr>
-              <w:spacing w:after="0" w:line="247" w:lineRule="auto"/>
-              <w:rPr>
-                <w:lang w:val="es-US"/>
+              <w:spacing w:after="40"/>
+              <w:rPr>
+                <w:sz w:val="17"/>
+                <w:lang w:val="es-AR"/>
               </w:rPr>
             </w:pPr>
+            <w:proofErr w:type="gramStart"/>
             <w:r>
               <w:rPr>
-                <w:sz w:val="15"/>
-                <w:lang w:val="es-US"/>
-              </w:rPr>
-              <w:t>API meteorológica y adaptación climática</w:t>
+                <w:sz w:val="17"/>
+                <w:lang w:val="es-AR"/>
+              </w:rPr>
+              <w:t>API meteorológica</w:t>
+            </w:r>
+            <w:proofErr w:type="gramEnd"/>
+            <w:r>
+              <w:rPr>
+                <w:sz w:val="17"/>
+                <w:lang w:val="es-AR"/>
+              </w:rPr>
+              <w:t xml:space="preserve"> y adaptación climática</w:t>
             </w:r>
           </w:p>
         </w:tc>
         <w:tc>
           <w:tcPr>
-            <w:tcW w:w="2510" w:type="dxa"/>
-            <w:tcMar>
-              <w:top w:w="75" w:type="dxa"/>
-              <w:left w:w="110" w:type="dxa"/>
-              <w:bottom w:w="75" w:type="dxa"/>
-              <w:right w:w="110" w:type="dxa"/>
-            </w:tcMar>
+            <w:tcW w:w="2488" w:type="dxa"/>
             <w:vAlign w:val="center"/>
           </w:tcPr>
           <w:p>
             <w:pPr>
-              <w:spacing w:after="0" w:line="247" w:lineRule="auto"/>
-              <w:rPr>
-                <w:lang w:val="es-US"/>
+              <w:spacing w:after="40"/>
+              <w:rPr>
+                <w:sz w:val="17"/>
+                <w:lang w:val="es-AR"/>
               </w:rPr>
             </w:pPr>
             <w:r>
               <w:rPr>
-                <w:sz w:val="15"/>
-                <w:lang w:val="es-US"/>
+                <w:sz w:val="17"/>
+                <w:lang w:val="es-AR"/>
               </w:rPr>
               <w:t>La aplicación consulta un servicio simulado, interpreta lluvia o ausencia de lluvia y adapta el recorrido.</w:t>
             </w:r>
@@ -2181,26 +2587,21 @@
         </w:tc>
         <w:tc>
           <w:tcPr>
-            <w:tcW w:w="2400" w:type="dxa"/>
-            <w:tcMar>
-              <w:top w:w="75" w:type="dxa"/>
-              <w:left w:w="110" w:type="dxa"/>
-              <w:bottom w:w="75" w:type="dxa"/>
-              <w:right w:w="110" w:type="dxa"/>
-            </w:tcMar>
+            <w:tcW w:w="2379" w:type="dxa"/>
             <w:vAlign w:val="center"/>
           </w:tcPr>
           <w:p>
             <w:pPr>
-              <w:spacing w:after="0" w:line="247" w:lineRule="auto"/>
-              <w:rPr>
-                <w:lang w:val="es-US"/>
+              <w:spacing w:after="40"/>
+              <w:rPr>
+                <w:sz w:val="17"/>
+                <w:lang w:val="es-AR"/>
               </w:rPr>
             </w:pPr>
             <w:r>
               <w:rPr>
-                <w:sz w:val="15"/>
-                <w:lang w:val="es-US"/>
+                <w:sz w:val="17"/>
+                <w:lang w:val="es-AR"/>
               </w:rPr>
               <w:t>Se simula la respuesta del servicio externo para ambos escenarios.</w:t>
             </w:r>
@@ -2208,26 +2609,21 @@
         </w:tc>
         <w:tc>
           <w:tcPr>
-            <w:tcW w:w="2770" w:type="dxa"/>
-            <w:tcMar>
-              <w:top w:w="75" w:type="dxa"/>
-              <w:left w:w="110" w:type="dxa"/>
-              <w:bottom w:w="75" w:type="dxa"/>
-              <w:right w:w="110" w:type="dxa"/>
-            </w:tcMar>
+            <w:tcW w:w="2745" w:type="dxa"/>
             <w:vAlign w:val="center"/>
           </w:tcPr>
           <w:p>
             <w:pPr>
-              <w:spacing w:after="0" w:line="247" w:lineRule="auto"/>
-              <w:rPr>
-                <w:lang w:val="es-US"/>
+              <w:spacing w:after="40"/>
+              <w:rPr>
+                <w:sz w:val="17"/>
+                <w:lang w:val="es-AR"/>
               </w:rPr>
             </w:pPr>
             <w:r>
               <w:rPr>
-                <w:sz w:val="15"/>
-                <w:lang w:val="es-US"/>
+                <w:sz w:val="17"/>
+                <w:lang w:val="es-AR"/>
               </w:rPr>
               <w:t>Permite evaluar la adaptación climática antes de integrar la API real.</w:t>
             </w:r>
@@ -2238,14 +2634,15 @@
     <w:p>
       <w:pPr>
         <w:spacing w:after="20" w:line="24" w:lineRule="auto"/>
+        <w:jc w:val="both"/>
         <w:rPr>
-          <w:lang w:val="es-US"/>
+          <w:lang w:val="es-AR"/>
         </w:rPr>
       </w:pPr>
       <w:r>
         <w:rPr>
           <w:sz w:val="4"/>
-          <w:lang w:val="es-US"/>
+          <w:lang w:val="es-AR"/>
         </w:rPr>
         <w:t xml:space="preserve"> </w:t>
       </w:r>
@@ -2254,37 +2651,41 @@
       <w:pPr>
         <w:rPr>
           <w:u w:val="single"/>
-          <w:lang w:val="es-US"/>
+          <w:lang w:val="es-AR"/>
         </w:rPr>
       </w:pPr>
     </w:p>
     <w:p>
       <w:pPr>
-        <w:pStyle w:val="Ttulo2"/>
+        <w:pStyle w:val="Ttulo1"/>
         <w:pageBreakBefore/>
         <w:spacing w:before="0"/>
         <w:rPr>
-          <w:lang w:val="es-US"/>
+          <w:lang w:val="es-AR"/>
         </w:rPr>
       </w:pPr>
+      <w:bookmarkStart w:id="2" w:name="_Toc239613982"/>
       <w:r>
         <w:rPr>
-          <w:lang w:val="es-US"/>
+          <w:lang w:val="es-AR"/>
         </w:rPr>
         <w:lastRenderedPageBreak/>
         <w:t>3. Flujo principal del MVP</w:t>
       </w:r>
+      <w:bookmarkEnd w:id="2"/>
     </w:p>
     <w:p>
       <w:pPr>
+        <w:spacing w:after="140"/>
+        <w:jc w:val="both"/>
         <w:rPr>
-          <w:lang w:val="es-US"/>
+          <w:lang w:val="es-AR"/>
         </w:rPr>
       </w:pPr>
       <w:r>
         <w:rPr>
           <w:sz w:val="20"/>
-          <w:lang w:val="es-US"/>
+          <w:lang w:val="es-AR"/>
         </w:rPr>
         <w:t>El flujo central se concentra en una única tarea: obtener y seguir una ruta válida hasta un destino del campus desde el celular.</w:t>
       </w:r>
@@ -2294,22 +2695,23 @@
         <w:pStyle w:val="Listaconnmeros"/>
         <w:spacing w:after="60" w:line="240" w:lineRule="auto"/>
         <w:ind w:left="403" w:hanging="259"/>
+        <w:jc w:val="both"/>
         <w:rPr>
-          <w:lang w:val="es-US"/>
+          <w:lang w:val="es-AR"/>
         </w:rPr>
       </w:pPr>
       <w:r>
         <w:rPr>
           <w:b/>
           <w:sz w:val="20"/>
-          <w:lang w:val="es-US"/>
+          <w:lang w:val="es-AR"/>
         </w:rPr>
         <w:t xml:space="preserve">Abrir la aplicación. </w:t>
       </w:r>
       <w:r>
         <w:rPr>
           <w:sz w:val="20"/>
-          <w:lang w:val="es-US"/>
+          <w:lang w:val="es-AR"/>
         </w:rPr>
         <w:t>El Navegante accede a la aplicación web móvil y visualiza el mapa junto con los campos de origen y destino.</w:t>
       </w:r>
@@ -2319,22 +2721,23 @@
         <w:pStyle w:val="Listaconnmeros"/>
         <w:spacing w:after="60" w:line="240" w:lineRule="auto"/>
         <w:ind w:left="403" w:hanging="259"/>
+        <w:jc w:val="both"/>
         <w:rPr>
-          <w:lang w:val="es-US"/>
+          <w:lang w:val="es-AR"/>
         </w:rPr>
       </w:pPr>
       <w:r>
         <w:rPr>
           <w:b/>
           <w:sz w:val="20"/>
-          <w:lang w:val="es-US"/>
+          <w:lang w:val="es-AR"/>
         </w:rPr>
         <w:t xml:space="preserve">Indicar el recorrido. </w:t>
       </w:r>
       <w:r>
         <w:rPr>
           <w:sz w:val="20"/>
-          <w:lang w:val="es-US"/>
+          <w:lang w:val="es-AR"/>
         </w:rPr>
         <w:t>Selecciona el punto desde el que parte y el aula o sector al que necesita llegar. La opción para calcular se habilita cuando ambos datos son válidos.</w:t>
       </w:r>
@@ -2344,22 +2747,23 @@
         <w:pStyle w:val="Listaconnmeros"/>
         <w:spacing w:after="60" w:line="240" w:lineRule="auto"/>
         <w:ind w:left="403" w:hanging="259"/>
+        <w:jc w:val="both"/>
         <w:rPr>
-          <w:lang w:val="es-US"/>
+          <w:lang w:val="es-AR"/>
         </w:rPr>
       </w:pPr>
       <w:r>
         <w:rPr>
           <w:b/>
           <w:sz w:val="20"/>
-          <w:lang w:val="es-US"/>
+          <w:lang w:val="es-AR"/>
         </w:rPr>
         <w:t xml:space="preserve">Solicitar la ruta. </w:t>
       </w:r>
       <w:r>
         <w:rPr>
           <w:sz w:val="20"/>
-          <w:lang w:val="es-US"/>
+          <w:lang w:val="es-AR"/>
         </w:rPr>
         <w:t>La aplicación consulta los cierres precargados y el servicio meteorológico simulado antes de calcular el recorrido.</w:t>
       </w:r>
@@ -2369,22 +2773,23 @@
         <w:pStyle w:val="Listaconnmeros"/>
         <w:spacing w:after="60" w:line="240" w:lineRule="auto"/>
         <w:ind w:left="403" w:hanging="259"/>
+        <w:jc w:val="both"/>
         <w:rPr>
-          <w:lang w:val="es-US"/>
+          <w:lang w:val="es-AR"/>
         </w:rPr>
       </w:pPr>
       <w:r>
         <w:rPr>
           <w:b/>
           <w:sz w:val="20"/>
-          <w:lang w:val="es-US"/>
+          <w:lang w:val="es-AR"/>
         </w:rPr>
         <w:t xml:space="preserve">Adaptar la recomendación. </w:t>
       </w:r>
       <w:r>
         <w:rPr>
           <w:sz w:val="20"/>
-          <w:lang w:val="es-US"/>
+          <w:lang w:val="es-AR"/>
         </w:rPr>
         <w:t>El motor excluye siempre los tramos cerrados. Si no llueve, prioriza la ruta más corta; si llueve, recomienda la más resguardada y mantiene disponible la alternativa más rápida.</w:t>
       </w:r>
@@ -2394,57 +2799,58 @@
         <w:pStyle w:val="Listaconnmeros"/>
         <w:spacing w:after="60" w:line="240" w:lineRule="auto"/>
         <w:ind w:left="403" w:hanging="259"/>
+        <w:jc w:val="both"/>
         <w:rPr>
-          <w:lang w:val="es-US"/>
+          <w:lang w:val="es-AR"/>
         </w:rPr>
       </w:pPr>
       <w:r>
         <w:rPr>
           <w:b/>
           <w:sz w:val="20"/>
-          <w:lang w:val="es-US"/>
+          <w:lang w:val="es-AR"/>
         </w:rPr>
         <w:t xml:space="preserve">Mostrar el recorrido. </w:t>
       </w:r>
       <w:r>
         <w:rPr>
           <w:sz w:val="20"/>
-          <w:lang w:val="es-US"/>
+          <w:lang w:val="es-AR"/>
         </w:rPr>
         <w:t>La ruta elegida se dibuja claramente sobre el mapa, con origen</w:t>
       </w:r>
       <w:r>
         <w:rPr>
           <w:sz w:val="20"/>
-          <w:lang w:val="es-US"/>
+          <w:lang w:val="es-AR"/>
         </w:rPr>
         <w:t xml:space="preserve"> y</w:t>
       </w:r>
       <w:r>
         <w:rPr>
           <w:sz w:val="20"/>
-          <w:lang w:val="es-US"/>
+          <w:lang w:val="es-AR"/>
         </w:rPr>
         <w:t xml:space="preserve"> destino</w:t>
       </w:r>
       <w:r>
         <w:rPr>
           <w:sz w:val="20"/>
-          <w:lang w:val="es-US"/>
+          <w:lang w:val="es-AR"/>
         </w:rPr>
         <w:t xml:space="preserve"> </w:t>
       </w:r>
       <w:r>
         <w:rPr>
           <w:sz w:val="20"/>
-          <w:lang w:val="es-US"/>
+          <w:lang w:val="es-AR"/>
         </w:rPr>
         <w:t>identificados</w:t>
       </w:r>
       <w:r>
         <w:rPr>
           <w:sz w:val="20"/>
-          <w:lang w:val="es-US"/>
+          <w:lang w:val="es-AR"/>
         </w:rPr>
         <w:t>.</w:t>
       </w:r>
@@ -2454,104 +2860,115 @@
         <w:pStyle w:val="Listaconnmeros"/>
         <w:spacing w:after="60" w:line="240" w:lineRule="auto"/>
         <w:ind w:left="403" w:hanging="259"/>
+        <w:jc w:val="both"/>
         <w:rPr>
-          <w:lang w:val="es-US"/>
+          <w:lang w:val="es-AR"/>
         </w:rPr>
       </w:pPr>
       <w:r>
         <w:rPr>
           <w:b/>
           <w:sz w:val="20"/>
-          <w:lang w:val="es-US"/>
+          <w:lang w:val="es-AR"/>
         </w:rPr>
         <w:t xml:space="preserve">Seguir la ruta y llegar. </w:t>
       </w:r>
       <w:r>
         <w:rPr>
           <w:sz w:val="20"/>
-          <w:lang w:val="es-US"/>
+          <w:lang w:val="es-AR"/>
         </w:rPr>
         <w:t>Una vez cargado el recorrido, permanece visible sin requerir actualizaciones continuas</w:t>
       </w:r>
       <w:r>
         <w:rPr>
           <w:sz w:val="20"/>
-          <w:lang w:val="es-US"/>
+          <w:lang w:val="es-AR"/>
         </w:rPr>
         <w:t>.</w:t>
       </w:r>
     </w:p>
     <w:p>
       <w:pPr>
-        <w:pStyle w:val="Ttulo2"/>
+        <w:pStyle w:val="Ttulo1"/>
         <w:spacing w:before="140"/>
         <w:rPr>
-          <w:lang w:val="es-US"/>
+          <w:lang w:val="es-AR"/>
         </w:rPr>
       </w:pPr>
+      <w:bookmarkStart w:id="3" w:name="_Toc239613983"/>
       <w:r>
         <w:rPr>
-          <w:lang w:val="es-US"/>
+          <w:lang w:val="es-AR"/>
         </w:rPr>
         <w:t>4. Atributos de usabilidad priorizados</w:t>
       </w:r>
+      <w:bookmarkEnd w:id="3"/>
     </w:p>
     <w:p>
       <w:pPr>
+        <w:spacing w:after="140"/>
+        <w:jc w:val="both"/>
         <w:rPr>
-          <w:lang w:val="es-US"/>
+          <w:lang w:val="es-AR"/>
         </w:rPr>
       </w:pPr>
       <w:r>
         <w:rPr>
           <w:sz w:val="20"/>
-          <w:lang w:val="es-US"/>
+          <w:lang w:val="es-AR"/>
         </w:rPr>
         <w:t>Se priorizan eficiencia, tasa de errores y facilidad de aprendizaje, porque son los atributos que inciden directamente en la hipótesis de valor y en el contexto relevado en el TP2.</w:t>
       </w:r>
     </w:p>
     <w:tbl>
       <w:tblPr>
-        <w:tblStyle w:val="Tablaconcuadrcula"/>
-        <w:tblW w:w="10389" w:type="dxa"/>
-        <w:jc w:val="center"/>
+        <w:tblW w:w="9000" w:type="dxa"/>
+        <w:tblBorders>
+          <w:top w:val="single" w:sz="4" w:space="0" w:color="auto"/>
+          <w:left w:val="single" w:sz="4" w:space="0" w:color="auto"/>
+          <w:bottom w:val="single" w:sz="4" w:space="0" w:color="auto"/>
+          <w:right w:val="single" w:sz="4" w:space="0" w:color="auto"/>
+          <w:insideH w:val="single" w:sz="4" w:space="0" w:color="auto"/>
+          <w:insideV w:val="single" w:sz="4" w:space="0" w:color="auto"/>
+        </w:tblBorders>
         <w:tblLayout w:type="fixed"/>
-        <w:tblLook w:val="04A0" w:firstRow="1" w:lastRow="0" w:firstColumn="1" w:lastColumn="0" w:noHBand="0" w:noVBand="1"/>
+        <w:tblCellMar>
+          <w:left w:w="70" w:type="dxa"/>
+          <w:right w:w="70" w:type="dxa"/>
+        </w:tblCellMar>
+        <w:tblLook w:val="0000" w:firstRow="0" w:lastRow="0" w:firstColumn="0" w:lastColumn="0" w:noHBand="0" w:noVBand="0"/>
       </w:tblPr>
       <w:tblGrid>
-        <w:gridCol w:w="2077"/>
-        <w:gridCol w:w="8312"/>
+        <w:gridCol w:w="1799"/>
+        <w:gridCol w:w="7201"/>
       </w:tblGrid>
       <w:tr>
         <w:trPr>
-          <w:jc w:val="center"/>
+          <w:cantSplit/>
+          <w:tblHeader/>
         </w:trPr>
         <w:tc>
           <w:tcPr>
-            <w:tcW w:w="2077" w:type="dxa"/>
+            <w:tcW w:w="1799" w:type="dxa"/>
             <w:tcBorders>
               <w:top w:val="single" w:sz="4" w:space="0" w:color="auto"/>
               <w:left w:val="single" w:sz="4" w:space="0" w:color="auto"/>
               <w:bottom w:val="single" w:sz="4" w:space="0" w:color="auto"/>
               <w:right w:val="single" w:sz="4" w:space="0" w:color="auto"/>
             </w:tcBorders>
-            <w:shd w:val="clear" w:color="auto" w:fill="1F4E78"/>
-            <w:tcMar>
-              <w:top w:w="75" w:type="dxa"/>
-              <w:left w:w="90" w:type="dxa"/>
-              <w:bottom w:w="75" w:type="dxa"/>
-              <w:right w:w="90" w:type="dxa"/>
-            </w:tcMar>
+            <w:shd w:val="clear" w:color="auto" w:fill="1F4E79"/>
             <w:vAlign w:val="center"/>
             <w:hideMark/>
           </w:tcPr>
           <w:p>
             <w:pPr>
-              <w:spacing w:before="100" w:after="0"/>
+              <w:spacing w:after="40"/>
             </w:pPr>
             <w:r>
               <w:rPr>
                 <w:b/>
+                <w:sz w:val="17"/>
               </w:rPr>
               <w:t>Atributo priorizado</w:t>
             </w:r>
@@ -2559,34 +2976,30 @@
         </w:tc>
         <w:tc>
           <w:tcPr>
-            <w:tcW w:w="8312" w:type="dxa"/>
+            <w:tcW w:w="7201" w:type="dxa"/>
             <w:tcBorders>
               <w:top w:val="single" w:sz="4" w:space="0" w:color="auto"/>
               <w:left w:val="single" w:sz="4" w:space="0" w:color="auto"/>
               <w:bottom w:val="single" w:sz="4" w:space="0" w:color="auto"/>
               <w:right w:val="single" w:sz="4" w:space="0" w:color="auto"/>
             </w:tcBorders>
-            <w:shd w:val="clear" w:color="auto" w:fill="1F4E78"/>
-            <w:tcMar>
-              <w:top w:w="75" w:type="dxa"/>
-              <w:left w:w="90" w:type="dxa"/>
-              <w:bottom w:w="75" w:type="dxa"/>
-              <w:right w:w="90" w:type="dxa"/>
-            </w:tcMar>
+            <w:shd w:val="clear" w:color="auto" w:fill="1F4E79"/>
             <w:vAlign w:val="center"/>
             <w:hideMark/>
           </w:tcPr>
           <w:p>
             <w:pPr>
-              <w:spacing w:before="100" w:after="0"/>
-              <w:rPr>
-                <w:lang w:val="es-US"/>
+              <w:spacing w:after="40"/>
+              <w:rPr>
+                <w:sz w:val="17"/>
+                <w:lang w:val="es-AR"/>
               </w:rPr>
             </w:pPr>
             <w:r>
               <w:rPr>
                 <w:b/>
-                <w:lang w:val="es-US"/>
+                <w:sz w:val="17"/>
+                <w:lang w:val="es-AR"/>
               </w:rPr>
               <w:t>Justificación a partir del TP2</w:t>
             </w:r>
@@ -2595,102 +3008,101 @@
       </w:tr>
       <w:tr>
         <w:trPr>
-          <w:jc w:val="center"/>
+          <w:cantSplit/>
         </w:trPr>
         <w:tc>
           <w:tcPr>
-            <w:tcW w:w="2077" w:type="dxa"/>
+            <w:tcW w:w="1799" w:type="dxa"/>
             <w:tcBorders>
               <w:top w:val="single" w:sz="4" w:space="0" w:color="auto"/>
               <w:left w:val="single" w:sz="4" w:space="0" w:color="auto"/>
               <w:bottom w:val="single" w:sz="4" w:space="0" w:color="auto"/>
               <w:right w:val="single" w:sz="4" w:space="0" w:color="auto"/>
             </w:tcBorders>
-            <w:tcMar>
-              <w:top w:w="75" w:type="dxa"/>
-              <w:left w:w="90" w:type="dxa"/>
-              <w:bottom w:w="75" w:type="dxa"/>
-              <w:right w:w="90" w:type="dxa"/>
-            </w:tcMar>
             <w:vAlign w:val="center"/>
             <w:hideMark/>
           </w:tcPr>
           <w:p>
             <w:pPr>
-              <w:spacing w:before="100" w:after="0"/>
+              <w:spacing w:after="40"/>
             </w:pPr>
+            <w:proofErr w:type="spellStart"/>
             <w:r>
               <w:rPr>
                 <w:b/>
+                <w:sz w:val="17"/>
               </w:rPr>
               <w:t>Eficiencia</w:t>
             </w:r>
+            <w:proofErr w:type="spellEnd"/>
           </w:p>
         </w:tc>
         <w:tc>
           <w:tcPr>
-            <w:tcW w:w="8312" w:type="dxa"/>
+            <w:tcW w:w="7201" w:type="dxa"/>
             <w:tcBorders>
               <w:top w:val="single" w:sz="4" w:space="0" w:color="auto"/>
               <w:left w:val="single" w:sz="4" w:space="0" w:color="auto"/>
               <w:bottom w:val="single" w:sz="4" w:space="0" w:color="auto"/>
               <w:right w:val="single" w:sz="4" w:space="0" w:color="auto"/>
             </w:tcBorders>
-            <w:tcMar>
-              <w:top w:w="75" w:type="dxa"/>
-              <w:left w:w="90" w:type="dxa"/>
-              <w:bottom w:w="75" w:type="dxa"/>
-              <w:right w:w="90" w:type="dxa"/>
-            </w:tcMar>
             <w:vAlign w:val="center"/>
             <w:hideMark/>
           </w:tcPr>
           <w:p>
             <w:pPr>
-              <w:spacing w:before="100" w:after="0"/>
-              <w:rPr>
-                <w:lang w:val="es-US"/>
+              <w:spacing w:after="40"/>
+              <w:rPr>
+                <w:sz w:val="17"/>
+                <w:lang w:val="es-AR"/>
               </w:rPr>
             </w:pPr>
             <w:r>
               <w:rPr>
-                <w:lang w:val="es-US"/>
+                <w:sz w:val="17"/>
+                <w:lang w:val="es-AR"/>
               </w:rPr>
               <w:t>Cuatro de los cinco usuarios perdieron entre cinco y diez minutos la última vez que no encontraron un destino y todos ellos llegaron tarde al menos una vez. Además, la consulta puede ocurrir antes de una clase, examen o trámite, con poco margen de tiempo</w:t>
             </w:r>
             <w:r>
               <w:rPr>
-                <w:lang w:val="es-US"/>
+                <w:sz w:val="17"/>
+                <w:lang w:val="es-AR"/>
               </w:rPr>
               <w:t xml:space="preserve">. </w:t>
             </w:r>
             <w:r>
               <w:rPr>
-                <w:lang w:val="es-US"/>
+                <w:sz w:val="17"/>
+                <w:lang w:val="es-AR"/>
               </w:rPr>
               <w:t xml:space="preserve">Por eso el recorrido debe obtenerse con pocos pasos </w:t>
             </w:r>
             <w:r>
               <w:rPr>
-                <w:lang w:val="es-US"/>
+                <w:sz w:val="17"/>
+                <w:lang w:val="es-AR"/>
               </w:rPr>
               <w:t xml:space="preserve">para el usuario </w:t>
             </w:r>
             <w:r>
               <w:rPr>
-                <w:lang w:val="es-US"/>
+                <w:sz w:val="17"/>
+                <w:lang w:val="es-AR"/>
               </w:rPr>
               <w:t xml:space="preserve">y permitir llegar </w:t>
             </w:r>
             <w:r>
               <w:rPr>
-                <w:lang w:val="es-US"/>
+                <w:sz w:val="17"/>
+                <w:lang w:val="es-AR"/>
               </w:rPr>
               <w:t>rápidamente</w:t>
             </w:r>
             <w:r>
               <w:rPr>
-                <w:lang w:val="es-US"/>
+                <w:sz w:val="17"/>
+                <w:lang w:val="es-AR"/>
               </w:rPr>
               <w:t>, como establece la hipótesis.</w:t>
             </w:r>
@@ -2699,66 +3111,66 @@
       </w:tr>
       <w:tr>
         <w:trPr>
-          <w:jc w:val="center"/>
+          <w:cantSplit/>
         </w:trPr>
         <w:tc>
           <w:tcPr>
-            <w:tcW w:w="2077" w:type="dxa"/>
+            <w:tcW w:w="1799" w:type="dxa"/>
             <w:tcBorders>
               <w:top w:val="single" w:sz="4" w:space="0" w:color="auto"/>
               <w:left w:val="single" w:sz="4" w:space="0" w:color="auto"/>
               <w:bottom w:val="single" w:sz="4" w:space="0" w:color="auto"/>
               <w:right w:val="single" w:sz="4" w:space="0" w:color="auto"/>
             </w:tcBorders>
-            <w:tcMar>
-              <w:top w:w="75" w:type="dxa"/>
-              <w:left w:w="90" w:type="dxa"/>
-              <w:bottom w:w="75" w:type="dxa"/>
-              <w:right w:w="90" w:type="dxa"/>
-            </w:tcMar>
             <w:vAlign w:val="center"/>
             <w:hideMark/>
           </w:tcPr>
           <w:p>
             <w:pPr>
-              <w:spacing w:before="100" w:after="0"/>
+              <w:spacing w:after="40"/>
             </w:pPr>
             <w:r>
               <w:rPr>
                 <w:b/>
-              </w:rPr>
-              <w:t>Tasa de errores</w:t>
+                <w:sz w:val="17"/>
+              </w:rPr>
+              <w:t xml:space="preserve">Tasa de </w:t>
             </w:r>
+            <w:proofErr w:type="spellStart"/>
+            <w:r>
+              <w:rPr>
+                <w:b/>
+                <w:sz w:val="17"/>
+              </w:rPr>
+              <w:t>errores</w:t>
+            </w:r>
+            <w:proofErr w:type="spellEnd"/>
           </w:p>
         </w:tc>
         <w:tc>
           <w:tcPr>
-            <w:tcW w:w="8312" w:type="dxa"/>
+            <w:tcW w:w="7201" w:type="dxa"/>
             <w:tcBorders>
               <w:top w:val="single" w:sz="4" w:space="0" w:color="auto"/>
               <w:left w:val="single" w:sz="4" w:space="0" w:color="auto"/>
               <w:bottom w:val="single" w:sz="4" w:space="0" w:color="auto"/>
               <w:right w:val="single" w:sz="4" w:space="0" w:color="auto"/>
             </w:tcBorders>
-            <w:tcMar>
-              <w:top w:w="75" w:type="dxa"/>
-              <w:left w:w="90" w:type="dxa"/>
-              <w:bottom w:w="75" w:type="dxa"/>
-              <w:right w:w="90" w:type="dxa"/>
-            </w:tcMar>
             <w:vAlign w:val="center"/>
             <w:hideMark/>
           </w:tcPr>
           <w:p>
             <w:pPr>
-              <w:spacing w:before="100" w:after="0"/>
-              <w:rPr>
-                <w:lang w:val="es-US"/>
+              <w:spacing w:after="40"/>
+              <w:rPr>
+                <w:sz w:val="17"/>
+                <w:lang w:val="es-AR"/>
               </w:rPr>
             </w:pPr>
             <w:r>
               <w:rPr>
-                <w:lang w:val="es-US"/>
+                <w:sz w:val="17"/>
+                <w:lang w:val="es-AR"/>
               </w:rPr>
               <w:t>Cuatro usuarios encontraron pasillos, escaleras, puertas o sectores cerrados; uno tardó bastante en hallar otra ruta y otro tuvo que preguntar. El MVP debe prevenir la selección incompleta de origen o destino y, sobre todo, evitar que la ruta conduzca por un tramo cerrado. Llegar sin pedir ayuda ni intentar usar un acceso no disponible forma parte del criterio de validación.</w:t>
             </w:r>
@@ -2767,66 +3179,75 @@
       </w:tr>
       <w:tr>
         <w:trPr>
-          <w:jc w:val="center"/>
+          <w:cantSplit/>
         </w:trPr>
         <w:tc>
           <w:tcPr>
-            <w:tcW w:w="2077" w:type="dxa"/>
+            <w:tcW w:w="1799" w:type="dxa"/>
             <w:tcBorders>
               <w:top w:val="single" w:sz="4" w:space="0" w:color="auto"/>
               <w:left w:val="single" w:sz="4" w:space="0" w:color="auto"/>
               <w:bottom w:val="single" w:sz="4" w:space="0" w:color="auto"/>
               <w:right w:val="single" w:sz="4" w:space="0" w:color="auto"/>
             </w:tcBorders>
-            <w:tcMar>
-              <w:top w:w="75" w:type="dxa"/>
-              <w:left w:w="90" w:type="dxa"/>
-              <w:bottom w:w="75" w:type="dxa"/>
-              <w:right w:w="90" w:type="dxa"/>
-            </w:tcMar>
             <w:vAlign w:val="center"/>
             <w:hideMark/>
           </w:tcPr>
           <w:p>
             <w:pPr>
-              <w:spacing w:before="100" w:after="0"/>
+              <w:spacing w:after="40"/>
             </w:pPr>
+            <w:proofErr w:type="spellStart"/>
             <w:r>
               <w:rPr>
                 <w:b/>
-              </w:rPr>
-              <w:t>Facilidad de aprendizaje</w:t>
+                <w:sz w:val="17"/>
+              </w:rPr>
+              <w:t>Facilidad</w:t>
             </w:r>
+            <w:proofErr w:type="spellEnd"/>
+            <w:r>
+              <w:rPr>
+                <w:b/>
+                <w:sz w:val="17"/>
+              </w:rPr>
+              <w:t xml:space="preserve"> de </w:t>
+            </w:r>
+            <w:proofErr w:type="spellStart"/>
+            <w:r>
+              <w:rPr>
+                <w:b/>
+                <w:sz w:val="17"/>
+              </w:rPr>
+              <w:t>aprendizaje</w:t>
+            </w:r>
+            <w:proofErr w:type="spellEnd"/>
           </w:p>
         </w:tc>
         <w:tc>
           <w:tcPr>
-            <w:tcW w:w="8312" w:type="dxa"/>
+            <w:tcW w:w="7201" w:type="dxa"/>
             <w:tcBorders>
               <w:top w:val="single" w:sz="4" w:space="0" w:color="auto"/>
               <w:left w:val="single" w:sz="4" w:space="0" w:color="auto"/>
               <w:bottom w:val="single" w:sz="4" w:space="0" w:color="auto"/>
               <w:right w:val="single" w:sz="4" w:space="0" w:color="auto"/>
             </w:tcBorders>
-            <w:tcMar>
-              <w:top w:w="75" w:type="dxa"/>
-              <w:left w:w="90" w:type="dxa"/>
-              <w:bottom w:w="75" w:type="dxa"/>
-              <w:right w:w="90" w:type="dxa"/>
-            </w:tcMar>
             <w:vAlign w:val="center"/>
             <w:hideMark/>
           </w:tcPr>
           <w:p>
             <w:pPr>
-              <w:spacing w:before="100" w:after="0"/>
-              <w:rPr>
-                <w:lang w:val="es-US"/>
+              <w:spacing w:after="40"/>
+              <w:rPr>
+                <w:sz w:val="17"/>
+                <w:lang w:val="es-AR"/>
               </w:rPr>
             </w:pPr>
             <w:r>
               <w:rPr>
-                <w:lang w:val="es-US"/>
+                <w:sz w:val="17"/>
+                <w:lang w:val="es-AR"/>
               </w:rPr>
               <w:t>El usuario primario está formado por ingresantes y estudiantes de primer año que todavía no conocen el campus. Los recursos actuales son dispersos y, ante una duda, combinan mapa institucional, carteles, web, WhatsApp, otras personas o prueba y error. La aplicación debe entenderse en el primer uso, desde el celular y sin capacitación: elegir origen, elegir destino y solicitar la ruta.</w:t>
             </w:r>
@@ -2838,7 +3259,7 @@
       <w:pPr>
         <w:spacing w:before="100" w:after="0"/>
         <w:rPr>
-          <w:lang w:val="es-US"/>
+          <w:lang w:val="es-AR"/>
         </w:rPr>
       </w:pPr>
     </w:p>
@@ -2846,9 +3267,8 @@
       <w:headerReference w:type="default" r:id="rId15"/>
       <w:footerReference w:type="default" r:id="rId16"/>
       <w:pgSz w:w="11906" w:h="16838"/>
-      <w:pgMar w:top="1304" w:right="1417" w:bottom="1020" w:left="1417" w:header="312" w:footer="340" w:gutter="0"/>
+      <w:pgMar w:top="1304" w:right="1446" w:bottom="1020" w:left="1446" w:header="312" w:footer="425" w:gutter="0"/>
       <w:cols w:space="720"/>
-      <w:titlePg/>
       <w:docGrid w:linePitch="360"/>
     </w:sectPr>
   </w:body>
@@ -2890,84 +3310,86 @@
     <w:r>
       <w:rPr>
         <w:color w:val="666666"/>
-        <w:sz w:val="18"/>
+        <w:sz w:val="17"/>
       </w:rPr>
       <w:t xml:space="preserve">Página </w:t>
     </w:r>
     <w:r>
       <w:rPr>
         <w:color w:val="666666"/>
-        <w:sz w:val="18"/>
+        <w:sz w:val="17"/>
       </w:rPr>
       <w:fldChar w:fldCharType="begin"/>
     </w:r>
     <w:r>
       <w:rPr>
         <w:color w:val="666666"/>
-        <w:sz w:val="18"/>
+        <w:sz w:val="17"/>
       </w:rPr>
       <w:instrText>PAGE</w:instrText>
     </w:r>
     <w:r>
       <w:rPr>
         <w:color w:val="666666"/>
-        <w:sz w:val="18"/>
+        <w:sz w:val="17"/>
       </w:rPr>
       <w:fldChar w:fldCharType="separate"/>
     </w:r>
     <w:r>
       <w:rPr>
+        <w:noProof/>
         <w:color w:val="666666"/>
-        <w:sz w:val="18"/>
+        <w:sz w:val="17"/>
       </w:rPr>
       <w:t>1</w:t>
     </w:r>
     <w:r>
       <w:rPr>
         <w:color w:val="666666"/>
-        <w:sz w:val="18"/>
+        <w:sz w:val="17"/>
       </w:rPr>
       <w:fldChar w:fldCharType="end"/>
     </w:r>
     <w:r>
       <w:rPr>
         <w:color w:val="666666"/>
-        <w:sz w:val="18"/>
+        <w:sz w:val="17"/>
       </w:rPr>
       <w:t xml:space="preserve"> de </w:t>
     </w:r>
     <w:r>
       <w:rPr>
         <w:color w:val="666666"/>
-        <w:sz w:val="18"/>
+        <w:sz w:val="17"/>
       </w:rPr>
       <w:fldChar w:fldCharType="begin"/>
     </w:r>
     <w:r>
       <w:rPr>
         <w:color w:val="666666"/>
-        <w:sz w:val="18"/>
+        <w:sz w:val="17"/>
       </w:rPr>
       <w:instrText>NUMPAGES</w:instrText>
     </w:r>
     <w:r>
       <w:rPr>
         <w:color w:val="666666"/>
-        <w:sz w:val="18"/>
+        <w:sz w:val="17"/>
       </w:rPr>
       <w:fldChar w:fldCharType="separate"/>
     </w:r>
     <w:r>
       <w:rPr>
+        <w:noProof/>
         <w:color w:val="666666"/>
-        <w:sz w:val="18"/>
-      </w:rPr>
-      <w:t>1</w:t>
+        <w:sz w:val="17"/>
+      </w:rPr>
+      <w:t>2</w:t>
     </w:r>
     <w:r>
       <w:rPr>
         <w:color w:val="666666"/>
-        <w:sz w:val="18"/>
+        <w:sz w:val="17"/>
       </w:rPr>
       <w:fldChar w:fldCharType="end"/>
     </w:r>
@@ -3004,32 +3426,26 @@
 <w:hdr xmlns:wpc="http://schemas.microsoft.com/office/word/2010/wordprocessingCanvas" xmlns:cx="http://schemas.microsoft.com/office/drawing/2014/chartex" xmlns:cx1="http://schemas.microsoft.com/office/drawing/2015/9/8/chartex" xmlns:cx2="http://schemas.microsoft.com/office/drawing/2015/10/21/chartex" xmlns:cx3="http://schemas.microsoft.com/office/drawing/2016/5/9/chartex" xmlns:cx4="http://schemas.microsoft.com/office/drawing/2016/5/10/chartex" xmlns:cx5="http://schemas.microsoft.com/office/drawing/2016/5/11/chartex" xmlns:cx6="http://schemas.microsoft.com/office/drawing/2016/5/12/chartex" xmlns:cx7="http://schemas.microsoft.com/office/drawing/2016/5/13/chartex" xmlns:cx8="http://schemas.microsoft.com/office/drawing/2016/5/14/chartex" xmlns:mc="http://schemas.openxmlformats.org/markup-compatibility/2006" xmlns:aink="http://schemas.microsoft.com/office/drawing/2016/ink" xmlns:am3d="http://schemas.microsoft.com/office/drawing/2017/model3d" xmlns:o="urn:schemas-microsoft-com:office:office" xmlns:oel="http://schemas.microsoft.com/office/2019/extlst" xmlns:r="http://schemas.openxmlformats.org/officeDocument/2006/relationships" xmlns:m="http://schemas.openxmlformats.org/officeDocument/2006/math" xmlns:v="urn:schemas-microsoft-com:vml" xmlns:wp14="http://schemas.microsoft.com/office/word/2010/wordprocessingDrawing" xmlns:wp="http://schemas.openxmlformats.org/drawingml/2006/wordprocessingDrawing" xmlns:w10="urn:schemas-microsoft-com:office:word" xmlns:w="http://schemas.openxmlformats.org/wordprocessingml/2006/main" xmlns:w14="http://schemas.microsoft.com/office/word/2010/wordml" xmlns:w15="http://schemas.microsoft.com/office/word/2012/wordml" xmlns:w16cex="http://schemas.microsoft.com/office/word/2018/wordml/cex" xmlns:w16cid="http://schemas.microsoft.com/office/word/2016/wordml/cid" xmlns:w16="http://schemas.microsoft.com/office/word/2018/wordml" xmlns:w16du="http://schemas.microsoft.com/office/word/2023/wordml/word16du" xmlns:w16sdtdh="http://schemas.microsoft.com/office/word/2020/wordml/sdtdatahash" xmlns:w16sdtfl="http://schemas.microsoft.com/office/word/2024/wordml/sdtformatlock" xmlns:w16se="http://schemas.microsoft.com/office/word/2015/wordml/symex" xmlns:wpg="http://schemas.microsoft.com/office/word/2010/wordprocessingGroup" xmlns:wpi="http://schemas.microsoft.com/office/word/2010/wordprocessingInk" xmlns:wne="http://schemas.microsoft.com/office/word/2006/wordml" xmlns:wps="http://schemas.microsoft.com/office/word/2010/wordprocessingShape" mc:Ignorable="w14 w15 w16se w16cid w16 w16cex w16sdtdh w16sdtfl w16du wp14">
   <w:tbl>
     <w:tblPr>
-      <w:tblW w:w="9080" w:type="dxa"/>
-      <w:tblBorders>
-        <w:top w:val="nil"/>
-        <w:left w:val="nil"/>
-        <w:bottom w:val="nil"/>
-        <w:right w:val="nil"/>
-        <w:insideH w:val="nil"/>
-        <w:insideV w:val="nil"/>
-      </w:tblBorders>
+      <w:tblW w:w="9014" w:type="dxa"/>
       <w:tblLayout w:type="fixed"/>
       <w:tblLook w:val="04A0" w:firstRow="1" w:lastRow="0" w:firstColumn="1" w:lastColumn="0" w:noHBand="0" w:noVBand="1"/>
     </w:tblPr>
     <w:tblGrid>
-      <w:gridCol w:w="900"/>
-      <w:gridCol w:w="7280"/>
-      <w:gridCol w:w="900"/>
+      <w:gridCol w:w="1247"/>
+      <w:gridCol w:w="7767"/>
     </w:tblGrid>
     <w:tr>
       <w:tc>
         <w:tcPr>
-          <w:tcW w:w="900" w:type="dxa"/>
+          <w:tcW w:w="1247" w:type="dxa"/>
+          <w:tcBorders>
+            <w:bottom w:val="single" w:sz="5" w:space="0" w:color="B7B7B7"/>
+          </w:tcBorders>
           <w:tcMar>
-            <w:top w:w="75" w:type="dxa"/>
-            <w:left w:w="110" w:type="dxa"/>
-            <w:bottom w:w="75" w:type="dxa"/>
-            <w:right w:w="110" w:type="dxa"/>
+            <w:top w:w="0" w:type="dxa"/>
+            <w:left w:w="0" w:type="dxa"/>
+            <w:bottom w:w="35" w:type="dxa"/>
+            <w:right w:w="0" w:type="dxa"/>
           </w:tcMar>
           <w:vAlign w:val="center"/>
         </w:tcPr>
@@ -3039,10 +3455,10 @@
               <w:noProof/>
             </w:rPr>
             <w:drawing>
-              <wp:inline distT="0" distB="0" distL="0" distR="0" wp14:anchorId="7EBAD934" wp14:editId="612BA869">
-                <wp:extent cx="486000" cy="486000"/>
+              <wp:inline distT="0" distB="0" distL="0" distR="0" wp14:anchorId="31368473" wp14:editId="1383EBB9">
+                <wp:extent cx="522000" cy="522000"/>
                 <wp:effectExtent l="0" t="0" r="0" b="0"/>
-                <wp:docPr id="1390571568" name="Picture 1" descr="Isologotipo de la Universidad Nacional de La Matanza" title="Isologotipo de la Universidad Nacional de La Matanza"/>
+                <wp:docPr id="1" name="Picture 1" descr="Logotipo de la Universidad Nacional de La Matanza" title="UNLaM"/>
                 <wp:cNvGraphicFramePr>
                   <a:graphicFrameLocks xmlns:a="http://schemas.openxmlformats.org/drawingml/2006/main" noChangeAspect="1"/>
                 </wp:cNvGraphicFramePr>
@@ -3050,7 +3466,7 @@
                   <a:graphicData uri="http://schemas.openxmlformats.org/drawingml/2006/picture">
                     <pic:pic xmlns:pic="http://schemas.openxmlformats.org/drawingml/2006/picture">
                       <pic:nvPicPr>
-                        <pic:cNvPr id="0" name="unlam-logo.png"/>
+                        <pic:cNvPr id="0" name="logo-unlam.png"/>
                         <pic:cNvPicPr/>
                       </pic:nvPicPr>
                       <pic:blipFill>
@@ -3062,7 +3478,7 @@
                       <pic:spPr>
                         <a:xfrm>
                           <a:off x="0" y="0"/>
-                          <a:ext cx="486000" cy="486000"/>
+                          <a:ext cx="522000" cy="522000"/>
                         </a:xfrm>
                         <a:prstGeom prst="rect">
                           <a:avLst/>
@@ -3078,82 +3494,65 @@
       </w:tc>
       <w:tc>
         <w:tcPr>
-          <w:tcW w:w="7280" w:type="dxa"/>
+          <w:tcW w:w="7767" w:type="dxa"/>
+          <w:tcBorders>
+            <w:bottom w:val="single" w:sz="5" w:space="0" w:color="B7B7B7"/>
+          </w:tcBorders>
           <w:tcMar>
-            <w:top w:w="75" w:type="dxa"/>
-            <w:left w:w="110" w:type="dxa"/>
-            <w:bottom w:w="75" w:type="dxa"/>
-            <w:right w:w="110" w:type="dxa"/>
+            <w:top w:w="0" w:type="dxa"/>
+            <w:left w:w="0" w:type="dxa"/>
+            <w:bottom w:w="35" w:type="dxa"/>
+            <w:right w:w="0" w:type="dxa"/>
           </w:tcMar>
           <w:vAlign w:val="center"/>
         </w:tcPr>
         <w:p>
           <w:pPr>
-            <w:spacing w:after="20"/>
+            <w:spacing w:after="0" w:line="240" w:lineRule="auto"/>
             <w:jc w:val="center"/>
             <w:rPr>
-              <w:lang w:val="es-US"/>
+              <w:lang w:val="es-AR"/>
             </w:rPr>
           </w:pPr>
           <w:r>
             <w:rPr>
               <w:b/>
-              <w:color w:val="1F4E78"/>
-              <w:sz w:val="22"/>
-              <w:lang w:val="es-US"/>
+              <w:color w:val="1F4E79"/>
+              <w:sz w:val="20"/>
+              <w:lang w:val="es-AR"/>
             </w:rPr>
             <w:t>UNIVERSIDAD NACIONAL DE LA MATANZA</w:t>
           </w:r>
-        </w:p>
-        <w:p>
-          <w:pPr>
-            <w:spacing w:after="0"/>
-            <w:jc w:val="center"/>
+          <w:r>
             <w:rPr>
-              <w:lang w:val="es-US"/>
+              <w:b/>
+              <w:color w:val="1F4E79"/>
+              <w:sz w:val="20"/>
+              <w:lang w:val="es-AR"/>
             </w:rPr>
-          </w:pPr>
+            <w:br/>
+          </w:r>
+          <w:r>
+            <w:rPr>
+              <w:color w:val="111111"/>
+              <w:sz w:val="17"/>
+              <w:lang w:val="es-AR"/>
+            </w:rPr>
+            <w:br/>
+          </w:r>
           <w:r>
             <w:rPr>
               <w:i/>
+              <w:color w:val="111111"/>
               <w:sz w:val="17"/>
-              <w:lang w:val="es-US"/>
+              <w:lang w:val="es-AR"/>
             </w:rPr>
             <w:t>Gestión Aplicada al Desarrollo de Software II (3665)</w:t>
           </w:r>
         </w:p>
       </w:tc>
-      <w:tc>
-        <w:tcPr>
-          <w:tcW w:w="900" w:type="dxa"/>
-          <w:tcMar>
-            <w:top w:w="75" w:type="dxa"/>
-            <w:left w:w="110" w:type="dxa"/>
-            <w:bottom w:w="75" w:type="dxa"/>
-            <w:right w:w="110" w:type="dxa"/>
-          </w:tcMar>
-        </w:tcPr>
-        <w:p>
-          <w:pPr>
-            <w:rPr>
-              <w:lang w:val="es-US"/>
-            </w:rPr>
-          </w:pPr>
-        </w:p>
-      </w:tc>
     </w:tr>
   </w:tbl>
-  <w:p>
-    <w:pPr>
-      <w:pBdr>
-        <w:bottom w:val="single" w:sz="5" w:space="2" w:color="B7B7B7"/>
-      </w:pBdr>
-      <w:spacing w:after="0"/>
-      <w:rPr>
-        <w:lang w:val="es-US"/>
-      </w:rPr>
-    </w:pPr>
-  </w:p>
 </w:hdr>
 </file>
 
@@ -3751,7 +4150,7 @@
     <w:qFormat/>
     <w:rsid w:val="00FC693F"/>
     <w:pPr>
-      <w:spacing w:after="100" w:line="259" w:lineRule="auto"/>
+      <w:spacing w:after="120" w:line="269" w:lineRule="auto"/>
     </w:pPr>
     <w:rPr>
       <w:rFonts w:ascii="Arial" w:hAnsi="Arial"/>
@@ -3769,15 +4168,15 @@
     <w:pPr>
       <w:keepNext/>
       <w:keepLines/>
-      <w:spacing w:before="200"/>
+      <w:spacing w:before="520" w:after="200"/>
       <w:outlineLvl w:val="0"/>
     </w:pPr>
     <w:rPr>
       <w:rFonts w:asciiTheme="majorHAnsi" w:eastAsiaTheme="majorEastAsia" w:hAnsiTheme="majorHAnsi" w:cstheme="majorBidi"/>
       <w:b/>
       <w:bCs/>
-      <w:color w:val="1F4E78"/>
-      <w:sz w:val="32"/>
+      <w:color w:val="1F4E79"/>
+      <w:sz w:val="31"/>
       <w:szCs w:val="28"/>
     </w:rPr>
   </w:style>
@@ -3793,15 +4192,15 @@
     <w:pPr>
       <w:keepNext/>
       <w:keepLines/>
-      <w:spacing w:before="160" w:after="80"/>
+      <w:spacing w:before="400" w:after="140"/>
       <w:outlineLvl w:val="1"/>
     </w:pPr>
     <w:rPr>
       <w:rFonts w:asciiTheme="majorHAnsi" w:eastAsiaTheme="majorEastAsia" w:hAnsiTheme="majorHAnsi" w:cstheme="majorBidi"/>
       <w:b/>
       <w:bCs/>
-      <w:color w:val="1F4E78"/>
-      <w:sz w:val="27"/>
+      <w:color w:val="1F4E79"/>
+      <w:sz w:val="25"/>
       <w:szCs w:val="26"/>
     </w:rPr>
   </w:style>
@@ -3817,15 +4216,15 @@
     <w:pPr>
       <w:keepNext/>
       <w:keepLines/>
-      <w:spacing w:before="120" w:after="60"/>
+      <w:spacing w:before="320"/>
       <w:outlineLvl w:val="2"/>
     </w:pPr>
     <w:rPr>
       <w:rFonts w:asciiTheme="majorHAnsi" w:eastAsiaTheme="majorEastAsia" w:hAnsiTheme="majorHAnsi" w:cstheme="majorBidi"/>
       <w:b/>
       <w:bCs/>
-      <w:color w:val="1F4E78"/>
-      <w:sz w:val="23"/>
+      <w:color w:val="1F4E79"/>
+      <w:sz w:val="22"/>
     </w:rPr>
   </w:style>
   <w:style w:type="paragraph" w:styleId="Ttulo4">
@@ -3841,7 +4240,7 @@
     <w:pPr>
       <w:keepNext/>
       <w:keepLines/>
-      <w:spacing w:before="200" w:after="0"/>
+      <w:spacing w:before="280" w:after="100"/>
       <w:outlineLvl w:val="3"/>
     </w:pPr>
     <w:rPr>
@@ -3866,7 +4265,7 @@
     <w:pPr>
       <w:keepNext/>
       <w:keepLines/>
-      <w:spacing w:before="200" w:after="0"/>
+      <w:spacing w:before="280" w:after="100"/>
       <w:outlineLvl w:val="4"/>
     </w:pPr>
     <w:rPr>
@@ -3887,7 +4286,7 @@
     <w:pPr>
       <w:keepNext/>
       <w:keepLines/>
-      <w:spacing w:before="200" w:after="0"/>
+      <w:spacing w:before="280" w:after="100"/>
       <w:outlineLvl w:val="5"/>
     </w:pPr>
     <w:rPr>
@@ -3971,6 +4370,7 @@
   <w:style w:type="character" w:default="1" w:styleId="Fuentedeprrafopredeter">
     <w:name w:val="Default Paragraph Font"/>
     <w:uiPriority w:val="1"/>
+    <w:semiHidden/>
     <w:unhideWhenUsed/>
   </w:style>
   <w:style w:type="table" w:default="1" w:styleId="Tablanormal">
@@ -4141,6 +4541,7 @@
       <w:numPr>
         <w:ilvl w:val="1"/>
       </w:numPr>
+      <w:spacing w:before="200"/>
     </w:pPr>
     <w:rPr>
       <w:rFonts w:asciiTheme="majorHAnsi" w:eastAsiaTheme="majorEastAsia" w:hAnsiTheme="majorHAnsi" w:cstheme="majorBidi"/>
@@ -4186,9 +4587,6 @@
     <w:uiPriority w:val="99"/>
     <w:unhideWhenUsed/>
     <w:rsid w:val="00AA1D8D"/>
-    <w:pPr>
-      <w:spacing w:after="120"/>
-    </w:pPr>
   </w:style>
   <w:style w:type="character" w:customStyle="1" w:styleId="TextoindependienteCar">
     <w:name w:val="Texto independiente Car"/>
@@ -4205,7 +4603,7 @@
     <w:unhideWhenUsed/>
     <w:rsid w:val="00AA1D8D"/>
     <w:pPr>
-      <w:spacing w:after="120" w:line="480" w:lineRule="auto"/>
+      <w:spacing w:line="480" w:lineRule="auto"/>
     </w:pPr>
   </w:style>
   <w:style w:type="character" w:customStyle="1" w:styleId="Textoindependiente2Car">
@@ -4222,9 +4620,6 @@
     <w:uiPriority w:val="99"/>
     <w:unhideWhenUsed/>
     <w:rsid w:val="00AA1D8D"/>
-    <w:pPr>
-      <w:spacing w:after="120"/>
-    </w:pPr>
     <w:rPr>
       <w:sz w:val="16"/>
       <w:szCs w:val="16"/>
@@ -4284,6 +4679,8 @@
       <w:numPr>
         <w:numId w:val="1"/>
       </w:numPr>
+      <w:spacing w:after="100"/>
+      <w:ind w:left="408" w:hanging="170"/>
       <w:contextualSpacing/>
     </w:pPr>
   </w:style>
@@ -4359,7 +4756,6 @@
     <w:unhideWhenUsed/>
     <w:rsid w:val="0029639D"/>
     <w:pPr>
-      <w:spacing w:after="120"/>
       <w:ind w:left="360"/>
       <w:contextualSpacing/>
     </w:pPr>
@@ -4371,7 +4767,6 @@
     <w:unhideWhenUsed/>
     <w:rsid w:val="0029639D"/>
     <w:pPr>
-      <w:spacing w:after="120"/>
       <w:ind w:left="720"/>
       <w:contextualSpacing/>
     </w:pPr>
@@ -4383,7 +4778,6 @@
     <w:unhideWhenUsed/>
     <w:rsid w:val="0029639D"/>
     <w:pPr>
-      <w:spacing w:after="120"/>
       <w:ind w:left="1080"/>
       <w:contextualSpacing/>
     </w:pPr>
@@ -14746,6 +15140,64 @@
         <w:shd w:val="clear" w:color="auto" w:fill="FBCAA2" w:themeFill="accent6" w:themeFillTint="7F"/>
       </w:tcPr>
     </w:tblStylePr>
+  </w:style>
+  <w:style w:type="paragraph" w:customStyle="1" w:styleId="Preguntanumerada">
+    <w:name w:val="Pregunta numerada"/>
+    <w:basedOn w:val="Ttulo2"/>
+  </w:style>
+  <w:style w:type="paragraph" w:styleId="TDC1">
+    <w:name w:val="toc 1"/>
+    <w:basedOn w:val="Normal"/>
+    <w:next w:val="Normal"/>
+    <w:uiPriority w:val="39"/>
+    <w:pPr>
+      <w:tabs>
+        <w:tab w:val="right" w:leader="dot" w:pos="9014"/>
+      </w:tabs>
+      <w:spacing w:before="120" w:after="60" w:line="240" w:lineRule="auto"/>
+    </w:pPr>
+    <w:rPr>
+      <w:b/>
+      <w:color w:val="1F4E79"/>
+    </w:rPr>
+  </w:style>
+  <w:style w:type="paragraph" w:styleId="TDC2">
+    <w:name w:val="toc 2"/>
+    <w:basedOn w:val="Normal"/>
+    <w:next w:val="Normal"/>
+    <w:uiPriority w:val="39"/>
+    <w:pPr>
+      <w:tabs>
+        <w:tab w:val="right" w:leader="dot" w:pos="9014"/>
+      </w:tabs>
+      <w:spacing w:after="60" w:line="240" w:lineRule="auto"/>
+      <w:ind w:left="284"/>
+    </w:pPr>
+    <w:rPr>
+      <w:color w:val="111111"/>
+      <w:sz w:val="20"/>
+    </w:rPr>
+  </w:style>
+  <w:style w:type="character" w:styleId="Hipervnculo">
+    <w:name w:val="Hyperlink"/>
+    <w:basedOn w:val="Fuentedeprrafopredeter"/>
+    <w:uiPriority w:val="99"/>
+    <w:rPr>
+      <w:color w:val="0000FF" w:themeColor="hyperlink"/>
+      <w:u w:val="single"/>
+    </w:rPr>
+  </w:style>
+  <w:style w:type="character" w:styleId="Mencinsinresolver">
+    <w:name w:val="Unresolved Mention"/>
+    <w:basedOn w:val="Fuentedeprrafopredeter"/>
+    <w:uiPriority w:val="99"/>
+    <w:semiHidden/>
+    <w:unhideWhenUsed/>
+    <w:rsid w:val="0033544F"/>
+    <w:rPr>
+      <w:color w:val="605E5C"/>
+      <w:shd w:val="clear" w:color="auto" w:fill="E1DFDD"/>
+    </w:rPr>
   </w:style>
 </w:styles>
 </file>

</xml_diff>

<commit_message>
Puntos 6 y 7 del TP3.
</commit_message>
<xml_diff>
--- a/docs/entregas/TP3-Summate.docx
+++ b/docs/entregas/TP3-Summate.docx
@@ -1244,7 +1244,7 @@
           <w:r>
             <w:fldChar w:fldCharType="separate"/>
           </w:r>
-          <w:hyperlink w:anchor="_Toc239613980" w:history="1">
+          <w:hyperlink w:anchor="_Toc239619579" w:history="1">
             <w:r>
               <w:rPr>
                 <w:rStyle w:val="Hipervnculo"/>
@@ -1272,7 +1272,7 @@
                 <w:noProof/>
                 <w:webHidden/>
               </w:rPr>
-              <w:instrText xml:space="preserve"> PAGEREF _Toc239613980 \h </w:instrText>
+              <w:instrText xml:space="preserve"> PAGEREF _Toc239619579 \h </w:instrText>
             </w:r>
             <w:r>
               <w:rPr>
@@ -1318,7 +1318,7 @@
               <w14:ligatures w14:val="standardContextual"/>
             </w:rPr>
           </w:pPr>
-          <w:hyperlink w:anchor="_Toc239613981" w:history="1">
+          <w:hyperlink w:anchor="_Toc239619580" w:history="1">
             <w:r>
               <w:rPr>
                 <w:rStyle w:val="Hipervnculo"/>
@@ -1346,7 +1346,7 @@
                 <w:noProof/>
                 <w:webHidden/>
               </w:rPr>
-              <w:instrText xml:space="preserve"> PAGEREF _Toc239613981 \h </w:instrText>
+              <w:instrText xml:space="preserve"> PAGEREF _Toc239619580 \h </w:instrText>
             </w:r>
             <w:r>
               <w:rPr>
@@ -1392,7 +1392,7 @@
               <w14:ligatures w14:val="standardContextual"/>
             </w:rPr>
           </w:pPr>
-          <w:hyperlink w:anchor="_Toc239613982" w:history="1">
+          <w:hyperlink w:anchor="_Toc239619581" w:history="1">
             <w:r>
               <w:rPr>
                 <w:rStyle w:val="Hipervnculo"/>
@@ -1420,7 +1420,7 @@
                 <w:noProof/>
                 <w:webHidden/>
               </w:rPr>
-              <w:instrText xml:space="preserve"> PAGEREF _Toc239613982 \h </w:instrText>
+              <w:instrText xml:space="preserve"> PAGEREF _Toc239619581 \h </w:instrText>
             </w:r>
             <w:r>
               <w:rPr>
@@ -1466,7 +1466,7 @@
               <w14:ligatures w14:val="standardContextual"/>
             </w:rPr>
           </w:pPr>
-          <w:hyperlink w:anchor="_Toc239613983" w:history="1">
+          <w:hyperlink w:anchor="_Toc239619582" w:history="1">
             <w:r>
               <w:rPr>
                 <w:rStyle w:val="Hipervnculo"/>
@@ -1494,7 +1494,81 @@
                 <w:noProof/>
                 <w:webHidden/>
               </w:rPr>
-              <w:instrText xml:space="preserve"> PAGEREF _Toc239613983 \h </w:instrText>
+              <w:instrText xml:space="preserve"> PAGEREF _Toc239619582 \h </w:instrText>
+            </w:r>
+            <w:r>
+              <w:rPr>
+                <w:noProof/>
+                <w:webHidden/>
+              </w:rPr>
+            </w:r>
+            <w:r>
+              <w:rPr>
+                <w:noProof/>
+                <w:webHidden/>
+              </w:rPr>
+              <w:fldChar w:fldCharType="separate"/>
+            </w:r>
+            <w:r>
+              <w:rPr>
+                <w:noProof/>
+                <w:webHidden/>
+              </w:rPr>
+              <w:t>4</w:t>
+            </w:r>
+            <w:r>
+              <w:rPr>
+                <w:noProof/>
+                <w:webHidden/>
+              </w:rPr>
+              <w:fldChar w:fldCharType="end"/>
+            </w:r>
+          </w:hyperlink>
+        </w:p>
+        <w:p>
+          <w:pPr>
+            <w:pStyle w:val="TDC1"/>
+            <w:rPr>
+              <w:rFonts w:asciiTheme="minorHAnsi" w:hAnsiTheme="minorHAnsi"/>
+              <w:b w:val="0"/>
+              <w:noProof/>
+              <w:color w:val="auto"/>
+              <w:kern w:val="2"/>
+              <w:sz w:val="24"/>
+              <w:szCs w:val="24"/>
+              <w:lang w:val="es-AR" w:eastAsia="es-AR"/>
+              <w14:ligatures w14:val="standardContextual"/>
+            </w:rPr>
+          </w:pPr>
+          <w:hyperlink w:anchor="_Toc239619583" w:history="1">
+            <w:r>
+              <w:rPr>
+                <w:rStyle w:val="Hipervnculo"/>
+                <w:noProof/>
+                <w:lang w:val="es-AR"/>
+              </w:rPr>
+              <w:t>6. Explorar tres alternativas de diseño</w:t>
+            </w:r>
+            <w:r>
+              <w:rPr>
+                <w:noProof/>
+                <w:webHidden/>
+              </w:rPr>
+              <w:tab/>
+            </w:r>
+            <w:r>
+              <w:rPr>
+                <w:noProof/>
+                <w:webHidden/>
+              </w:rPr>
+              <w:fldChar w:fldCharType="begin"/>
+            </w:r>
+            <w:r>
+              <w:rPr>
+                <w:noProof/>
+                <w:webHidden/>
+              </w:rPr>
+              <w:instrText xml:space="preserve"> PAGEREF _Toc239619583 \h </w:instrText>
             </w:r>
             <w:r>
               <w:rPr>
@@ -1566,7 +1640,7 @@
           <w:lang w:val="es-AR"/>
         </w:rPr>
       </w:pPr>
-      <w:bookmarkStart w:id="0" w:name="_Toc239613980"/>
+      <w:bookmarkStart w:id="0" w:name="_Toc239619579"/>
       <w:r>
         <w:rPr>
           <w:lang w:val="es-AR"/>
@@ -2124,7 +2198,7 @@
           <w:lang w:val="es-AR"/>
         </w:rPr>
       </w:pPr>
-      <w:bookmarkStart w:id="1" w:name="_Toc239613981"/>
+      <w:bookmarkStart w:id="1" w:name="_Toc239619580"/>
       <w:r>
         <w:rPr>
           <w:lang w:val="es-AR"/>
@@ -2664,7 +2738,7 @@
           <w:lang w:val="es-AR"/>
         </w:rPr>
       </w:pPr>
-      <w:bookmarkStart w:id="2" w:name="_Toc239613982"/>
+      <w:bookmarkStart w:id="2" w:name="_Toc239619581"/>
       <w:r>
         <w:rPr>
           <w:lang w:val="es-AR"/>
@@ -2831,14 +2905,7 @@
           <w:sz w:val="20"/>
           <w:lang w:val="es-AR"/>
         </w:rPr>
-        <w:t xml:space="preserve"> destino</w:t>
-      </w:r>
-      <w:r>
-        <w:rPr>
-          <w:sz w:val="20"/>
-          <w:lang w:val="es-AR"/>
-        </w:rPr>
-        <w:t xml:space="preserve"> </w:t>
+        <w:t xml:space="preserve"> destino </w:t>
       </w:r>
       <w:r>
         <w:rPr>
@@ -2896,7 +2963,7 @@
           <w:lang w:val="es-AR"/>
         </w:rPr>
       </w:pPr>
-      <w:bookmarkStart w:id="3" w:name="_Toc239613983"/>
+      <w:bookmarkStart w:id="3" w:name="_Toc239619582"/>
       <w:r>
         <w:rPr>
           <w:lang w:val="es-AR"/>
@@ -3262,6 +3329,2024 @@
           <w:lang w:val="es-AR"/>
         </w:rPr>
       </w:pPr>
+    </w:p>
+    <w:p>
+      <w:pPr>
+        <w:pStyle w:val="Ttulo1"/>
+        <w:spacing w:before="140"/>
+        <w:rPr>
+          <w:lang w:val="es-AR"/>
+        </w:rPr>
+      </w:pPr>
+      <w:bookmarkStart w:id="4" w:name="_Toc239613990"/>
+      <w:bookmarkStart w:id="5" w:name="_Toc239619583"/>
+      <w:r>
+        <w:rPr>
+          <w:lang w:val="es-AR"/>
+        </w:rPr>
+        <w:t>6. Explorar tres alternativas de diseño</w:t>
+      </w:r>
+      <w:bookmarkEnd w:id="4"/>
+      <w:bookmarkEnd w:id="5"/>
+    </w:p>
+    <w:tbl>
+      <w:tblPr>
+        <w:tblW w:w="9000" w:type="dxa"/>
+        <w:tblBorders>
+          <w:top w:val="single" w:sz="4" w:space="0" w:color="auto"/>
+          <w:left w:val="single" w:sz="4" w:space="0" w:color="auto"/>
+          <w:bottom w:val="single" w:sz="4" w:space="0" w:color="auto"/>
+          <w:right w:val="single" w:sz="4" w:space="0" w:color="auto"/>
+          <w:insideH w:val="single" w:sz="4" w:space="0" w:color="auto"/>
+          <w:insideV w:val="single" w:sz="4" w:space="0" w:color="auto"/>
+        </w:tblBorders>
+        <w:tblLayout w:type="fixed"/>
+        <w:tblCellMar>
+          <w:left w:w="70" w:type="dxa"/>
+          <w:right w:w="70" w:type="dxa"/>
+        </w:tblCellMar>
+        <w:tblLook w:val="0000" w:firstRow="0" w:lastRow="0" w:firstColumn="0" w:lastColumn="0" w:noHBand="0" w:noVBand="0"/>
+      </w:tblPr>
+      <w:tblGrid>
+        <w:gridCol w:w="1870"/>
+        <w:gridCol w:w="3000"/>
+        <w:gridCol w:w="2130"/>
+        <w:gridCol w:w="2000"/>
+      </w:tblGrid>
+      <w:tr>
+        <w:trPr>
+          <w:cantSplit/>
+          <w:tblHeader/>
+        </w:trPr>
+        <w:tc>
+          <w:tcPr>
+            <w:tcW w:w="1870" w:type="dxa"/>
+            <w:tcBorders>
+              <w:top w:val="single" w:sz="4" w:space="0" w:color="auto"/>
+              <w:left w:val="single" w:sz="4" w:space="0" w:color="auto"/>
+              <w:bottom w:val="single" w:sz="4" w:space="0" w:color="auto"/>
+              <w:right w:val="single" w:sz="4" w:space="0" w:color="auto"/>
+            </w:tcBorders>
+            <w:shd w:val="clear" w:color="auto" w:fill="1F4E79"/>
+            <w:vAlign w:val="center"/>
+          </w:tcPr>
+          <w:p>
+            <w:pPr>
+              <w:spacing w:after="40"/>
+              <w:rPr>
+                <w:b/>
+                <w:color w:val="FFFFFF"/>
+                <w:sz w:val="17"/>
+                <w:lang w:val="es-AR"/>
+              </w:rPr>
+            </w:pPr>
+            <w:r>
+              <w:rPr>
+                <w:b/>
+                <w:color w:val="FFFFFF"/>
+                <w:sz w:val="17"/>
+                <w:lang w:val="es-AR"/>
+              </w:rPr>
+              <w:t>Alternativa</w:t>
+            </w:r>
+          </w:p>
+        </w:tc>
+        <w:tc>
+          <w:tcPr>
+            <w:tcW w:w="3000" w:type="dxa"/>
+            <w:tcBorders>
+              <w:top w:val="single" w:sz="4" w:space="0" w:color="auto"/>
+              <w:left w:val="single" w:sz="4" w:space="0" w:color="auto"/>
+              <w:bottom w:val="single" w:sz="4" w:space="0" w:color="auto"/>
+              <w:right w:val="single" w:sz="4" w:space="0" w:color="auto"/>
+            </w:tcBorders>
+            <w:shd w:val="clear" w:color="auto" w:fill="1F4E79"/>
+            <w:vAlign w:val="center"/>
+          </w:tcPr>
+          <w:p>
+            <w:pPr>
+              <w:spacing w:after="40"/>
+              <w:rPr>
+                <w:b/>
+                <w:color w:val="FFFFFF"/>
+                <w:sz w:val="17"/>
+                <w:lang w:val="es-AR"/>
+              </w:rPr>
+            </w:pPr>
+            <w:r>
+              <w:rPr>
+                <w:b/>
+                <w:color w:val="FFFFFF"/>
+                <w:sz w:val="17"/>
+                <w:lang w:val="es-AR"/>
+              </w:rPr>
+              <w:t>Principio y decisiones estructurales</w:t>
+            </w:r>
+          </w:p>
+        </w:tc>
+        <w:tc>
+          <w:tcPr>
+            <w:tcW w:w="2130" w:type="dxa"/>
+            <w:tcBorders>
+              <w:top w:val="single" w:sz="4" w:space="0" w:color="auto"/>
+              <w:left w:val="single" w:sz="4" w:space="0" w:color="auto"/>
+              <w:bottom w:val="single" w:sz="4" w:space="0" w:color="auto"/>
+              <w:right w:val="single" w:sz="4" w:space="0" w:color="auto"/>
+            </w:tcBorders>
+            <w:shd w:val="clear" w:color="auto" w:fill="1F4E79"/>
+            <w:vAlign w:val="center"/>
+          </w:tcPr>
+          <w:p>
+            <w:pPr>
+              <w:spacing w:after="40"/>
+              <w:rPr>
+                <w:b/>
+                <w:color w:val="FFFFFF"/>
+                <w:sz w:val="17"/>
+                <w:lang w:val="es-AR"/>
+              </w:rPr>
+            </w:pPr>
+            <w:r>
+              <w:rPr>
+                <w:b/>
+                <w:color w:val="FFFFFF"/>
+                <w:sz w:val="17"/>
+                <w:lang w:val="es-AR"/>
+              </w:rPr>
+              <w:t>Pantallas principales (en orden)</w:t>
+            </w:r>
+          </w:p>
+        </w:tc>
+        <w:tc>
+          <w:tcPr>
+            <w:tcW w:w="2000" w:type="dxa"/>
+            <w:tcBorders>
+              <w:top w:val="single" w:sz="4" w:space="0" w:color="auto"/>
+              <w:left w:val="single" w:sz="4" w:space="0" w:color="auto"/>
+              <w:bottom w:val="single" w:sz="4" w:space="0" w:color="auto"/>
+              <w:right w:val="single" w:sz="4" w:space="0" w:color="auto"/>
+            </w:tcBorders>
+            <w:shd w:val="clear" w:color="auto" w:fill="1F4E79"/>
+            <w:vAlign w:val="center"/>
+          </w:tcPr>
+          <w:p>
+            <w:pPr>
+              <w:spacing w:after="40"/>
+              <w:rPr>
+                <w:b/>
+                <w:color w:val="FFFFFF"/>
+                <w:sz w:val="17"/>
+                <w:lang w:val="es-AR"/>
+              </w:rPr>
+            </w:pPr>
+            <w:r>
+              <w:rPr>
+                <w:b/>
+                <w:color w:val="FFFFFF"/>
+                <w:sz w:val="17"/>
+                <w:lang w:val="es-AR"/>
+              </w:rPr>
+              <w:t>Qué gana y qué resigna</w:t>
+            </w:r>
+          </w:p>
+        </w:tc>
+      </w:tr>
+      <w:tr>
+        <w:trPr>
+          <w:cantSplit/>
+        </w:trPr>
+        <w:tc>
+          <w:tcPr>
+            <w:tcW w:w="1870" w:type="dxa"/>
+            <w:tcBorders>
+              <w:top w:val="single" w:sz="4" w:space="0" w:color="auto"/>
+              <w:left w:val="single" w:sz="4" w:space="0" w:color="auto"/>
+              <w:bottom w:val="single" w:sz="4" w:space="0" w:color="auto"/>
+              <w:right w:val="single" w:sz="4" w:space="0" w:color="auto"/>
+            </w:tcBorders>
+          </w:tcPr>
+          <w:p>
+            <w:pPr>
+              <w:spacing w:after="40"/>
+              <w:rPr>
+                <w:sz w:val="17"/>
+                <w:lang w:val="es-AR"/>
+              </w:rPr>
+            </w:pPr>
+            <w:r>
+              <w:rPr>
+                <w:b/>
+                <w:sz w:val="17"/>
+                <w:lang w:val="es-AR"/>
+              </w:rPr>
+              <w:t>A — Facilidad de aprendizaje</w:t>
+            </w:r>
+          </w:p>
+          <w:p>
+            <w:pPr>
+              <w:spacing w:after="20"/>
+              <w:rPr>
+                <w:sz w:val="17"/>
+                <w:lang w:val="es-AR"/>
+              </w:rPr>
+            </w:pPr>
+            <w:r>
+              <w:rPr>
+                <w:sz w:val="17"/>
+                <w:lang w:val="es-AR"/>
+              </w:rPr>
+              <w:t>Asistente de 3 pasos</w:t>
+            </w:r>
+          </w:p>
+          <w:p>
+            <w:pPr>
+              <w:spacing w:after="40"/>
+              <w:rPr>
+                <w:sz w:val="17"/>
+                <w:lang w:val="es-AR"/>
+              </w:rPr>
+            </w:pPr>
+            <w:r>
+              <w:rPr>
+                <w:sz w:val="17"/>
+                <w:lang w:val="es-AR"/>
+              </w:rPr>
+              <w:t>5 pantallas · ~7 toques hasta ver la ruta</w:t>
+            </w:r>
+          </w:p>
+        </w:tc>
+        <w:tc>
+          <w:tcPr>
+            <w:tcW w:w="3000" w:type="dxa"/>
+            <w:tcBorders>
+              <w:top w:val="single" w:sz="4" w:space="0" w:color="auto"/>
+              <w:left w:val="single" w:sz="4" w:space="0" w:color="auto"/>
+              <w:bottom w:val="single" w:sz="4" w:space="0" w:color="auto"/>
+              <w:right w:val="single" w:sz="4" w:space="0" w:color="auto"/>
+            </w:tcBorders>
+          </w:tcPr>
+          <w:p>
+            <w:pPr>
+              <w:spacing w:after="40"/>
+              <w:rPr>
+                <w:sz w:val="17"/>
+                <w:lang w:val="es-AR"/>
+              </w:rPr>
+            </w:pPr>
+            <w:r>
+              <w:rPr>
+                <w:sz w:val="17"/>
+                <w:lang w:val="es-AR"/>
+              </w:rPr>
+              <w:t>Una decisión por pantalla, enunciada como pregunta y con el camino de vuelta siempre disponible.</w:t>
+            </w:r>
+          </w:p>
+          <w:p>
+            <w:pPr>
+              <w:spacing w:after="20"/>
+              <w:rPr>
+                <w:sz w:val="17"/>
+                <w:lang w:val="es-AR"/>
+              </w:rPr>
+            </w:pPr>
+            <w:r>
+              <w:rPr>
+                <w:sz w:val="17"/>
+                <w:lang w:val="es-AR"/>
+              </w:rPr>
+              <w:t>• Bienvenida que explica los tres pasos antes de pedir el primer dato.</w:t>
+            </w:r>
+          </w:p>
+          <w:p>
+            <w:pPr>
+              <w:spacing w:after="20"/>
+              <w:rPr>
+                <w:sz w:val="17"/>
+                <w:lang w:val="es-AR"/>
+              </w:rPr>
+            </w:pPr>
+            <w:r>
+              <w:rPr>
+                <w:sz w:val="17"/>
+                <w:lang w:val="es-AR"/>
+              </w:rPr>
+              <w:t>• Origen y destino en pantallas separadas, con progreso visible y lista de lugares de ejemplo.</w:t>
+            </w:r>
+          </w:p>
+          <w:p>
+            <w:pPr>
+              <w:spacing w:after="20"/>
+              <w:rPr>
+                <w:sz w:val="17"/>
+                <w:lang w:val="es-AR"/>
+              </w:rPr>
+            </w:pPr>
+            <w:r>
+              <w:rPr>
+                <w:sz w:val="17"/>
+                <w:lang w:val="es-AR"/>
+              </w:rPr>
+              <w:t>• Pantalla de revisión que anticipa qué va a tener en cuenta el cálculo.</w:t>
+            </w:r>
+          </w:p>
+          <w:p>
+            <w:pPr>
+              <w:spacing w:after="20"/>
+              <w:rPr>
+                <w:sz w:val="17"/>
+                <w:lang w:val="es-AR"/>
+              </w:rPr>
+            </w:pPr>
+            <w:r>
+              <w:rPr>
+                <w:sz w:val="17"/>
+                <w:lang w:val="es-AR"/>
+              </w:rPr>
+              <w:t>• El resultado explica en palabras qué camino eligió y por qué.</w:t>
+            </w:r>
+          </w:p>
+        </w:tc>
+        <w:tc>
+          <w:tcPr>
+            <w:tcW w:w="2130" w:type="dxa"/>
+            <w:tcBorders>
+              <w:top w:val="single" w:sz="4" w:space="0" w:color="auto"/>
+              <w:left w:val="single" w:sz="4" w:space="0" w:color="auto"/>
+              <w:bottom w:val="single" w:sz="4" w:space="0" w:color="auto"/>
+              <w:right w:val="single" w:sz="4" w:space="0" w:color="auto"/>
+            </w:tcBorders>
+          </w:tcPr>
+          <w:p>
+            <w:pPr>
+              <w:spacing w:after="20"/>
+              <w:rPr>
+                <w:sz w:val="17"/>
+                <w:lang w:val="es-AR"/>
+              </w:rPr>
+            </w:pPr>
+            <w:r>
+              <w:rPr>
+                <w:sz w:val="17"/>
+                <w:lang w:val="es-AR"/>
+              </w:rPr>
+              <w:t>A1 Bienvenida  →</w:t>
+            </w:r>
+          </w:p>
+          <w:p>
+            <w:pPr>
+              <w:spacing w:after="20"/>
+              <w:rPr>
+                <w:sz w:val="17"/>
+                <w:lang w:val="es-AR"/>
+              </w:rPr>
+            </w:pPr>
+            <w:r>
+              <w:rPr>
+                <w:sz w:val="17"/>
+                <w:lang w:val="es-AR"/>
+              </w:rPr>
+              <w:t>A2 ¿Desde dónde salís?  →</w:t>
+            </w:r>
+          </w:p>
+          <w:p>
+            <w:pPr>
+              <w:spacing w:after="20"/>
+              <w:rPr>
+                <w:sz w:val="17"/>
+                <w:lang w:val="es-AR"/>
+              </w:rPr>
+            </w:pPr>
+            <w:r>
+              <w:rPr>
+                <w:sz w:val="17"/>
+                <w:lang w:val="es-AR"/>
+              </w:rPr>
+              <w:t>A3 ¿A dónde vas?  →</w:t>
+            </w:r>
+          </w:p>
+          <w:p>
+            <w:pPr>
+              <w:spacing w:after="20"/>
+              <w:rPr>
+                <w:sz w:val="17"/>
+                <w:lang w:val="es-AR"/>
+              </w:rPr>
+            </w:pPr>
+            <w:r>
+              <w:rPr>
+                <w:sz w:val="17"/>
+                <w:lang w:val="es-AR"/>
+              </w:rPr>
+              <w:t>A4 Revisá el recorrido  →</w:t>
+            </w:r>
+          </w:p>
+          <w:p>
+            <w:pPr>
+              <w:spacing w:after="20"/>
+              <w:rPr>
+                <w:sz w:val="17"/>
+                <w:lang w:val="es-AR"/>
+              </w:rPr>
+            </w:pPr>
+            <w:r>
+              <w:rPr>
+                <w:sz w:val="17"/>
+                <w:lang w:val="es-AR"/>
+              </w:rPr>
+              <w:t>A5 El camino en el mapa</w:t>
+            </w:r>
+          </w:p>
+        </w:tc>
+        <w:tc>
+          <w:tcPr>
+            <w:tcW w:w="2000" w:type="dxa"/>
+            <w:tcBorders>
+              <w:top w:val="single" w:sz="4" w:space="0" w:color="auto"/>
+              <w:left w:val="single" w:sz="4" w:space="0" w:color="auto"/>
+              <w:bottom w:val="single" w:sz="4" w:space="0" w:color="auto"/>
+              <w:right w:val="single" w:sz="4" w:space="0" w:color="auto"/>
+            </w:tcBorders>
+          </w:tcPr>
+          <w:p>
+            <w:pPr>
+              <w:spacing w:after="40"/>
+              <w:rPr>
+                <w:sz w:val="17"/>
+                <w:lang w:val="es-AR"/>
+              </w:rPr>
+            </w:pPr>
+            <w:r>
+              <w:rPr>
+                <w:b/>
+                <w:sz w:val="17"/>
+                <w:lang w:val="es-AR"/>
+              </w:rPr>
+              <w:t xml:space="preserve">Gana: </w:t>
+            </w:r>
+            <w:r>
+              <w:rPr>
+                <w:sz w:val="17"/>
+                <w:lang w:val="es-AR"/>
+              </w:rPr>
+              <w:t>Se entiende en el primer uso, sin explicación previa.</w:t>
+            </w:r>
+          </w:p>
+          <w:p>
+            <w:pPr>
+              <w:spacing w:after="40"/>
+              <w:rPr>
+                <w:sz w:val="17"/>
+                <w:lang w:val="es-AR"/>
+              </w:rPr>
+            </w:pPr>
+            <w:r>
+              <w:rPr>
+                <w:b/>
+                <w:sz w:val="17"/>
+                <w:lang w:val="es-AR"/>
+              </w:rPr>
+              <w:t xml:space="preserve">Resigna: </w:t>
+            </w:r>
+            <w:r>
+              <w:rPr>
+                <w:sz w:val="17"/>
+                <w:lang w:val="es-AR"/>
+              </w:rPr>
+              <w:t>A partir de la segunda consulta el recorrido se vuelve largo.</w:t>
+            </w:r>
+          </w:p>
+        </w:tc>
+      </w:tr>
+      <w:tr>
+        <w:trPr>
+          <w:cantSplit/>
+        </w:trPr>
+        <w:tc>
+          <w:tcPr>
+            <w:tcW w:w="1870" w:type="dxa"/>
+            <w:tcBorders>
+              <w:top w:val="single" w:sz="4" w:space="0" w:color="auto"/>
+              <w:left w:val="single" w:sz="4" w:space="0" w:color="auto"/>
+              <w:bottom w:val="single" w:sz="4" w:space="0" w:color="auto"/>
+              <w:right w:val="single" w:sz="4" w:space="0" w:color="auto"/>
+            </w:tcBorders>
+          </w:tcPr>
+          <w:p>
+            <w:pPr>
+              <w:spacing w:after="40"/>
+              <w:rPr>
+                <w:sz w:val="17"/>
+                <w:lang w:val="es-AR"/>
+              </w:rPr>
+            </w:pPr>
+            <w:r>
+              <w:rPr>
+                <w:b/>
+                <w:sz w:val="17"/>
+                <w:lang w:val="es-AR"/>
+              </w:rPr>
+              <w:lastRenderedPageBreak/>
+              <w:t>B — Eficiencia</w:t>
+            </w:r>
+          </w:p>
+          <w:p>
+            <w:pPr>
+              <w:spacing w:after="20"/>
+              <w:rPr>
+                <w:sz w:val="17"/>
+                <w:lang w:val="es-AR"/>
+              </w:rPr>
+            </w:pPr>
+            <w:r>
+              <w:rPr>
+                <w:sz w:val="17"/>
+                <w:lang w:val="es-AR"/>
+              </w:rPr>
+              <w:t>Mapa único con panel</w:t>
+            </w:r>
+          </w:p>
+          <w:p>
+            <w:pPr>
+              <w:spacing w:after="40"/>
+              <w:rPr>
+                <w:sz w:val="17"/>
+                <w:lang w:val="es-AR"/>
+              </w:rPr>
+            </w:pPr>
+            <w:r>
+              <w:rPr>
+                <w:sz w:val="17"/>
+                <w:lang w:val="es-AR"/>
+              </w:rPr>
+              <w:t>2 pantallas · ~2 toques hasta ver la ruta</w:t>
+            </w:r>
+          </w:p>
+        </w:tc>
+        <w:tc>
+          <w:tcPr>
+            <w:tcW w:w="3000" w:type="dxa"/>
+            <w:tcBorders>
+              <w:top w:val="single" w:sz="4" w:space="0" w:color="auto"/>
+              <w:left w:val="single" w:sz="4" w:space="0" w:color="auto"/>
+              <w:bottom w:val="single" w:sz="4" w:space="0" w:color="auto"/>
+              <w:right w:val="single" w:sz="4" w:space="0" w:color="auto"/>
+            </w:tcBorders>
+          </w:tcPr>
+          <w:p>
+            <w:pPr>
+              <w:spacing w:after="40"/>
+              <w:rPr>
+                <w:sz w:val="17"/>
+                <w:lang w:val="es-AR"/>
+              </w:rPr>
+            </w:pPr>
+            <w:r>
+              <w:rPr>
+                <w:sz w:val="17"/>
+                <w:lang w:val="es-AR"/>
+              </w:rPr>
+              <w:t>Todo ocurre sobre el mapa: el sistema asume lo más probable y el usuario corrige si hace falta.</w:t>
+            </w:r>
+          </w:p>
+          <w:p>
+            <w:pPr>
+              <w:spacing w:after="20"/>
+              <w:rPr>
+                <w:sz w:val="17"/>
+                <w:lang w:val="es-AR"/>
+              </w:rPr>
+            </w:pPr>
+            <w:r>
+              <w:rPr>
+                <w:sz w:val="17"/>
+                <w:lang w:val="es-AR"/>
+              </w:rPr>
+              <w:t>• Mapa a pantalla completa, con los controles flotando encima.</w:t>
+            </w:r>
+          </w:p>
+          <w:p>
+            <w:pPr>
+              <w:spacing w:after="20"/>
+              <w:rPr>
+                <w:sz w:val="17"/>
+                <w:lang w:val="es-AR"/>
+              </w:rPr>
+            </w:pPr>
+            <w:r>
+              <w:rPr>
+                <w:sz w:val="17"/>
+                <w:lang w:val="es-AR"/>
+              </w:rPr>
+              <w:t>• Origen precargado con el último usado: sólo hace falta tocar el destino.</w:t>
+            </w:r>
+          </w:p>
+          <w:p>
+            <w:pPr>
+              <w:spacing w:after="20"/>
+              <w:rPr>
+                <w:sz w:val="17"/>
+                <w:lang w:val="es-AR"/>
+              </w:rPr>
+            </w:pPr>
+            <w:r>
+              <w:rPr>
+                <w:sz w:val="17"/>
+                <w:lang w:val="es-AR"/>
+              </w:rPr>
+              <w:t>• Últimos destinos consultados siempre a la vista, como atajo.</w:t>
+            </w:r>
+          </w:p>
+          <w:p>
+            <w:pPr>
+              <w:spacing w:after="20"/>
+              <w:rPr>
+                <w:sz w:val="17"/>
+                <w:lang w:val="es-AR"/>
+              </w:rPr>
+            </w:pPr>
+            <w:r>
+              <w:rPr>
+                <w:sz w:val="17"/>
+                <w:lang w:val="es-AR"/>
+              </w:rPr>
+              <w:t>• La ruta se calcula sola y aparece en el mismo panel; pasar de techado a más corto es un toque.</w:t>
+            </w:r>
+          </w:p>
+        </w:tc>
+        <w:tc>
+          <w:tcPr>
+            <w:tcW w:w="2130" w:type="dxa"/>
+            <w:tcBorders>
+              <w:top w:val="single" w:sz="4" w:space="0" w:color="auto"/>
+              <w:left w:val="single" w:sz="4" w:space="0" w:color="auto"/>
+              <w:bottom w:val="single" w:sz="4" w:space="0" w:color="auto"/>
+              <w:right w:val="single" w:sz="4" w:space="0" w:color="auto"/>
+            </w:tcBorders>
+          </w:tcPr>
+          <w:p>
+            <w:pPr>
+              <w:spacing w:after="20"/>
+              <w:rPr>
+                <w:sz w:val="17"/>
+                <w:lang w:val="es-AR"/>
+              </w:rPr>
+            </w:pPr>
+            <w:r>
+              <w:rPr>
+                <w:sz w:val="17"/>
+                <w:lang w:val="es-AR"/>
+              </w:rPr>
+              <w:t>B1 Pantalla única  →</w:t>
+            </w:r>
+          </w:p>
+          <w:p>
+            <w:pPr>
+              <w:spacing w:after="20"/>
+              <w:rPr>
+                <w:sz w:val="17"/>
+                <w:lang w:val="es-AR"/>
+              </w:rPr>
+            </w:pPr>
+            <w:r>
+              <w:rPr>
+                <w:sz w:val="17"/>
+                <w:lang w:val="es-AR"/>
+              </w:rPr>
+              <w:t>B2 Resultado en el mismo lugar</w:t>
+            </w:r>
+          </w:p>
+        </w:tc>
+        <w:tc>
+          <w:tcPr>
+            <w:tcW w:w="2000" w:type="dxa"/>
+            <w:tcBorders>
+              <w:top w:val="single" w:sz="4" w:space="0" w:color="auto"/>
+              <w:left w:val="single" w:sz="4" w:space="0" w:color="auto"/>
+              <w:bottom w:val="single" w:sz="4" w:space="0" w:color="auto"/>
+              <w:right w:val="single" w:sz="4" w:space="0" w:color="auto"/>
+            </w:tcBorders>
+          </w:tcPr>
+          <w:p>
+            <w:pPr>
+              <w:spacing w:after="40"/>
+              <w:rPr>
+                <w:sz w:val="17"/>
+                <w:lang w:val="es-AR"/>
+              </w:rPr>
+            </w:pPr>
+            <w:r>
+              <w:rPr>
+                <w:b/>
+                <w:sz w:val="17"/>
+                <w:lang w:val="es-AR"/>
+              </w:rPr>
+              <w:t xml:space="preserve">Gana: </w:t>
+            </w:r>
+            <w:r>
+              <w:rPr>
+                <w:sz w:val="17"/>
+                <w:lang w:val="es-AR"/>
+              </w:rPr>
+              <w:t>Resuelve la consulta apurada, antes de una clase o un examen.</w:t>
+            </w:r>
+          </w:p>
+          <w:p>
+            <w:pPr>
+              <w:spacing w:after="40"/>
+              <w:rPr>
+                <w:sz w:val="17"/>
+                <w:lang w:val="es-AR"/>
+              </w:rPr>
+            </w:pPr>
+            <w:r>
+              <w:rPr>
+                <w:b/>
+                <w:sz w:val="17"/>
+                <w:lang w:val="es-AR"/>
+              </w:rPr>
+              <w:t xml:space="preserve">Resigna: </w:t>
+            </w:r>
+            <w:r>
+              <w:rPr>
+                <w:sz w:val="17"/>
+                <w:lang w:val="es-AR"/>
+              </w:rPr>
+              <w:t>Exige leer el mapa y los íconos, y un dato mal elegido se descubre recién en el resultado.</w:t>
+            </w:r>
+          </w:p>
+        </w:tc>
+      </w:tr>
+      <w:tr>
+        <w:trPr>
+          <w:cantSplit/>
+        </w:trPr>
+        <w:tc>
+          <w:tcPr>
+            <w:tcW w:w="1870" w:type="dxa"/>
+            <w:tcBorders>
+              <w:top w:val="single" w:sz="4" w:space="0" w:color="auto"/>
+              <w:left w:val="single" w:sz="4" w:space="0" w:color="auto"/>
+              <w:bottom w:val="single" w:sz="4" w:space="0" w:color="auto"/>
+              <w:right w:val="single" w:sz="4" w:space="0" w:color="auto"/>
+            </w:tcBorders>
+          </w:tcPr>
+          <w:p>
+            <w:pPr>
+              <w:spacing w:after="40"/>
+              <w:rPr>
+                <w:sz w:val="17"/>
+                <w:lang w:val="es-AR"/>
+              </w:rPr>
+            </w:pPr>
+            <w:r>
+              <w:rPr>
+                <w:b/>
+                <w:sz w:val="17"/>
+                <w:lang w:val="es-AR"/>
+              </w:rPr>
+              <w:t>C — Prevención de errores</w:t>
+            </w:r>
+          </w:p>
+          <w:p>
+            <w:pPr>
+              <w:spacing w:after="20"/>
+              <w:rPr>
+                <w:sz w:val="17"/>
+                <w:lang w:val="es-AR"/>
+              </w:rPr>
+            </w:pPr>
+            <w:r>
+              <w:rPr>
+                <w:sz w:val="17"/>
+                <w:lang w:val="es-AR"/>
+              </w:rPr>
+              <w:t>Confirmación en los puntos críticos</w:t>
+            </w:r>
+          </w:p>
+          <w:p>
+            <w:pPr>
+              <w:spacing w:after="40"/>
+              <w:rPr>
+                <w:sz w:val="17"/>
+                <w:lang w:val="es-AR"/>
+              </w:rPr>
+            </w:pPr>
+            <w:r>
+              <w:rPr>
+                <w:sz w:val="17"/>
+                <w:lang w:val="es-AR"/>
+              </w:rPr>
+              <w:t>5 pantallas · ~4 toques hasta ver la ruta</w:t>
+            </w:r>
+          </w:p>
+        </w:tc>
+        <w:tc>
+          <w:tcPr>
+            <w:tcW w:w="3000" w:type="dxa"/>
+            <w:tcBorders>
+              <w:top w:val="single" w:sz="4" w:space="0" w:color="auto"/>
+              <w:left w:val="single" w:sz="4" w:space="0" w:color="auto"/>
+              <w:bottom w:val="single" w:sz="4" w:space="0" w:color="auto"/>
+              <w:right w:val="single" w:sz="4" w:space="0" w:color="auto"/>
+            </w:tcBorders>
+          </w:tcPr>
+          <w:p>
+            <w:pPr>
+              <w:spacing w:after="40"/>
+              <w:rPr>
+                <w:sz w:val="17"/>
+                <w:lang w:val="es-AR"/>
+              </w:rPr>
+            </w:pPr>
+            <w:r>
+              <w:rPr>
+                <w:sz w:val="17"/>
+                <w:lang w:val="es-AR"/>
+              </w:rPr>
+              <w:t>La confirmación se reserva para las decisiones que cambian el camino; el resto del flujo avanza sin preguntar.</w:t>
+            </w:r>
+          </w:p>
+          <w:p>
+            <w:pPr>
+              <w:spacing w:after="20"/>
+              <w:rPr>
+                <w:sz w:val="17"/>
+                <w:lang w:val="es-AR"/>
+              </w:rPr>
+            </w:pPr>
+            <w:r>
+              <w:rPr>
+                <w:sz w:val="17"/>
+                <w:lang w:val="es-AR"/>
+              </w:rPr>
+              <w:t>• Las pantallas de carga y de resultado son las mismas que en las otras alternativas.</w:t>
+            </w:r>
+          </w:p>
+          <w:p>
+            <w:pPr>
+              <w:spacing w:after="20"/>
+              <w:rPr>
+                <w:sz w:val="17"/>
+                <w:lang w:val="es-AR"/>
+              </w:rPr>
+            </w:pPr>
+            <w:r>
+              <w:rPr>
+                <w:sz w:val="17"/>
+                <w:lang w:val="es-AR"/>
+              </w:rPr>
+              <w:t>• Elegir origen o destino no interrumpe: eso se corrige volviendo atrás.</w:t>
+            </w:r>
+          </w:p>
+          <w:p>
+            <w:pPr>
+              <w:spacing w:after="20"/>
+              <w:rPr>
+                <w:sz w:val="17"/>
+                <w:lang w:val="es-AR"/>
+              </w:rPr>
+            </w:pPr>
+            <w:r>
+              <w:rPr>
+                <w:sz w:val="17"/>
+                <w:lang w:val="es-AR"/>
+              </w:rPr>
+              <w:t>• Sólo se confirman el criterio con lluvia y el descarte de una ruta ya calculada.</w:t>
+            </w:r>
+          </w:p>
+          <w:p>
+            <w:pPr>
+              <w:spacing w:after="20"/>
+              <w:rPr>
+                <w:sz w:val="17"/>
+                <w:lang w:val="es-AR"/>
+              </w:rPr>
+            </w:pPr>
+            <w:r>
+              <w:rPr>
+                <w:sz w:val="17"/>
+                <w:lang w:val="es-AR"/>
+              </w:rPr>
+              <w:t>• La pregunta va sola y el costo está en las respuestas: «techado, 6 min» o «más corto, 4 min y me mojo».</w:t>
+            </w:r>
+          </w:p>
+        </w:tc>
+        <w:tc>
+          <w:tcPr>
+            <w:tcW w:w="2130" w:type="dxa"/>
+            <w:tcBorders>
+              <w:top w:val="single" w:sz="4" w:space="0" w:color="auto"/>
+              <w:left w:val="single" w:sz="4" w:space="0" w:color="auto"/>
+              <w:bottom w:val="single" w:sz="4" w:space="0" w:color="auto"/>
+              <w:right w:val="single" w:sz="4" w:space="0" w:color="auto"/>
+            </w:tcBorders>
+          </w:tcPr>
+          <w:p>
+            <w:pPr>
+              <w:spacing w:after="20"/>
+              <w:rPr>
+                <w:sz w:val="17"/>
+                <w:lang w:val="es-AR"/>
+              </w:rPr>
+            </w:pPr>
+            <w:r>
+              <w:rPr>
+                <w:sz w:val="17"/>
+                <w:lang w:val="es-AR"/>
+              </w:rPr>
+              <w:t>C1 Elegir origen y destino  →</w:t>
+            </w:r>
+          </w:p>
+          <w:p>
+            <w:pPr>
+              <w:spacing w:after="20"/>
+              <w:rPr>
+                <w:sz w:val="17"/>
+                <w:lang w:val="es-AR"/>
+              </w:rPr>
+            </w:pPr>
+            <w:r>
+              <w:rPr>
+                <w:sz w:val="17"/>
+                <w:lang w:val="es-AR"/>
+              </w:rPr>
+              <w:t>C2 Antes de calcular  →</w:t>
+            </w:r>
+          </w:p>
+          <w:p>
+            <w:pPr>
+              <w:spacing w:after="20"/>
+              <w:rPr>
+                <w:sz w:val="17"/>
+                <w:lang w:val="es-AR"/>
+              </w:rPr>
+            </w:pPr>
+            <w:r>
+              <w:rPr>
+                <w:sz w:val="17"/>
+                <w:lang w:val="es-AR"/>
+              </w:rPr>
+              <w:t>C3 Confirmación que cambia el camino  →</w:t>
+            </w:r>
+          </w:p>
+          <w:p>
+            <w:pPr>
+              <w:spacing w:after="20"/>
+              <w:rPr>
+                <w:sz w:val="17"/>
+                <w:lang w:val="es-AR"/>
+              </w:rPr>
+            </w:pPr>
+            <w:r>
+              <w:rPr>
+                <w:sz w:val="17"/>
+                <w:lang w:val="es-AR"/>
+              </w:rPr>
+              <w:t>C4 La ruta calculada  →</w:t>
+            </w:r>
+          </w:p>
+          <w:p>
+            <w:pPr>
+              <w:spacing w:after="20"/>
+              <w:rPr>
+                <w:sz w:val="17"/>
+                <w:lang w:val="es-AR"/>
+              </w:rPr>
+            </w:pPr>
+            <w:r>
+              <w:rPr>
+                <w:sz w:val="17"/>
+                <w:lang w:val="es-AR"/>
+              </w:rPr>
+              <w:t>C5 Confirmación al descartar</w:t>
+            </w:r>
+          </w:p>
+        </w:tc>
+        <w:tc>
+          <w:tcPr>
+            <w:tcW w:w="2000" w:type="dxa"/>
+            <w:tcBorders>
+              <w:top w:val="single" w:sz="4" w:space="0" w:color="auto"/>
+              <w:left w:val="single" w:sz="4" w:space="0" w:color="auto"/>
+              <w:bottom w:val="single" w:sz="4" w:space="0" w:color="auto"/>
+              <w:right w:val="single" w:sz="4" w:space="0" w:color="auto"/>
+            </w:tcBorders>
+          </w:tcPr>
+          <w:p>
+            <w:pPr>
+              <w:spacing w:after="40"/>
+              <w:rPr>
+                <w:sz w:val="17"/>
+                <w:lang w:val="es-AR"/>
+              </w:rPr>
+            </w:pPr>
+            <w:r>
+              <w:rPr>
+                <w:b/>
+                <w:sz w:val="17"/>
+                <w:lang w:val="es-AR"/>
+              </w:rPr>
+              <w:t xml:space="preserve">Gana: </w:t>
+            </w:r>
+            <w:r>
+              <w:rPr>
+                <w:sz w:val="17"/>
+                <w:lang w:val="es-AR"/>
+              </w:rPr>
+              <w:t>Protege las dos decisiones que de verdad importan sin trabar la carga de datos.</w:t>
+            </w:r>
+          </w:p>
+          <w:p>
+            <w:pPr>
+              <w:spacing w:after="40"/>
+              <w:rPr>
+                <w:sz w:val="17"/>
+                <w:lang w:val="es-AR"/>
+              </w:rPr>
+            </w:pPr>
+            <w:r>
+              <w:rPr>
+                <w:b/>
+                <w:sz w:val="17"/>
+                <w:lang w:val="es-AR"/>
+              </w:rPr>
+              <w:t xml:space="preserve">Resigna: </w:t>
+            </w:r>
+            <w:r>
+              <w:rPr>
+                <w:sz w:val="17"/>
+                <w:lang w:val="es-AR"/>
+              </w:rPr>
+              <w:t>Si el usuario responde sin leer, la protección se pierde igual.</w:t>
+            </w:r>
+          </w:p>
+        </w:tc>
+      </w:tr>
+    </w:tbl>
+    <w:p>
+      <w:pPr>
+        <w:spacing w:before="120" w:after="60"/>
+        <w:rPr>
+          <w:lang w:val="es-AR"/>
+        </w:rPr>
+      </w:pPr>
+    </w:p>
+    <w:tbl>
+      <w:tblPr>
+        <w:tblW w:w="9000" w:type="dxa"/>
+        <w:tblBorders>
+          <w:top w:val="single" w:sz="4" w:space="0" w:color="1F4E79"/>
+          <w:left w:val="single" w:sz="4" w:space="0" w:color="1F4E79"/>
+          <w:bottom w:val="single" w:sz="4" w:space="0" w:color="1F4E79"/>
+          <w:right w:val="single" w:sz="4" w:space="0" w:color="1F4E79"/>
+        </w:tblBorders>
+        <w:tblLayout w:type="fixed"/>
+        <w:tblCellMar>
+          <w:top w:w="80" w:type="dxa"/>
+          <w:left w:w="140" w:type="dxa"/>
+          <w:bottom w:w="80" w:type="dxa"/>
+          <w:right w:w="140" w:type="dxa"/>
+        </w:tblCellMar>
+        <w:tblLook w:val="0000" w:firstRow="0" w:lastRow="0" w:firstColumn="0" w:lastColumn="0" w:noHBand="0" w:noVBand="0"/>
+      </w:tblPr>
+      <w:tblGrid>
+        <w:gridCol w:w="9000"/>
+      </w:tblGrid>
+      <w:tr>
+        <w:trPr>
+          <w:cantSplit/>
+        </w:trPr>
+        <w:tc>
+          <w:tcPr>
+            <w:tcW w:w="9000" w:type="dxa"/>
+            <w:shd w:val="clear" w:color="auto" w:fill="F4F7FA"/>
+          </w:tcPr>
+          <w:p>
+            <w:pPr>
+              <w:spacing w:after="20"/>
+              <w:rPr>
+                <w:sz w:val="20"/>
+                <w:lang w:val="es-AR"/>
+              </w:rPr>
+            </w:pPr>
+            <w:r>
+              <w:rPr>
+                <w:b/>
+                <w:sz w:val="20"/>
+                <w:lang w:val="es-AR"/>
+              </w:rPr>
+              <w:t>Esquema de las pantallas principales</w:t>
+            </w:r>
+            <w:r>
+              <w:rPr>
+                <w:b/>
+                <w:sz w:val="20"/>
+                <w:lang w:val="es-AR"/>
+              </w:rPr>
+              <w:t>:</w:t>
+            </w:r>
+          </w:p>
+          <w:p>
+            <w:pPr>
+              <w:spacing w:after="0"/>
+              <w:rPr>
+                <w:sz w:val="17"/>
+                <w:lang w:val="es-AR"/>
+              </w:rPr>
+            </w:pPr>
+            <w:r>
+              <w:rPr>
+                <w:sz w:val="18"/>
+                <w:lang w:val="es-AR"/>
+              </w:rPr>
+              <w:t>docs/diseno/Alternativas-de-diseño.pdf</w:t>
+            </w:r>
+          </w:p>
+        </w:tc>
+      </w:tr>
+    </w:tbl>
+    <w:p>
+      <w:pPr>
+        <w:spacing w:before="100" w:after="0"/>
+        <w:rPr>
+          <w:lang w:val="es-AR"/>
+        </w:rPr>
+      </w:pPr>
+    </w:p>
+    <w:p>
+      <w:pPr>
+        <w:pStyle w:val="Ttulo1"/>
+        <w:spacing w:before="140"/>
+        <w:rPr>
+          <w:lang w:val="es-AR"/>
+        </w:rPr>
+      </w:pPr>
+      <w:r>
+        <w:rPr>
+          <w:lang w:val="es-AR"/>
+        </w:rPr>
+        <w:t>7. Elegir y fundamentar</w:t>
+      </w:r>
+    </w:p>
+    <w:tbl>
+      <w:tblPr>
+        <w:tblW w:w="9000" w:type="dxa"/>
+        <w:tblBorders>
+          <w:top w:val="single" w:sz="4" w:space="0" w:color="auto"/>
+          <w:left w:val="single" w:sz="4" w:space="0" w:color="auto"/>
+          <w:bottom w:val="single" w:sz="4" w:space="0" w:color="auto"/>
+          <w:right w:val="single" w:sz="4" w:space="0" w:color="auto"/>
+          <w:insideH w:val="single" w:sz="4" w:space="0" w:color="auto"/>
+          <w:insideV w:val="single" w:sz="4" w:space="0" w:color="auto"/>
+        </w:tblBorders>
+        <w:tblLayout w:type="fixed"/>
+        <w:tblCellMar>
+          <w:left w:w="70" w:type="dxa"/>
+          <w:right w:w="70" w:type="dxa"/>
+        </w:tblCellMar>
+        <w:tblLook w:val="0000" w:firstRow="0" w:lastRow="0" w:firstColumn="0" w:lastColumn="0" w:noHBand="0" w:noVBand="0"/>
+      </w:tblPr>
+      <w:tblGrid>
+        <w:gridCol w:w="1300"/>
+        <w:gridCol w:w="1247"/>
+        <w:gridCol w:w="1559"/>
+        <w:gridCol w:w="1418"/>
+        <w:gridCol w:w="3476"/>
+      </w:tblGrid>
+      <w:tr>
+        <w:trPr>
+          <w:cantSplit/>
+          <w:tblHeader/>
+        </w:trPr>
+        <w:tc>
+          <w:tcPr>
+            <w:tcW w:w="1300" w:type="dxa"/>
+            <w:tcBorders>
+              <w:top w:val="single" w:sz="4" w:space="0" w:color="auto"/>
+              <w:left w:val="single" w:sz="4" w:space="0" w:color="auto"/>
+              <w:bottom w:val="single" w:sz="4" w:space="0" w:color="auto"/>
+              <w:right w:val="single" w:sz="4" w:space="0" w:color="auto"/>
+            </w:tcBorders>
+            <w:shd w:val="clear" w:color="auto" w:fill="1F4E79"/>
+            <w:vAlign w:val="center"/>
+          </w:tcPr>
+          <w:p>
+            <w:pPr>
+              <w:spacing w:after="40"/>
+              <w:rPr>
+                <w:b/>
+                <w:color w:val="FFFFFF"/>
+                <w:sz w:val="17"/>
+                <w:lang w:val="es-AR"/>
+              </w:rPr>
+            </w:pPr>
+            <w:r>
+              <w:rPr>
+                <w:b/>
+                <w:color w:val="FFFFFF"/>
+                <w:sz w:val="17"/>
+                <w:lang w:val="es-AR"/>
+              </w:rPr>
+              <w:t>Alternativa</w:t>
+            </w:r>
+          </w:p>
+        </w:tc>
+        <w:tc>
+          <w:tcPr>
+            <w:tcW w:w="1247" w:type="dxa"/>
+            <w:tcBorders>
+              <w:top w:val="single" w:sz="4" w:space="0" w:color="auto"/>
+              <w:left w:val="single" w:sz="4" w:space="0" w:color="auto"/>
+              <w:bottom w:val="single" w:sz="4" w:space="0" w:color="auto"/>
+              <w:right w:val="single" w:sz="4" w:space="0" w:color="auto"/>
+            </w:tcBorders>
+            <w:shd w:val="clear" w:color="auto" w:fill="1F4E79"/>
+            <w:vAlign w:val="center"/>
+          </w:tcPr>
+          <w:p>
+            <w:pPr>
+              <w:spacing w:after="40"/>
+              <w:rPr>
+                <w:b/>
+                <w:color w:val="FFFFFF"/>
+                <w:sz w:val="17"/>
+                <w:lang w:val="es-AR"/>
+              </w:rPr>
+            </w:pPr>
+            <w:r>
+              <w:rPr>
+                <w:b/>
+                <w:color w:val="FFFFFF"/>
+                <w:sz w:val="17"/>
+                <w:lang w:val="es-AR"/>
+              </w:rPr>
+              <w:t>Atributo que privilegia</w:t>
+            </w:r>
+          </w:p>
+        </w:tc>
+        <w:tc>
+          <w:tcPr>
+            <w:tcW w:w="1559" w:type="dxa"/>
+            <w:tcBorders>
+              <w:top w:val="single" w:sz="4" w:space="0" w:color="auto"/>
+              <w:left w:val="single" w:sz="4" w:space="0" w:color="auto"/>
+              <w:bottom w:val="single" w:sz="4" w:space="0" w:color="auto"/>
+              <w:right w:val="single" w:sz="4" w:space="0" w:color="auto"/>
+            </w:tcBorders>
+            <w:shd w:val="clear" w:color="auto" w:fill="1F4E79"/>
+            <w:vAlign w:val="center"/>
+          </w:tcPr>
+          <w:p>
+            <w:pPr>
+              <w:spacing w:after="40"/>
+              <w:rPr>
+                <w:b/>
+                <w:color w:val="FFFFFF"/>
+                <w:sz w:val="17"/>
+                <w:lang w:val="es-AR"/>
+              </w:rPr>
+            </w:pPr>
+            <w:r>
+              <w:rPr>
+                <w:b/>
+                <w:color w:val="FFFFFF"/>
+                <w:sz w:val="17"/>
+                <w:lang w:val="es-AR"/>
+              </w:rPr>
+              <w:t>Qué gana</w:t>
+            </w:r>
+          </w:p>
+        </w:tc>
+        <w:tc>
+          <w:tcPr>
+            <w:tcW w:w="1418" w:type="dxa"/>
+            <w:tcBorders>
+              <w:top w:val="single" w:sz="4" w:space="0" w:color="auto"/>
+              <w:left w:val="single" w:sz="4" w:space="0" w:color="auto"/>
+              <w:bottom w:val="single" w:sz="4" w:space="0" w:color="auto"/>
+              <w:right w:val="single" w:sz="4" w:space="0" w:color="auto"/>
+            </w:tcBorders>
+            <w:shd w:val="clear" w:color="auto" w:fill="1F4E79"/>
+            <w:vAlign w:val="center"/>
+          </w:tcPr>
+          <w:p>
+            <w:pPr>
+              <w:spacing w:after="40"/>
+              <w:rPr>
+                <w:b/>
+                <w:color w:val="FFFFFF"/>
+                <w:sz w:val="17"/>
+                <w:lang w:val="es-AR"/>
+              </w:rPr>
+            </w:pPr>
+            <w:r>
+              <w:rPr>
+                <w:b/>
+                <w:color w:val="FFFFFF"/>
+                <w:sz w:val="17"/>
+                <w:lang w:val="es-AR"/>
+              </w:rPr>
+              <w:t>Qué resigna</w:t>
+            </w:r>
+          </w:p>
+        </w:tc>
+        <w:tc>
+          <w:tcPr>
+            <w:tcW w:w="3476" w:type="dxa"/>
+            <w:tcBorders>
+              <w:top w:val="single" w:sz="4" w:space="0" w:color="auto"/>
+              <w:left w:val="single" w:sz="4" w:space="0" w:color="auto"/>
+              <w:bottom w:val="single" w:sz="4" w:space="0" w:color="auto"/>
+              <w:right w:val="single" w:sz="4" w:space="0" w:color="auto"/>
+            </w:tcBorders>
+            <w:shd w:val="clear" w:color="auto" w:fill="1F4E79"/>
+            <w:vAlign w:val="center"/>
+          </w:tcPr>
+          <w:p>
+            <w:pPr>
+              <w:spacing w:after="40"/>
+              <w:rPr>
+                <w:b/>
+                <w:color w:val="FFFFFF"/>
+                <w:sz w:val="17"/>
+                <w:lang w:val="es-AR"/>
+              </w:rPr>
+            </w:pPr>
+            <w:r>
+              <w:rPr>
+                <w:b/>
+                <w:color w:val="FFFFFF"/>
+                <w:sz w:val="17"/>
+                <w:lang w:val="es-AR"/>
+              </w:rPr>
+              <w:t>Hallazgo del TP2 que la sustenta o la descarta</w:t>
+            </w:r>
+          </w:p>
+        </w:tc>
+      </w:tr>
+      <w:tr>
+        <w:trPr>
+          <w:cantSplit/>
+        </w:trPr>
+        <w:tc>
+          <w:tcPr>
+            <w:tcW w:w="1300" w:type="dxa"/>
+            <w:tcBorders>
+              <w:top w:val="single" w:sz="4" w:space="0" w:color="auto"/>
+              <w:left w:val="single" w:sz="4" w:space="0" w:color="auto"/>
+              <w:bottom w:val="single" w:sz="4" w:space="0" w:color="auto"/>
+              <w:right w:val="single" w:sz="4" w:space="0" w:color="auto"/>
+            </w:tcBorders>
+          </w:tcPr>
+          <w:p>
+            <w:pPr>
+              <w:spacing w:after="40"/>
+              <w:rPr>
+                <w:sz w:val="17"/>
+                <w:lang w:val="es-AR"/>
+              </w:rPr>
+            </w:pPr>
+            <w:r>
+              <w:rPr>
+                <w:b/>
+                <w:sz w:val="17"/>
+                <w:lang w:val="es-AR"/>
+              </w:rPr>
+              <w:t>A</w:t>
+            </w:r>
+          </w:p>
+          <w:p>
+            <w:pPr>
+              <w:spacing w:after="20"/>
+              <w:rPr>
+                <w:sz w:val="17"/>
+                <w:lang w:val="es-AR"/>
+              </w:rPr>
+            </w:pPr>
+            <w:r>
+              <w:rPr>
+                <w:sz w:val="17"/>
+                <w:lang w:val="es-AR"/>
+              </w:rPr>
+              <w:t>Asistente de 3 pasos</w:t>
+            </w:r>
+          </w:p>
+          <w:p>
+            <w:pPr>
+              <w:spacing w:after="40"/>
+              <w:rPr>
+                <w:sz w:val="17"/>
+                <w:lang w:val="es-AR"/>
+              </w:rPr>
+            </w:pPr>
+            <w:r>
+              <w:rPr>
+                <w:sz w:val="17"/>
+                <w:lang w:val="es-AR"/>
+              </w:rPr>
+              <w:t>5 pantallas · ~7 toques</w:t>
+            </w:r>
+          </w:p>
+        </w:tc>
+        <w:tc>
+          <w:tcPr>
+            <w:tcW w:w="1247" w:type="dxa"/>
+            <w:tcBorders>
+              <w:top w:val="single" w:sz="4" w:space="0" w:color="auto"/>
+              <w:left w:val="single" w:sz="4" w:space="0" w:color="auto"/>
+              <w:bottom w:val="single" w:sz="4" w:space="0" w:color="auto"/>
+              <w:right w:val="single" w:sz="4" w:space="0" w:color="auto"/>
+            </w:tcBorders>
+          </w:tcPr>
+          <w:p>
+            <w:pPr>
+              <w:spacing w:after="40"/>
+              <w:rPr>
+                <w:sz w:val="17"/>
+                <w:lang w:val="es-AR"/>
+              </w:rPr>
+            </w:pPr>
+            <w:r>
+              <w:rPr>
+                <w:b/>
+                <w:sz w:val="17"/>
+                <w:lang w:val="es-AR"/>
+              </w:rPr>
+              <w:t>Facilidad de aprendizaje</w:t>
+            </w:r>
+          </w:p>
+        </w:tc>
+        <w:tc>
+          <w:tcPr>
+            <w:tcW w:w="1559" w:type="dxa"/>
+            <w:tcBorders>
+              <w:top w:val="single" w:sz="4" w:space="0" w:color="auto"/>
+              <w:left w:val="single" w:sz="4" w:space="0" w:color="auto"/>
+              <w:bottom w:val="single" w:sz="4" w:space="0" w:color="auto"/>
+              <w:right w:val="single" w:sz="4" w:space="0" w:color="auto"/>
+            </w:tcBorders>
+          </w:tcPr>
+          <w:p>
+            <w:pPr>
+              <w:spacing w:after="40"/>
+              <w:rPr>
+                <w:sz w:val="17"/>
+                <w:lang w:val="es-AR"/>
+              </w:rPr>
+            </w:pPr>
+            <w:r>
+              <w:rPr>
+                <w:sz w:val="17"/>
+                <w:lang w:val="es-AR"/>
+              </w:rPr>
+              <w:t>Se entiende en el primer uso: una pregunta por pantalla, progreso visible y un resultado que explica en palabras qué camino eligió y por qué.</w:t>
+            </w:r>
+          </w:p>
+        </w:tc>
+        <w:tc>
+          <w:tcPr>
+            <w:tcW w:w="1418" w:type="dxa"/>
+            <w:tcBorders>
+              <w:top w:val="single" w:sz="4" w:space="0" w:color="auto"/>
+              <w:left w:val="single" w:sz="4" w:space="0" w:color="auto"/>
+              <w:bottom w:val="single" w:sz="4" w:space="0" w:color="auto"/>
+              <w:right w:val="single" w:sz="4" w:space="0" w:color="auto"/>
+            </w:tcBorders>
+          </w:tcPr>
+          <w:p>
+            <w:pPr>
+              <w:spacing w:after="40"/>
+              <w:rPr>
+                <w:sz w:val="17"/>
+                <w:lang w:val="es-AR"/>
+              </w:rPr>
+            </w:pPr>
+            <w:r>
+              <w:rPr>
+                <w:sz w:val="17"/>
+                <w:lang w:val="es-AR"/>
+              </w:rPr>
+              <w:t>Cinco pantallas y unos siete toques hasta ver la ruta. A partir de la segunda consulta el acompañamiento se vuelve un trámite repetido.</w:t>
+            </w:r>
+          </w:p>
+        </w:tc>
+        <w:tc>
+          <w:tcPr>
+            <w:tcW w:w="3476" w:type="dxa"/>
+            <w:tcBorders>
+              <w:top w:val="single" w:sz="4" w:space="0" w:color="auto"/>
+              <w:left w:val="single" w:sz="4" w:space="0" w:color="auto"/>
+              <w:bottom w:val="single" w:sz="4" w:space="0" w:color="auto"/>
+              <w:right w:val="single" w:sz="4" w:space="0" w:color="auto"/>
+            </w:tcBorders>
+          </w:tcPr>
+          <w:p>
+            <w:pPr>
+              <w:spacing w:after="40"/>
+              <w:rPr>
+                <w:sz w:val="17"/>
+                <w:lang w:val="es-AR"/>
+              </w:rPr>
+            </w:pPr>
+            <w:r>
+              <w:rPr>
+                <w:sz w:val="17"/>
+                <w:lang w:val="es-AR"/>
+              </w:rPr>
+              <w:t>La sustenta en parte: el usuario primario son ingresantes que todavía no conocen el campus y hoy combinan mapa institucional, carteles, web, WhatsApp, otras personas o prueba y error. La descarta el contexto de uso: la consulta ocurre antes de una clase, examen o trámite, a veces con poco margen de tiempo y con datos móviles con señal irregular en los cinco casos.</w:t>
+            </w:r>
+          </w:p>
+        </w:tc>
+      </w:tr>
+      <w:tr>
+        <w:trPr>
+          <w:cantSplit/>
+        </w:trPr>
+        <w:tc>
+          <w:tcPr>
+            <w:tcW w:w="1300" w:type="dxa"/>
+            <w:tcBorders>
+              <w:top w:val="single" w:sz="4" w:space="0" w:color="auto"/>
+              <w:left w:val="single" w:sz="4" w:space="0" w:color="auto"/>
+              <w:bottom w:val="single" w:sz="4" w:space="0" w:color="auto"/>
+              <w:right w:val="single" w:sz="4" w:space="0" w:color="auto"/>
+            </w:tcBorders>
+          </w:tcPr>
+          <w:p>
+            <w:pPr>
+              <w:spacing w:after="40"/>
+              <w:rPr>
+                <w:sz w:val="17"/>
+                <w:lang w:val="es-AR"/>
+              </w:rPr>
+            </w:pPr>
+            <w:r>
+              <w:rPr>
+                <w:b/>
+                <w:sz w:val="17"/>
+                <w:lang w:val="es-AR"/>
+              </w:rPr>
+              <w:t>B</w:t>
+            </w:r>
+          </w:p>
+          <w:p>
+            <w:pPr>
+              <w:spacing w:after="20"/>
+              <w:rPr>
+                <w:sz w:val="17"/>
+                <w:lang w:val="es-AR"/>
+              </w:rPr>
+            </w:pPr>
+            <w:r>
+              <w:rPr>
+                <w:sz w:val="17"/>
+                <w:lang w:val="es-AR"/>
+              </w:rPr>
+              <w:t>Mapa único con panel</w:t>
+            </w:r>
+          </w:p>
+          <w:p>
+            <w:pPr>
+              <w:spacing w:after="40"/>
+              <w:rPr>
+                <w:sz w:val="17"/>
+                <w:lang w:val="es-AR"/>
+              </w:rPr>
+            </w:pPr>
+            <w:r>
+              <w:rPr>
+                <w:sz w:val="17"/>
+                <w:lang w:val="es-AR"/>
+              </w:rPr>
+              <w:t>2 pantallas · ~2 toques</w:t>
+            </w:r>
+          </w:p>
+        </w:tc>
+        <w:tc>
+          <w:tcPr>
+            <w:tcW w:w="1247" w:type="dxa"/>
+            <w:tcBorders>
+              <w:top w:val="single" w:sz="4" w:space="0" w:color="auto"/>
+              <w:left w:val="single" w:sz="4" w:space="0" w:color="auto"/>
+              <w:bottom w:val="single" w:sz="4" w:space="0" w:color="auto"/>
+              <w:right w:val="single" w:sz="4" w:space="0" w:color="auto"/>
+            </w:tcBorders>
+          </w:tcPr>
+          <w:p>
+            <w:pPr>
+              <w:spacing w:after="40"/>
+              <w:rPr>
+                <w:sz w:val="17"/>
+                <w:lang w:val="es-AR"/>
+              </w:rPr>
+            </w:pPr>
+            <w:r>
+              <w:rPr>
+                <w:b/>
+                <w:sz w:val="17"/>
+                <w:lang w:val="es-AR"/>
+              </w:rPr>
+              <w:t>Eficiencia</w:t>
+            </w:r>
+          </w:p>
+        </w:tc>
+        <w:tc>
+          <w:tcPr>
+            <w:tcW w:w="1559" w:type="dxa"/>
+            <w:tcBorders>
+              <w:top w:val="single" w:sz="4" w:space="0" w:color="auto"/>
+              <w:left w:val="single" w:sz="4" w:space="0" w:color="auto"/>
+              <w:bottom w:val="single" w:sz="4" w:space="0" w:color="auto"/>
+              <w:right w:val="single" w:sz="4" w:space="0" w:color="auto"/>
+            </w:tcBorders>
+          </w:tcPr>
+          <w:p>
+            <w:pPr>
+              <w:spacing w:after="40"/>
+              <w:rPr>
+                <w:sz w:val="17"/>
+                <w:lang w:val="es-AR"/>
+              </w:rPr>
+            </w:pPr>
+            <w:r>
+              <w:rPr>
+                <w:sz w:val="17"/>
+                <w:lang w:val="es-AR"/>
+              </w:rPr>
+              <w:t>Dos toques hasta la ruta, sin cambiar de pantalla: el origen viene precargado, los últimos destinos quedan a la vista y pasar de «techado» a «más corto» es un toque.</w:t>
+            </w:r>
+          </w:p>
+        </w:tc>
+        <w:tc>
+          <w:tcPr>
+            <w:tcW w:w="1418" w:type="dxa"/>
+            <w:tcBorders>
+              <w:top w:val="single" w:sz="4" w:space="0" w:color="auto"/>
+              <w:left w:val="single" w:sz="4" w:space="0" w:color="auto"/>
+              <w:bottom w:val="single" w:sz="4" w:space="0" w:color="auto"/>
+              <w:right w:val="single" w:sz="4" w:space="0" w:color="auto"/>
+            </w:tcBorders>
+          </w:tcPr>
+          <w:p>
+            <w:pPr>
+              <w:spacing w:after="40"/>
+              <w:rPr>
+                <w:sz w:val="17"/>
+                <w:lang w:val="es-AR"/>
+              </w:rPr>
+            </w:pPr>
+            <w:r>
+              <w:rPr>
+                <w:sz w:val="17"/>
+                <w:lang w:val="es-AR"/>
+              </w:rPr>
+              <w:t>Exige leer el mapa sin acompañamiento y un dato mal elegido se descubre recién en el resultado; no hay pantalla de revisión previa.</w:t>
+            </w:r>
+          </w:p>
+        </w:tc>
+        <w:tc>
+          <w:tcPr>
+            <w:tcW w:w="3476" w:type="dxa"/>
+            <w:tcBorders>
+              <w:top w:val="single" w:sz="4" w:space="0" w:color="auto"/>
+              <w:left w:val="single" w:sz="4" w:space="0" w:color="auto"/>
+              <w:bottom w:val="single" w:sz="4" w:space="0" w:color="auto"/>
+              <w:right w:val="single" w:sz="4" w:space="0" w:color="auto"/>
+            </w:tcBorders>
+          </w:tcPr>
+          <w:p>
+            <w:pPr>
+              <w:spacing w:after="40"/>
+              <w:rPr>
+                <w:sz w:val="17"/>
+                <w:lang w:val="es-AR"/>
+              </w:rPr>
+            </w:pPr>
+            <w:r>
+              <w:rPr>
+                <w:sz w:val="17"/>
+                <w:lang w:val="es-AR"/>
+              </w:rPr>
+              <w:t>La sustenta: los cuatro usuarios que no encontraron un destino perdieron entre cinco y diez minutos en el último episodio y llegaron tarde al menos una vez, y la hipótesis se valida si cuatro de cinco llegan en menos de cinco minutos. La señal irregular refuerza la elección: la consulta se resuelve en una sola carga.</w:t>
+            </w:r>
+          </w:p>
+        </w:tc>
+      </w:tr>
+      <w:tr>
+        <w:trPr>
+          <w:cantSplit/>
+        </w:trPr>
+        <w:tc>
+          <w:tcPr>
+            <w:tcW w:w="1300" w:type="dxa"/>
+            <w:tcBorders>
+              <w:top w:val="single" w:sz="4" w:space="0" w:color="auto"/>
+              <w:left w:val="single" w:sz="4" w:space="0" w:color="auto"/>
+              <w:bottom w:val="single" w:sz="4" w:space="0" w:color="auto"/>
+              <w:right w:val="single" w:sz="4" w:space="0" w:color="auto"/>
+            </w:tcBorders>
+          </w:tcPr>
+          <w:p>
+            <w:pPr>
+              <w:spacing w:after="40"/>
+              <w:rPr>
+                <w:sz w:val="17"/>
+                <w:lang w:val="es-AR"/>
+              </w:rPr>
+            </w:pPr>
+            <w:r>
+              <w:rPr>
+                <w:b/>
+                <w:sz w:val="17"/>
+                <w:lang w:val="es-AR"/>
+              </w:rPr>
+              <w:lastRenderedPageBreak/>
+              <w:t>C</w:t>
+            </w:r>
+          </w:p>
+          <w:p>
+            <w:pPr>
+              <w:spacing w:after="20"/>
+              <w:rPr>
+                <w:sz w:val="17"/>
+                <w:lang w:val="es-AR"/>
+              </w:rPr>
+            </w:pPr>
+            <w:r>
+              <w:rPr>
+                <w:sz w:val="17"/>
+                <w:lang w:val="es-AR"/>
+              </w:rPr>
+              <w:t>Confirmación en los puntos críticos</w:t>
+            </w:r>
+          </w:p>
+          <w:p>
+            <w:pPr>
+              <w:spacing w:after="40"/>
+              <w:rPr>
+                <w:sz w:val="17"/>
+                <w:lang w:val="es-AR"/>
+              </w:rPr>
+            </w:pPr>
+            <w:r>
+              <w:rPr>
+                <w:sz w:val="17"/>
+                <w:lang w:val="es-AR"/>
+              </w:rPr>
+              <w:t>5 pantallas · ~4 toques</w:t>
+            </w:r>
+          </w:p>
+        </w:tc>
+        <w:tc>
+          <w:tcPr>
+            <w:tcW w:w="1247" w:type="dxa"/>
+            <w:tcBorders>
+              <w:top w:val="single" w:sz="4" w:space="0" w:color="auto"/>
+              <w:left w:val="single" w:sz="4" w:space="0" w:color="auto"/>
+              <w:bottom w:val="single" w:sz="4" w:space="0" w:color="auto"/>
+              <w:right w:val="single" w:sz="4" w:space="0" w:color="auto"/>
+            </w:tcBorders>
+          </w:tcPr>
+          <w:p>
+            <w:pPr>
+              <w:spacing w:after="40"/>
+              <w:rPr>
+                <w:sz w:val="17"/>
+                <w:lang w:val="es-AR"/>
+              </w:rPr>
+            </w:pPr>
+            <w:r>
+              <w:rPr>
+                <w:b/>
+                <w:sz w:val="17"/>
+                <w:lang w:val="es-AR"/>
+              </w:rPr>
+              <w:t>Tasa de errores</w:t>
+            </w:r>
+          </w:p>
+        </w:tc>
+        <w:tc>
+          <w:tcPr>
+            <w:tcW w:w="1559" w:type="dxa"/>
+            <w:tcBorders>
+              <w:top w:val="single" w:sz="4" w:space="0" w:color="auto"/>
+              <w:left w:val="single" w:sz="4" w:space="0" w:color="auto"/>
+              <w:bottom w:val="single" w:sz="4" w:space="0" w:color="auto"/>
+              <w:right w:val="single" w:sz="4" w:space="0" w:color="auto"/>
+            </w:tcBorders>
+          </w:tcPr>
+          <w:p>
+            <w:pPr>
+              <w:spacing w:after="40"/>
+              <w:rPr>
+                <w:sz w:val="17"/>
+                <w:lang w:val="es-AR"/>
+              </w:rPr>
+            </w:pPr>
+            <w:r>
+              <w:rPr>
+                <w:sz w:val="17"/>
+                <w:lang w:val="es-AR"/>
+              </w:rPr>
+              <w:t xml:space="preserve">Protege las dos decisiones que cambian el camino </w:t>
+            </w:r>
+            <w:r>
+              <w:rPr>
+                <w:sz w:val="17"/>
+                <w:lang w:val="es-AR"/>
+              </w:rPr>
+              <w:t>(</w:t>
+            </w:r>
+            <w:r>
+              <w:rPr>
+                <w:sz w:val="17"/>
+                <w:lang w:val="es-AR"/>
+              </w:rPr>
+              <w:t>el criterio con lluvia y el descarte de una ruta ya calculada</w:t>
+            </w:r>
+            <w:r>
+              <w:rPr>
+                <w:sz w:val="17"/>
+                <w:lang w:val="es-AR"/>
+              </w:rPr>
+              <w:t>)</w:t>
+            </w:r>
+            <w:r>
+              <w:rPr>
+                <w:sz w:val="17"/>
+                <w:lang w:val="es-AR"/>
+              </w:rPr>
+              <w:t xml:space="preserve"> sin trabar la carga de origen y destino.</w:t>
+            </w:r>
+          </w:p>
+        </w:tc>
+        <w:tc>
+          <w:tcPr>
+            <w:tcW w:w="1418" w:type="dxa"/>
+            <w:tcBorders>
+              <w:top w:val="single" w:sz="4" w:space="0" w:color="auto"/>
+              <w:left w:val="single" w:sz="4" w:space="0" w:color="auto"/>
+              <w:bottom w:val="single" w:sz="4" w:space="0" w:color="auto"/>
+              <w:right w:val="single" w:sz="4" w:space="0" w:color="auto"/>
+            </w:tcBorders>
+          </w:tcPr>
+          <w:p>
+            <w:pPr>
+              <w:spacing w:after="40"/>
+              <w:rPr>
+                <w:sz w:val="17"/>
+                <w:lang w:val="es-AR"/>
+              </w:rPr>
+            </w:pPr>
+            <w:r>
+              <w:rPr>
+                <w:sz w:val="17"/>
+                <w:lang w:val="es-AR"/>
+              </w:rPr>
+              <w:t>Cuatro toques y dos interrupciones antes de llegar al mapa; si el usuario responde sin leer, la protección se pierde igual.</w:t>
+            </w:r>
+          </w:p>
+        </w:tc>
+        <w:tc>
+          <w:tcPr>
+            <w:tcW w:w="3476" w:type="dxa"/>
+            <w:tcBorders>
+              <w:top w:val="single" w:sz="4" w:space="0" w:color="auto"/>
+              <w:left w:val="single" w:sz="4" w:space="0" w:color="auto"/>
+              <w:bottom w:val="single" w:sz="4" w:space="0" w:color="auto"/>
+              <w:right w:val="single" w:sz="4" w:space="0" w:color="auto"/>
+            </w:tcBorders>
+          </w:tcPr>
+          <w:p>
+            <w:pPr>
+              <w:spacing w:after="40"/>
+              <w:rPr>
+                <w:sz w:val="17"/>
+                <w:lang w:val="es-AR"/>
+              </w:rPr>
+            </w:pPr>
+            <w:r>
+              <w:rPr>
+                <w:sz w:val="17"/>
+                <w:lang w:val="es-AR"/>
+              </w:rPr>
+              <w:t>La sustenta: cuatro de cinco encontraron pasillos, escaleras, puertas o sectores cerrados, uno tardó bastante en hallar otra ruta y otro tuvo que preguntar; y la preferencia con lluvia no es uniforme (tres se desvían, dos van por el camino más rápido). La descarta como estructura: ese error lo evita el motor, que excluye siempre los tramos cerrados, y no una confirmación adicional.</w:t>
+            </w:r>
+          </w:p>
+        </w:tc>
+      </w:tr>
+    </w:tbl>
+    <w:p>
+      <w:pPr>
+        <w:spacing w:before="120" w:after="60"/>
+        <w:rPr>
+          <w:lang w:val="es-AR"/>
+        </w:rPr>
+      </w:pPr>
+    </w:p>
+    <w:p>
+      <w:pPr>
+        <w:spacing w:after="140"/>
+        <w:jc w:val="both"/>
+        <w:rPr>
+          <w:lang w:val="es-AR"/>
+        </w:rPr>
+      </w:pPr>
+      <w:r>
+        <w:rPr>
+          <w:b/>
+          <w:sz w:val="20"/>
+          <w:lang w:val="es-AR"/>
+        </w:rPr>
+        <w:t xml:space="preserve">Alternativa elegida: B — Eficiencia. </w:t>
+      </w:r>
+      <w:r>
+        <w:rPr>
+          <w:sz w:val="20"/>
+          <w:lang w:val="es-AR"/>
+        </w:rPr>
+        <w:t xml:space="preserve">Es la adecuada para el Navegante del TP2 porque el problema relevado es, ante todo, un problema de tiempo: los cuatro usuarios que no encontraron un aula o sector perdieron entre cinco y diez minutos en el último episodio y llegaron tarde al menos una vez, y la consulta ocurre justo antes de una clase, un examen o un trámite, con poco margen. En ese momento el usuario no quiere aprender a usar una aplicación: quiere ver el camino. B entrega la ruta en dos toques y sin cambiar de pantalla, con el origen precargado y los últimos destinos como atajo, y es además la que mejor tolera la señal irregular que declararon los cinco, porque resuelve la consulta en una sola carga en lugar de encadenar cinco pantallas. El criterio de validación de la hipótesis </w:t>
+      </w:r>
+      <w:r>
+        <w:rPr>
+          <w:sz w:val="20"/>
+          <w:lang w:val="es-AR"/>
+        </w:rPr>
+        <w:t>(</w:t>
+      </w:r>
+      <w:r>
+        <w:rPr>
+          <w:sz w:val="20"/>
+          <w:lang w:val="es-AR"/>
+        </w:rPr>
+        <w:t>llegar al destino en menos de cinco minutos, sin pedir indicaciones ni tomar un acceso cerrado</w:t>
+      </w:r>
+      <w:r>
+        <w:rPr>
+          <w:sz w:val="20"/>
+          <w:lang w:val="es-AR"/>
+        </w:rPr>
+        <w:t>)</w:t>
+      </w:r>
+      <w:r>
+        <w:rPr>
+          <w:sz w:val="20"/>
+          <w:lang w:val="es-AR"/>
+        </w:rPr>
+        <w:t xml:space="preserve"> se mide sobre el tiempo total del recorrido, y cada pantalla intermedia se descuenta de ese presupuesto.</w:t>
+      </w:r>
+    </w:p>
+    <w:p>
+      <w:pPr>
+        <w:spacing w:after="140"/>
+        <w:jc w:val="both"/>
+        <w:rPr>
+          <w:lang w:val="es-AR"/>
+        </w:rPr>
+      </w:pPr>
+      <w:r>
+        <w:rPr>
+          <w:b/>
+          <w:sz w:val="20"/>
+          <w:lang w:val="es-AR"/>
+        </w:rPr>
+        <w:t xml:space="preserve">El costo de la elección es doble. </w:t>
+      </w:r>
+      <w:r>
+        <w:rPr>
+          <w:sz w:val="20"/>
+          <w:lang w:val="es-AR"/>
+        </w:rPr>
+        <w:t xml:space="preserve">Primero se resigna facilidad de aprendizaje: sin bienvenida ni pasos numerados, el primer uso depende de que el mapa y los controles se entiendan solos, algo que el relevamiento no permite dar por sentado en un usuario que todavía no conoce el campus. Segundo se resigna prevención de errores en la carga: al no haber pantalla de revisión, un origen o un destino mal elegido se descubre recién cuando aparece la ruta y obliga a rehacer la consulta. Asumimos las dos y las acotamos dentro de la estructura elegida: origen y destino quedan siempre visibles y editables en el panel, de modo que corregir cueste un toque y no un flujo nuevo, y la exclusión de los tramos cerrados queda en el motor </w:t>
+      </w:r>
+      <w:r>
+        <w:rPr>
+          <w:sz w:val="20"/>
+          <w:lang w:val="es-AR"/>
+        </w:rPr>
+        <w:t>(</w:t>
+      </w:r>
+      <w:r>
+        <w:rPr>
+          <w:sz w:val="20"/>
+          <w:lang w:val="es-AR"/>
+        </w:rPr>
+        <w:t>que los evita siempre</w:t>
+      </w:r>
+      <w:r>
+        <w:rPr>
+          <w:sz w:val="20"/>
+          <w:lang w:val="es-AR"/>
+        </w:rPr>
+        <w:t>)</w:t>
+      </w:r>
+      <w:r>
+        <w:rPr>
+          <w:sz w:val="20"/>
+          <w:lang w:val="es-AR"/>
+        </w:rPr>
+        <w:t xml:space="preserve"> en lugar de confiarse a una confirmación del usuario, como proponía C.</w:t>
+      </w:r>
     </w:p>
     <w:sectPr>
       <w:headerReference w:type="default" r:id="rId15"/>
@@ -15199,6 +17284,18 @@
       <w:shd w:val="clear" w:color="auto" w:fill="E1DFDD"/>
     </w:rPr>
   </w:style>
+  <w:style w:type="character" w:styleId="Hipervnculovisitado">
+    <w:name w:val="FollowedHyperlink"/>
+    <w:basedOn w:val="Fuentedeprrafopredeter"/>
+    <w:uiPriority w:val="99"/>
+    <w:semiHidden/>
+    <w:unhideWhenUsed/>
+    <w:rsid w:val="00203200"/>
+    <w:rPr>
+      <w:color w:val="800080" w:themeColor="followedHyperlink"/>
+      <w:u w:val="single"/>
+    </w:rPr>
+  </w:style>
 </w:styles>
 </file>
 

</xml_diff>

<commit_message>
Punto 8 del TP3.
</commit_message>
<xml_diff>
--- a/docs/entregas/TP3-Summate.docx
+++ b/docs/entregas/TP3-Summate.docx
@@ -1244,7 +1244,7 @@
           <w:r>
             <w:fldChar w:fldCharType="separate"/>
           </w:r>
-          <w:hyperlink w:anchor="_Toc239619579" w:history="1">
+          <w:hyperlink w:anchor="_Toc239640228" w:history="1">
             <w:r>
               <w:rPr>
                 <w:rStyle w:val="Hipervnculo"/>
@@ -1272,7 +1272,7 @@
                 <w:noProof/>
                 <w:webHidden/>
               </w:rPr>
-              <w:instrText xml:space="preserve"> PAGEREF _Toc239619579 \h </w:instrText>
+              <w:instrText xml:space="preserve"> PAGEREF _Toc239640228 \h </w:instrText>
             </w:r>
             <w:r>
               <w:rPr>
@@ -1318,7 +1318,7 @@
               <w14:ligatures w14:val="standardContextual"/>
             </w:rPr>
           </w:pPr>
-          <w:hyperlink w:anchor="_Toc239619580" w:history="1">
+          <w:hyperlink w:anchor="_Toc239640229" w:history="1">
             <w:r>
               <w:rPr>
                 <w:rStyle w:val="Hipervnculo"/>
@@ -1346,7 +1346,7 @@
                 <w:noProof/>
                 <w:webHidden/>
               </w:rPr>
-              <w:instrText xml:space="preserve"> PAGEREF _Toc239619580 \h </w:instrText>
+              <w:instrText xml:space="preserve"> PAGEREF _Toc239640229 \h </w:instrText>
             </w:r>
             <w:r>
               <w:rPr>
@@ -1392,7 +1392,7 @@
               <w14:ligatures w14:val="standardContextual"/>
             </w:rPr>
           </w:pPr>
-          <w:hyperlink w:anchor="_Toc239619581" w:history="1">
+          <w:hyperlink w:anchor="_Toc239640230" w:history="1">
             <w:r>
               <w:rPr>
                 <w:rStyle w:val="Hipervnculo"/>
@@ -1420,7 +1420,7 @@
                 <w:noProof/>
                 <w:webHidden/>
               </w:rPr>
-              <w:instrText xml:space="preserve"> PAGEREF _Toc239619581 \h </w:instrText>
+              <w:instrText xml:space="preserve"> PAGEREF _Toc239640230 \h </w:instrText>
             </w:r>
             <w:r>
               <w:rPr>
@@ -1466,7 +1466,7 @@
               <w14:ligatures w14:val="standardContextual"/>
             </w:rPr>
           </w:pPr>
-          <w:hyperlink w:anchor="_Toc239619582" w:history="1">
+          <w:hyperlink w:anchor="_Toc239640231" w:history="1">
             <w:r>
               <w:rPr>
                 <w:rStyle w:val="Hipervnculo"/>
@@ -1494,7 +1494,7 @@
                 <w:noProof/>
                 <w:webHidden/>
               </w:rPr>
-              <w:instrText xml:space="preserve"> PAGEREF _Toc239619582 \h </w:instrText>
+              <w:instrText xml:space="preserve"> PAGEREF _Toc239640231 \h </w:instrText>
             </w:r>
             <w:r>
               <w:rPr>
@@ -1540,7 +1540,7 @@
               <w14:ligatures w14:val="standardContextual"/>
             </w:rPr>
           </w:pPr>
-          <w:hyperlink w:anchor="_Toc239619583" w:history="1">
+          <w:hyperlink w:anchor="_Toc239640232" w:history="1">
             <w:r>
               <w:rPr>
                 <w:rStyle w:val="Hipervnculo"/>
@@ -1568,7 +1568,7 @@
                 <w:noProof/>
                 <w:webHidden/>
               </w:rPr>
-              <w:instrText xml:space="preserve"> PAGEREF _Toc239619583 \h </w:instrText>
+              <w:instrText xml:space="preserve"> PAGEREF _Toc239640232 \h </w:instrText>
             </w:r>
             <w:r>
               <w:rPr>
@@ -1589,6 +1589,154 @@
                 <w:webHidden/>
               </w:rPr>
               <w:t>4</w:t>
+            </w:r>
+            <w:r>
+              <w:rPr>
+                <w:noProof/>
+                <w:webHidden/>
+              </w:rPr>
+              <w:fldChar w:fldCharType="end"/>
+            </w:r>
+          </w:hyperlink>
+        </w:p>
+        <w:p>
+          <w:pPr>
+            <w:pStyle w:val="TDC1"/>
+            <w:rPr>
+              <w:rFonts w:asciiTheme="minorHAnsi" w:hAnsiTheme="minorHAnsi"/>
+              <w:b w:val="0"/>
+              <w:noProof/>
+              <w:color w:val="auto"/>
+              <w:kern w:val="2"/>
+              <w:sz w:val="24"/>
+              <w:szCs w:val="24"/>
+              <w:lang w:val="es-AR" w:eastAsia="es-AR"/>
+              <w14:ligatures w14:val="standardContextual"/>
+            </w:rPr>
+          </w:pPr>
+          <w:hyperlink w:anchor="_Toc239640233" w:history="1">
+            <w:r>
+              <w:rPr>
+                <w:rStyle w:val="Hipervnculo"/>
+                <w:noProof/>
+                <w:lang w:val="es-AR"/>
+              </w:rPr>
+              <w:t>7. Elegir y fundamentar</w:t>
+            </w:r>
+            <w:r>
+              <w:rPr>
+                <w:noProof/>
+                <w:webHidden/>
+              </w:rPr>
+              <w:tab/>
+            </w:r>
+            <w:r>
+              <w:rPr>
+                <w:noProof/>
+                <w:webHidden/>
+              </w:rPr>
+              <w:fldChar w:fldCharType="begin"/>
+            </w:r>
+            <w:r>
+              <w:rPr>
+                <w:noProof/>
+                <w:webHidden/>
+              </w:rPr>
+              <w:instrText xml:space="preserve"> PAGEREF _Toc239640233 \h </w:instrText>
+            </w:r>
+            <w:r>
+              <w:rPr>
+                <w:noProof/>
+                <w:webHidden/>
+              </w:rPr>
+            </w:r>
+            <w:r>
+              <w:rPr>
+                <w:noProof/>
+                <w:webHidden/>
+              </w:rPr>
+              <w:fldChar w:fldCharType="separate"/>
+            </w:r>
+            <w:r>
+              <w:rPr>
+                <w:noProof/>
+                <w:webHidden/>
+              </w:rPr>
+              <w:t>5</w:t>
+            </w:r>
+            <w:r>
+              <w:rPr>
+                <w:noProof/>
+                <w:webHidden/>
+              </w:rPr>
+              <w:fldChar w:fldCharType="end"/>
+            </w:r>
+          </w:hyperlink>
+        </w:p>
+        <w:p>
+          <w:pPr>
+            <w:pStyle w:val="TDC1"/>
+            <w:rPr>
+              <w:rFonts w:asciiTheme="minorHAnsi" w:hAnsiTheme="minorHAnsi"/>
+              <w:b w:val="0"/>
+              <w:noProof/>
+              <w:color w:val="auto"/>
+              <w:kern w:val="2"/>
+              <w:sz w:val="24"/>
+              <w:szCs w:val="24"/>
+              <w:lang w:val="es-AR" w:eastAsia="es-AR"/>
+              <w14:ligatures w14:val="standardContextual"/>
+            </w:rPr>
+          </w:pPr>
+          <w:hyperlink w:anchor="_Toc239640234" w:history="1">
+            <w:r>
+              <w:rPr>
+                <w:rStyle w:val="Hipervnculo"/>
+                <w:noProof/>
+                <w:lang w:val="es-AR"/>
+              </w:rPr>
+              <w:t>8. Desarrollar la alternativa elegida como wireframe</w:t>
+            </w:r>
+            <w:r>
+              <w:rPr>
+                <w:noProof/>
+                <w:webHidden/>
+              </w:rPr>
+              <w:tab/>
+            </w:r>
+            <w:r>
+              <w:rPr>
+                <w:noProof/>
+                <w:webHidden/>
+              </w:rPr>
+              <w:fldChar w:fldCharType="begin"/>
+            </w:r>
+            <w:r>
+              <w:rPr>
+                <w:noProof/>
+                <w:webHidden/>
+              </w:rPr>
+              <w:instrText xml:space="preserve"> PAGEREF _Toc239640234 \h </w:instrText>
+            </w:r>
+            <w:r>
+              <w:rPr>
+                <w:noProof/>
+                <w:webHidden/>
+              </w:rPr>
+            </w:r>
+            <w:r>
+              <w:rPr>
+                <w:noProof/>
+                <w:webHidden/>
+              </w:rPr>
+              <w:fldChar w:fldCharType="separate"/>
+            </w:r>
+            <w:r>
+              <w:rPr>
+                <w:noProof/>
+                <w:webHidden/>
+              </w:rPr>
+              <w:t>6</w:t>
             </w:r>
             <w:r>
               <w:rPr>
@@ -1640,7 +1788,7 @@
           <w:lang w:val="es-AR"/>
         </w:rPr>
       </w:pPr>
-      <w:bookmarkStart w:id="0" w:name="_Toc239619579"/>
+      <w:bookmarkStart w:id="0" w:name="_Toc239640228"/>
       <w:r>
         <w:rPr>
           <w:lang w:val="es-AR"/>
@@ -2198,7 +2346,7 @@
           <w:lang w:val="es-AR"/>
         </w:rPr>
       </w:pPr>
-      <w:bookmarkStart w:id="1" w:name="_Toc239619580"/>
+      <w:bookmarkStart w:id="1" w:name="_Toc239640229"/>
       <w:r>
         <w:rPr>
           <w:lang w:val="es-AR"/>
@@ -2738,7 +2886,7 @@
           <w:lang w:val="es-AR"/>
         </w:rPr>
       </w:pPr>
-      <w:bookmarkStart w:id="2" w:name="_Toc239619581"/>
+      <w:bookmarkStart w:id="2" w:name="_Toc239640230"/>
       <w:r>
         <w:rPr>
           <w:lang w:val="es-AR"/>
@@ -2963,7 +3111,7 @@
           <w:lang w:val="es-AR"/>
         </w:rPr>
       </w:pPr>
-      <w:bookmarkStart w:id="3" w:name="_Toc239619582"/>
+      <w:bookmarkStart w:id="3" w:name="_Toc239640231"/>
       <w:r>
         <w:rPr>
           <w:lang w:val="es-AR"/>
@@ -3339,7 +3487,7 @@
         </w:rPr>
       </w:pPr>
       <w:bookmarkStart w:id="4" w:name="_Toc239613990"/>
-      <w:bookmarkStart w:id="5" w:name="_Toc239619583"/>
+      <w:bookmarkStart w:id="5" w:name="_Toc239640232"/>
       <w:r>
         <w:rPr>
           <w:lang w:val="es-AR"/>
@@ -4481,12 +4629,14 @@
           <w:lang w:val="es-AR"/>
         </w:rPr>
       </w:pPr>
+      <w:bookmarkStart w:id="6" w:name="_Toc239640233"/>
       <w:r>
         <w:rPr>
           <w:lang w:val="es-AR"/>
         </w:rPr>
         <w:t>7. Elegir y fundamentar</w:t>
       </w:r>
+      <w:bookmarkEnd w:id="6"/>
     </w:p>
     <w:tbl>
       <w:tblPr>
@@ -5347,6 +5497,121 @@
         </w:rPr>
         <w:t xml:space="preserve"> en lugar de confiarse a una confirmación del usuario, como proponía C.</w:t>
       </w:r>
+    </w:p>
+    <w:p>
+      <w:pPr>
+        <w:pStyle w:val="Ttulo1"/>
+        <w:rPr>
+          <w:lang w:val="es-AR"/>
+        </w:rPr>
+      </w:pPr>
+      <w:bookmarkStart w:id="7" w:name="_Toc239640234"/>
+      <w:r>
+        <w:rPr>
+          <w:lang w:val="es-AR"/>
+        </w:rPr>
+        <w:t>8. Desarrollar la alternativa elegida como wireframe</w:t>
+      </w:r>
+      <w:bookmarkEnd w:id="7"/>
+    </w:p>
+    <w:tbl>
+      <w:tblPr>
+        <w:tblW w:w="9000" w:type="dxa"/>
+        <w:tblBorders>
+          <w:top w:val="single" w:sz="4" w:space="0" w:color="1F4E79"/>
+          <w:left w:val="single" w:sz="4" w:space="0" w:color="1F4E79"/>
+          <w:bottom w:val="single" w:sz="4" w:space="0" w:color="1F4E79"/>
+          <w:right w:val="single" w:sz="4" w:space="0" w:color="1F4E79"/>
+        </w:tblBorders>
+        <w:tblLayout w:type="fixed"/>
+        <w:tblCellMar>
+          <w:top w:w="80" w:type="dxa"/>
+          <w:left w:w="140" w:type="dxa"/>
+          <w:bottom w:w="80" w:type="dxa"/>
+          <w:right w:w="140" w:type="dxa"/>
+        </w:tblCellMar>
+        <w:tblLook w:val="0000" w:firstRow="0" w:lastRow="0" w:firstColumn="0" w:lastColumn="0" w:noHBand="0" w:noVBand="0"/>
+      </w:tblPr>
+      <w:tblGrid>
+        <w:gridCol w:w="9000"/>
+      </w:tblGrid>
+      <w:tr>
+        <w:trPr>
+          <w:cantSplit/>
+        </w:trPr>
+        <w:tc>
+          <w:tcPr>
+            <w:tcW w:w="9000" w:type="dxa"/>
+            <w:shd w:val="clear" w:color="auto" w:fill="F4F7FA"/>
+          </w:tcPr>
+          <w:p>
+            <w:pPr>
+              <w:spacing w:after="20"/>
+              <w:rPr>
+                <w:sz w:val="20"/>
+              </w:rPr>
+            </w:pPr>
+            <w:r>
+              <w:rPr>
+                <w:b/>
+                <w:sz w:val="20"/>
+              </w:rPr>
+              <w:t xml:space="preserve">Wireframe </w:t>
+            </w:r>
+            <w:proofErr w:type="spellStart"/>
+            <w:r>
+              <w:rPr>
+                <w:b/>
+                <w:sz w:val="20"/>
+              </w:rPr>
+              <w:t>navegable</w:t>
+            </w:r>
+            <w:proofErr w:type="spellEnd"/>
+            <w:r>
+              <w:rPr>
+                <w:b/>
+                <w:sz w:val="20"/>
+              </w:rPr>
+              <w:t>:</w:t>
+            </w:r>
+          </w:p>
+          <w:p>
+            <w:pPr>
+              <w:spacing w:after="0"/>
+              <w:rPr>
+                <w:sz w:val="17"/>
+              </w:rPr>
+            </w:pPr>
+            <w:r>
+              <w:rPr>
+                <w:sz w:val="18"/>
+              </w:rPr>
+              <w:t>docs/</w:t>
+            </w:r>
+            <w:proofErr w:type="spellStart"/>
+            <w:r>
+              <w:rPr>
+                <w:sz w:val="18"/>
+              </w:rPr>
+              <w:t>diseno</w:t>
+            </w:r>
+            <w:proofErr w:type="spellEnd"/>
+            <w:r>
+              <w:rPr>
+                <w:sz w:val="18"/>
+              </w:rPr>
+              <w:t>/wireframe/index.html</w:t>
+            </w:r>
+          </w:p>
+        </w:tc>
+      </w:tr>
+    </w:tbl>
+    <w:p>
+      <w:pPr>
+        <w:rPr>
+          <w:lang w:val="es-AR"/>
+        </w:rPr>
+      </w:pPr>
     </w:p>
     <w:sectPr>
       <w:headerReference w:type="default" r:id="rId15"/>

</xml_diff>

<commit_message>
Punto 10 del TP3
</commit_message>
<xml_diff>
--- a/docs/entregas/TP3-Summate.docx
+++ b/docs/entregas/TP3-Summate.docx
@@ -703,12 +703,14 @@
                 <w:lang w:val="es-AR"/>
               </w:rPr>
             </w:pPr>
+            <w:proofErr w:type="spellStart"/>
             <w:r>
               <w:rPr>
                 <w:lang w:val="es-AR"/>
               </w:rPr>
               <w:t>Naspleda</w:t>
             </w:r>
+            <w:proofErr w:type="spellEnd"/>
           </w:p>
         </w:tc>
         <w:tc>
@@ -992,14 +994,12 @@
                 <w:lang w:val="es-AR"/>
               </w:rPr>
             </w:pPr>
-            <w:proofErr w:type="spellStart"/>
             <w:r>
               <w:rPr>
                 <w:lang w:val="es-AR"/>
               </w:rPr>
               <w:t>Rios</w:t>
             </w:r>
-            <w:proofErr w:type="spellEnd"/>
           </w:p>
         </w:tc>
         <w:tc>
@@ -1244,7 +1244,7 @@
           <w:r>
             <w:fldChar w:fldCharType="separate"/>
           </w:r>
-          <w:hyperlink w:anchor="_Toc239640228" w:history="1">
+          <w:hyperlink w:anchor="_Toc239795178" w:history="1">
             <w:r>
               <w:rPr>
                 <w:rStyle w:val="Hipervnculo"/>
@@ -1272,7 +1272,7 @@
                 <w:noProof/>
                 <w:webHidden/>
               </w:rPr>
-              <w:instrText xml:space="preserve"> PAGEREF _Toc239640228 \h </w:instrText>
+              <w:instrText xml:space="preserve"> PAGEREF _Toc239795178 \h </w:instrText>
             </w:r>
             <w:r>
               <w:rPr>
@@ -1318,7 +1318,7 @@
               <w14:ligatures w14:val="standardContextual"/>
             </w:rPr>
           </w:pPr>
-          <w:hyperlink w:anchor="_Toc239640229" w:history="1">
+          <w:hyperlink w:anchor="_Toc239795179" w:history="1">
             <w:r>
               <w:rPr>
                 <w:rStyle w:val="Hipervnculo"/>
@@ -1346,7 +1346,7 @@
                 <w:noProof/>
                 <w:webHidden/>
               </w:rPr>
-              <w:instrText xml:space="preserve"> PAGEREF _Toc239640229 \h </w:instrText>
+              <w:instrText xml:space="preserve"> PAGEREF _Toc239795179 \h </w:instrText>
             </w:r>
             <w:r>
               <w:rPr>
@@ -1392,7 +1392,7 @@
               <w14:ligatures w14:val="standardContextual"/>
             </w:rPr>
           </w:pPr>
-          <w:hyperlink w:anchor="_Toc239640230" w:history="1">
+          <w:hyperlink w:anchor="_Toc239795180" w:history="1">
             <w:r>
               <w:rPr>
                 <w:rStyle w:val="Hipervnculo"/>
@@ -1420,7 +1420,7 @@
                 <w:noProof/>
                 <w:webHidden/>
               </w:rPr>
-              <w:instrText xml:space="preserve"> PAGEREF _Toc239640230 \h </w:instrText>
+              <w:instrText xml:space="preserve"> PAGEREF _Toc239795180 \h </w:instrText>
             </w:r>
             <w:r>
               <w:rPr>
@@ -1466,7 +1466,7 @@
               <w14:ligatures w14:val="standardContextual"/>
             </w:rPr>
           </w:pPr>
-          <w:hyperlink w:anchor="_Toc239640231" w:history="1">
+          <w:hyperlink w:anchor="_Toc239795181" w:history="1">
             <w:r>
               <w:rPr>
                 <w:rStyle w:val="Hipervnculo"/>
@@ -1494,7 +1494,7 @@
                 <w:noProof/>
                 <w:webHidden/>
               </w:rPr>
-              <w:instrText xml:space="preserve"> PAGEREF _Toc239640231 \h </w:instrText>
+              <w:instrText xml:space="preserve"> PAGEREF _Toc239795181 \h </w:instrText>
             </w:r>
             <w:r>
               <w:rPr>
@@ -1540,7 +1540,7 @@
               <w14:ligatures w14:val="standardContextual"/>
             </w:rPr>
           </w:pPr>
-          <w:hyperlink w:anchor="_Toc239640232" w:history="1">
+          <w:hyperlink w:anchor="_Toc239795182" w:history="1">
             <w:r>
               <w:rPr>
                 <w:rStyle w:val="Hipervnculo"/>
@@ -1568,7 +1568,7 @@
                 <w:noProof/>
                 <w:webHidden/>
               </w:rPr>
-              <w:instrText xml:space="preserve"> PAGEREF _Toc239640232 \h </w:instrText>
+              <w:instrText xml:space="preserve"> PAGEREF _Toc239795182 \h </w:instrText>
             </w:r>
             <w:r>
               <w:rPr>
@@ -1614,7 +1614,7 @@
               <w14:ligatures w14:val="standardContextual"/>
             </w:rPr>
           </w:pPr>
-          <w:hyperlink w:anchor="_Toc239640233" w:history="1">
+          <w:hyperlink w:anchor="_Toc239795183" w:history="1">
             <w:r>
               <w:rPr>
                 <w:rStyle w:val="Hipervnculo"/>
@@ -1642,7 +1642,7 @@
                 <w:noProof/>
                 <w:webHidden/>
               </w:rPr>
-              <w:instrText xml:space="preserve"> PAGEREF _Toc239640233 \h </w:instrText>
+              <w:instrText xml:space="preserve"> PAGEREF _Toc239795183 \h </w:instrText>
             </w:r>
             <w:r>
               <w:rPr>
@@ -1688,7 +1688,7 @@
               <w14:ligatures w14:val="standardContextual"/>
             </w:rPr>
           </w:pPr>
-          <w:hyperlink w:anchor="_Toc239640234" w:history="1">
+          <w:hyperlink w:anchor="_Toc239795184" w:history="1">
             <w:r>
               <w:rPr>
                 <w:rStyle w:val="Hipervnculo"/>
@@ -1716,7 +1716,81 @@
                 <w:noProof/>
                 <w:webHidden/>
               </w:rPr>
-              <w:instrText xml:space="preserve"> PAGEREF _Toc239640234 \h </w:instrText>
+              <w:instrText xml:space="preserve"> PAGEREF _Toc239795184 \h </w:instrText>
+            </w:r>
+            <w:r>
+              <w:rPr>
+                <w:noProof/>
+                <w:webHidden/>
+              </w:rPr>
+            </w:r>
+            <w:r>
+              <w:rPr>
+                <w:noProof/>
+                <w:webHidden/>
+              </w:rPr>
+              <w:fldChar w:fldCharType="separate"/>
+            </w:r>
+            <w:r>
+              <w:rPr>
+                <w:noProof/>
+                <w:webHidden/>
+              </w:rPr>
+              <w:t>6</w:t>
+            </w:r>
+            <w:r>
+              <w:rPr>
+                <w:noProof/>
+                <w:webHidden/>
+              </w:rPr>
+              <w:fldChar w:fldCharType="end"/>
+            </w:r>
+          </w:hyperlink>
+        </w:p>
+        <w:p>
+          <w:pPr>
+            <w:pStyle w:val="TDC1"/>
+            <w:rPr>
+              <w:rFonts w:asciiTheme="minorHAnsi" w:hAnsiTheme="minorHAnsi"/>
+              <w:b w:val="0"/>
+              <w:noProof/>
+              <w:color w:val="auto"/>
+              <w:kern w:val="2"/>
+              <w:sz w:val="24"/>
+              <w:szCs w:val="24"/>
+              <w:lang w:val="es-AR" w:eastAsia="es-AR"/>
+              <w14:ligatures w14:val="standardContextual"/>
+            </w:rPr>
+          </w:pPr>
+          <w:hyperlink w:anchor="_Toc239795185" w:history="1">
+            <w:r>
+              <w:rPr>
+                <w:rStyle w:val="Hipervnculo"/>
+                <w:noProof/>
+                <w:lang w:val="es-AR"/>
+              </w:rPr>
+              <w:t>10. Fundamentación de las decisiones</w:t>
+            </w:r>
+            <w:r>
+              <w:rPr>
+                <w:noProof/>
+                <w:webHidden/>
+              </w:rPr>
+              <w:tab/>
+            </w:r>
+            <w:r>
+              <w:rPr>
+                <w:noProof/>
+                <w:webHidden/>
+              </w:rPr>
+              <w:fldChar w:fldCharType="begin"/>
+            </w:r>
+            <w:r>
+              <w:rPr>
+                <w:noProof/>
+                <w:webHidden/>
+              </w:rPr>
+              <w:instrText xml:space="preserve"> PAGEREF _Toc239795185 \h </w:instrText>
             </w:r>
             <w:r>
               <w:rPr>
@@ -1788,7 +1862,7 @@
           <w:lang w:val="es-AR"/>
         </w:rPr>
       </w:pPr>
-      <w:bookmarkStart w:id="0" w:name="_Toc239640228"/>
+      <w:bookmarkStart w:id="0" w:name="_Toc239795178"/>
       <w:r>
         <w:rPr>
           <w:lang w:val="es-AR"/>
@@ -1834,13 +1908,23 @@
             <w:pPr>
               <w:spacing w:after="40"/>
             </w:pPr>
+            <w:proofErr w:type="spellStart"/>
             <w:r>
               <w:rPr>
                 <w:b/>
                 <w:color w:val="FFFFFF"/>
                 <w:sz w:val="17"/>
               </w:rPr>
-              <w:t>Incluido en el MVP</w:t>
+              <w:t>Incluido</w:t>
+            </w:r>
+            <w:proofErr w:type="spellEnd"/>
+            <w:r>
+              <w:rPr>
+                <w:b/>
+                <w:color w:val="FFFFFF"/>
+                <w:sz w:val="17"/>
+              </w:rPr>
+              <w:t xml:space="preserve"> en el MVP</w:t>
             </w:r>
           </w:p>
         </w:tc>
@@ -2169,8 +2253,36 @@
                 <w:color w:val="FFFFFF"/>
                 <w:sz w:val="17"/>
               </w:rPr>
-              <w:t>Por qué se excluye</w:t>
-            </w:r>
+              <w:t xml:space="preserve">Por </w:t>
+            </w:r>
+            <w:proofErr w:type="spellStart"/>
+            <w:r>
+              <w:rPr>
+                <w:b/>
+                <w:color w:val="FFFFFF"/>
+                <w:sz w:val="17"/>
+              </w:rPr>
+              <w:t>qué</w:t>
+            </w:r>
+            <w:proofErr w:type="spellEnd"/>
+            <w:r>
+              <w:rPr>
+                <w:b/>
+                <w:color w:val="FFFFFF"/>
+                <w:sz w:val="17"/>
+              </w:rPr>
+              <w:t xml:space="preserve"> se </w:t>
+            </w:r>
+            <w:proofErr w:type="spellStart"/>
+            <w:r>
+              <w:rPr>
+                <w:b/>
+                <w:color w:val="FFFFFF"/>
+                <w:sz w:val="17"/>
+              </w:rPr>
+              <w:t>excluye</w:t>
+            </w:r>
+            <w:proofErr w:type="spellEnd"/>
           </w:p>
         </w:tc>
       </w:tr>
@@ -2346,7 +2458,7 @@
           <w:lang w:val="es-AR"/>
         </w:rPr>
       </w:pPr>
-      <w:bookmarkStart w:id="1" w:name="_Toc239640229"/>
+      <w:bookmarkStart w:id="1" w:name="_Toc239795179"/>
       <w:r>
         <w:rPr>
           <w:lang w:val="es-AR"/>
@@ -2420,8 +2532,18 @@
                 <w:color w:val="FFFFFF"/>
                 <w:sz w:val="17"/>
               </w:rPr>
-              <w:t>Se construye</w:t>
-            </w:r>
+              <w:t xml:space="preserve">Se </w:t>
+            </w:r>
+            <w:proofErr w:type="spellStart"/>
+            <w:r>
+              <w:rPr>
+                <w:b/>
+                <w:color w:val="FFFFFF"/>
+                <w:sz w:val="17"/>
+              </w:rPr>
+              <w:t>construye</w:t>
+            </w:r>
+            <w:proofErr w:type="spellEnd"/>
           </w:p>
         </w:tc>
         <w:tc>
@@ -2465,8 +2587,18 @@
                 <w:color w:val="FFFFFF"/>
                 <w:sz w:val="17"/>
               </w:rPr>
-              <w:t>Por qué</w:t>
-            </w:r>
+              <w:t xml:space="preserve">Por </w:t>
+            </w:r>
+            <w:proofErr w:type="spellStart"/>
+            <w:r>
+              <w:rPr>
+                <w:b/>
+                <w:color w:val="FFFFFF"/>
+                <w:sz w:val="17"/>
+              </w:rPr>
+              <w:t>qué</w:t>
+            </w:r>
+            <w:proofErr w:type="spellEnd"/>
           </w:p>
         </w:tc>
       </w:tr>
@@ -2483,12 +2615,28 @@
             <w:pPr>
               <w:spacing w:after="40"/>
             </w:pPr>
-            <w:r>
-              <w:rPr>
-                <w:sz w:val="17"/>
-              </w:rPr>
-              <w:t>Interfaz web móvil</w:t>
-            </w:r>
+            <w:proofErr w:type="spellStart"/>
+            <w:r>
+              <w:rPr>
+                <w:sz w:val="17"/>
+              </w:rPr>
+              <w:t>Interfaz</w:t>
+            </w:r>
+            <w:proofErr w:type="spellEnd"/>
+            <w:r>
+              <w:rPr>
+                <w:sz w:val="17"/>
+              </w:rPr>
+              <w:t xml:space="preserve"> web </w:t>
+            </w:r>
+            <w:proofErr w:type="spellStart"/>
+            <w:r>
+              <w:rPr>
+                <w:sz w:val="17"/>
+              </w:rPr>
+              <w:t>móvil</w:t>
+            </w:r>
+            <w:proofErr w:type="spellEnd"/>
           </w:p>
         </w:tc>
         <w:tc>
@@ -2526,7 +2674,21 @@
               <w:rPr>
                 <w:sz w:val="17"/>
               </w:rPr>
-              <w:t>No se simula.</w:t>
+              <w:t xml:space="preserve">No se </w:t>
+            </w:r>
+            <w:proofErr w:type="spellStart"/>
+            <w:r>
+              <w:rPr>
+                <w:sz w:val="17"/>
+              </w:rPr>
+              <w:t>simula</w:t>
+            </w:r>
+            <w:proofErr w:type="spellEnd"/>
+            <w:r>
+              <w:rPr>
+                <w:sz w:val="17"/>
+              </w:rPr>
+              <w:t>.</w:t>
             </w:r>
           </w:p>
         </w:tc>
@@ -2886,7 +3048,7 @@
           <w:lang w:val="es-AR"/>
         </w:rPr>
       </w:pPr>
-      <w:bookmarkStart w:id="2" w:name="_Toc239640230"/>
+      <w:bookmarkStart w:id="2" w:name="_Toc239795180"/>
       <w:r>
         <w:rPr>
           <w:lang w:val="es-AR"/>
@@ -3111,7 +3273,7 @@
           <w:lang w:val="es-AR"/>
         </w:rPr>
       </w:pPr>
-      <w:bookmarkStart w:id="3" w:name="_Toc239640231"/>
+      <w:bookmarkStart w:id="3" w:name="_Toc239795181"/>
       <w:r>
         <w:rPr>
           <w:lang w:val="es-AR"/>
@@ -3180,13 +3342,31 @@
             <w:pPr>
               <w:spacing w:after="40"/>
             </w:pPr>
+            <w:proofErr w:type="spellStart"/>
             <w:r>
               <w:rPr>
                 <w:b/>
                 <w:sz w:val="17"/>
               </w:rPr>
-              <w:t>Atributo priorizado</w:t>
-            </w:r>
+              <w:t>Atributo</w:t>
+            </w:r>
+            <w:proofErr w:type="spellEnd"/>
+            <w:r>
+              <w:rPr>
+                <w:b/>
+                <w:sz w:val="17"/>
+              </w:rPr>
+              <w:t xml:space="preserve"> </w:t>
+            </w:r>
+            <w:proofErr w:type="spellStart"/>
+            <w:r>
+              <w:rPr>
+                <w:b/>
+                <w:sz w:val="17"/>
+              </w:rPr>
+              <w:t>priorizado</w:t>
+            </w:r>
+            <w:proofErr w:type="spellEnd"/>
           </w:p>
         </w:tc>
         <w:tc>
@@ -3487,7 +3667,7 @@
         </w:rPr>
       </w:pPr>
       <w:bookmarkStart w:id="4" w:name="_Toc239613990"/>
-      <w:bookmarkStart w:id="5" w:name="_Toc239640232"/>
+      <w:bookmarkStart w:id="5" w:name="_Toc239795182"/>
       <w:r>
         <w:rPr>
           <w:lang w:val="es-AR"/>
@@ -3837,8 +4017,17 @@
                 <w:sz w:val="17"/>
                 <w:lang w:val="es-AR"/>
               </w:rPr>
-              <w:t>A1 Bienvenida  →</w:t>
-            </w:r>
+              <w:t xml:space="preserve">A1 </w:t>
+            </w:r>
+            <w:proofErr w:type="gramStart"/>
+            <w:r>
+              <w:rPr>
+                <w:sz w:val="17"/>
+                <w:lang w:val="es-AR"/>
+              </w:rPr>
+              <w:t>Bienvenida  →</w:t>
+            </w:r>
+            <w:proofErr w:type="gramEnd"/>
           </w:p>
           <w:p>
             <w:pPr>
@@ -3885,8 +4074,33 @@
                 <w:sz w:val="17"/>
                 <w:lang w:val="es-AR"/>
               </w:rPr>
-              <w:t>A4 Revisá el recorrido  →</w:t>
-            </w:r>
+              <w:t xml:space="preserve">A4 </w:t>
+            </w:r>
+            <w:proofErr w:type="spellStart"/>
+            <w:r>
+              <w:rPr>
+                <w:sz w:val="17"/>
+                <w:lang w:val="es-AR"/>
+              </w:rPr>
+              <w:t>Revisá</w:t>
+            </w:r>
+            <w:proofErr w:type="spellEnd"/>
+            <w:r>
+              <w:rPr>
+                <w:sz w:val="17"/>
+                <w:lang w:val="es-AR"/>
+              </w:rPr>
+              <w:t xml:space="preserve"> el </w:t>
+            </w:r>
+            <w:proofErr w:type="gramStart"/>
+            <w:r>
+              <w:rPr>
+                <w:sz w:val="17"/>
+                <w:lang w:val="es-AR"/>
+              </w:rPr>
+              <w:t>recorrido  →</w:t>
+            </w:r>
+            <w:proofErr w:type="gramEnd"/>
           </w:p>
           <w:p>
             <w:pPr>
@@ -4144,8 +4358,17 @@
                 <w:sz w:val="17"/>
                 <w:lang w:val="es-AR"/>
               </w:rPr>
-              <w:t>B1 Pantalla única  →</w:t>
-            </w:r>
+              <w:t xml:space="preserve">B1 Pantalla </w:t>
+            </w:r>
+            <w:proofErr w:type="gramStart"/>
+            <w:r>
+              <w:rPr>
+                <w:sz w:val="17"/>
+                <w:lang w:val="es-AR"/>
+              </w:rPr>
+              <w:t>única  →</w:t>
+            </w:r>
+            <w:proofErr w:type="gramEnd"/>
           </w:p>
           <w:p>
             <w:pPr>
@@ -4402,8 +4625,17 @@
                 <w:sz w:val="17"/>
                 <w:lang w:val="es-AR"/>
               </w:rPr>
-              <w:t>C1 Elegir origen y destino  →</w:t>
-            </w:r>
+              <w:t xml:space="preserve">C1 Elegir origen y </w:t>
+            </w:r>
+            <w:proofErr w:type="gramStart"/>
+            <w:r>
+              <w:rPr>
+                <w:sz w:val="17"/>
+                <w:lang w:val="es-AR"/>
+              </w:rPr>
+              <w:t>destino  →</w:t>
+            </w:r>
+            <w:proofErr w:type="gramEnd"/>
           </w:p>
           <w:p>
             <w:pPr>
@@ -4418,8 +4650,17 @@
                 <w:sz w:val="17"/>
                 <w:lang w:val="es-AR"/>
               </w:rPr>
-              <w:t>C2 Antes de calcular  →</w:t>
-            </w:r>
+              <w:t xml:space="preserve">C2 Antes de </w:t>
+            </w:r>
+            <w:proofErr w:type="gramStart"/>
+            <w:r>
+              <w:rPr>
+                <w:sz w:val="17"/>
+                <w:lang w:val="es-AR"/>
+              </w:rPr>
+              <w:t>calcular  →</w:t>
+            </w:r>
+            <w:proofErr w:type="gramEnd"/>
           </w:p>
           <w:p>
             <w:pPr>
@@ -4434,8 +4675,17 @@
                 <w:sz w:val="17"/>
                 <w:lang w:val="es-AR"/>
               </w:rPr>
-              <w:t>C3 Confirmación que cambia el camino  →</w:t>
-            </w:r>
+              <w:t xml:space="preserve">C3 Confirmación que cambia el </w:t>
+            </w:r>
+            <w:proofErr w:type="gramStart"/>
+            <w:r>
+              <w:rPr>
+                <w:sz w:val="17"/>
+                <w:lang w:val="es-AR"/>
+              </w:rPr>
+              <w:t>camino  →</w:t>
+            </w:r>
+            <w:proofErr w:type="gramEnd"/>
           </w:p>
           <w:p>
             <w:pPr>
@@ -4450,8 +4700,17 @@
                 <w:sz w:val="17"/>
                 <w:lang w:val="es-AR"/>
               </w:rPr>
-              <w:t>C4 La ruta calculada  →</w:t>
-            </w:r>
+              <w:t xml:space="preserve">C4 La ruta </w:t>
+            </w:r>
+            <w:proofErr w:type="gramStart"/>
+            <w:r>
+              <w:rPr>
+                <w:sz w:val="17"/>
+                <w:lang w:val="es-AR"/>
+              </w:rPr>
+              <w:t>calculada  →</w:t>
+            </w:r>
+            <w:proofErr w:type="gramEnd"/>
           </w:p>
           <w:p>
             <w:pPr>
@@ -4602,12 +4861,37 @@
                 <w:lang w:val="es-AR"/>
               </w:rPr>
             </w:pPr>
+            <w:proofErr w:type="spellStart"/>
             <w:r>
               <w:rPr>
                 <w:sz w:val="18"/>
                 <w:lang w:val="es-AR"/>
               </w:rPr>
-              <w:t>docs/diseno/Alternativas-de-diseño.pdf</w:t>
+              <w:t>docs</w:t>
+            </w:r>
+            <w:proofErr w:type="spellEnd"/>
+            <w:r>
+              <w:rPr>
+                <w:sz w:val="18"/>
+                <w:lang w:val="es-AR"/>
+              </w:rPr>
+              <w:t>/</w:t>
+            </w:r>
+            <w:proofErr w:type="spellStart"/>
+            <w:r>
+              <w:rPr>
+                <w:sz w:val="18"/>
+                <w:lang w:val="es-AR"/>
+              </w:rPr>
+              <w:t>diseno</w:t>
+            </w:r>
+            <w:proofErr w:type="spellEnd"/>
+            <w:r>
+              <w:rPr>
+                <w:sz w:val="18"/>
+                <w:lang w:val="es-AR"/>
+              </w:rPr>
+              <w:t>/Alternativas-de-diseño.pdf</w:t>
             </w:r>
           </w:p>
         </w:tc>
@@ -4629,7 +4913,7 @@
           <w:lang w:val="es-AR"/>
         </w:rPr>
       </w:pPr>
-      <w:bookmarkStart w:id="6" w:name="_Toc239640233"/>
+      <w:bookmarkStart w:id="6" w:name="_Toc239795183"/>
       <w:r>
         <w:rPr>
           <w:lang w:val="es-AR"/>
@@ -5003,7 +5287,23 @@
                 <w:sz w:val="17"/>
                 <w:lang w:val="es-AR"/>
               </w:rPr>
-              <w:t>La sustenta en parte: el usuario primario son ingresantes que todavía no conocen el campus y hoy combinan mapa institucional, carteles, web, WhatsApp, otras personas o prueba y error. La descarta el contexto de uso: la consulta ocurre antes de una clase, examen o trámite, a veces con poco margen de tiempo y con datos móviles con señal irregular en los cinco casos.</w:t>
+              <w:t xml:space="preserve">La sustenta en parte: </w:t>
+            </w:r>
+            <w:proofErr w:type="gramStart"/>
+            <w:r>
+              <w:rPr>
+                <w:sz w:val="17"/>
+                <w:lang w:val="es-AR"/>
+              </w:rPr>
+              <w:t>el usuario primario son</w:t>
+            </w:r>
+            <w:proofErr w:type="gramEnd"/>
+            <w:r>
+              <w:rPr>
+                <w:sz w:val="17"/>
+                <w:lang w:val="es-AR"/>
+              </w:rPr>
+              <w:t xml:space="preserve"> ingresantes que todavía no conocen el campus y hoy combinan mapa institucional, carteles, web, WhatsApp, otras personas o prueba y error. La descarta el contexto de uso: la consulta ocurre antes de una clase, examen o trámite, a veces con poco margen de tiempo y con datos móviles con señal irregular en los cinco casos.</w:t>
             </w:r>
           </w:p>
         </w:tc>
@@ -5505,14 +5805,22 @@
           <w:lang w:val="es-AR"/>
         </w:rPr>
       </w:pPr>
-      <w:bookmarkStart w:id="7" w:name="_Toc239640234"/>
+      <w:bookmarkStart w:id="7" w:name="_Toc239795184"/>
       <w:r>
         <w:rPr>
           <w:lang w:val="es-AR"/>
         </w:rPr>
-        <w:t>8. Desarrollar la alternativa elegida como wireframe</w:t>
+        <w:t xml:space="preserve">8. Desarrollar la alternativa elegida como </w:t>
+      </w:r>
+      <w:proofErr w:type="spellStart"/>
+      <w:r>
+        <w:rPr>
+          <w:lang w:val="es-AR"/>
+        </w:rPr>
+        <w:t>wireframe</w:t>
       </w:r>
       <w:bookmarkEnd w:id="7"/>
+      <w:proofErr w:type="spellEnd"/>
     </w:p>
     <w:tbl>
       <w:tblPr>
@@ -5606,12 +5914,1095 @@
         </w:tc>
       </w:tr>
     </w:tbl>
+    <w:p/>
     <w:p>
       <w:pPr>
+        <w:pStyle w:val="Ttulo1"/>
         <w:rPr>
           <w:lang w:val="es-AR"/>
         </w:rPr>
       </w:pPr>
+      <w:bookmarkStart w:id="8" w:name="_Toc239795185"/>
+      <w:r>
+        <w:rPr>
+          <w:lang w:val="es-AR"/>
+        </w:rPr>
+        <w:t>10. Fundamentación de las decisiones</w:t>
+      </w:r>
+      <w:bookmarkEnd w:id="8"/>
+    </w:p>
+    <w:p>
+      <w:pPr>
+        <w:rPr>
+          <w:rFonts w:cs="Arial"/>
+          <w:b/>
+          <w:sz w:val="20"/>
+          <w:lang w:val="es-AR"/>
+        </w:rPr>
+      </w:pPr>
+      <w:r>
+        <w:rPr>
+          <w:rFonts w:cs="Arial"/>
+          <w:b/>
+          <w:sz w:val="20"/>
+          <w:lang w:val="es-AR"/>
+        </w:rPr>
+        <w:t>10.1 Anclaje</w:t>
+      </w:r>
+    </w:p>
+    <w:p>
+      <w:pPr>
+        <w:rPr>
+          <w:rFonts w:cs="Arial"/>
+          <w:sz w:val="20"/>
+          <w:lang w:val="es-AR"/>
+        </w:rPr>
+      </w:pPr>
+      <w:r>
+        <w:rPr>
+          <w:rFonts w:cs="Arial"/>
+          <w:sz w:val="20"/>
+          <w:lang w:val="es-AR"/>
+        </w:rPr>
+        <w:t xml:space="preserve">Tres decisiones concretas del </w:t>
+      </w:r>
+      <w:proofErr w:type="spellStart"/>
+      <w:r>
+        <w:rPr>
+          <w:rFonts w:cs="Arial"/>
+          <w:sz w:val="20"/>
+          <w:lang w:val="es-AR"/>
+        </w:rPr>
+        <w:t>wireframe</w:t>
+      </w:r>
+      <w:proofErr w:type="spellEnd"/>
+      <w:r>
+        <w:rPr>
+          <w:rFonts w:cs="Arial"/>
+          <w:sz w:val="20"/>
+          <w:lang w:val="es-AR"/>
+        </w:rPr>
+        <w:t xml:space="preserve"> B - Eficiencia, ancladas en la data cruda de la encuesta del TP2</w:t>
+      </w:r>
+      <w:r>
+        <w:rPr>
+          <w:rFonts w:cs="Arial"/>
+          <w:sz w:val="20"/>
+          <w:lang w:val="es-AR"/>
+        </w:rPr>
+        <w:t>:</w:t>
+      </w:r>
+    </w:p>
+    <w:tbl>
+      <w:tblPr>
+        <w:tblW w:w="5000" w:type="pct"/>
+        <w:tblBorders>
+          <w:top w:val="single" w:sz="4" w:space="0" w:color="auto"/>
+          <w:left w:val="single" w:sz="4" w:space="0" w:color="auto"/>
+          <w:bottom w:val="single" w:sz="4" w:space="0" w:color="auto"/>
+          <w:right w:val="single" w:sz="4" w:space="0" w:color="auto"/>
+          <w:insideH w:val="single" w:sz="4" w:space="0" w:color="auto"/>
+          <w:insideV w:val="single" w:sz="4" w:space="0" w:color="auto"/>
+        </w:tblBorders>
+        <w:tblCellMar>
+          <w:left w:w="70" w:type="dxa"/>
+          <w:right w:w="70" w:type="dxa"/>
+        </w:tblCellMar>
+        <w:tblLook w:val="0000" w:firstRow="0" w:lastRow="0" w:firstColumn="0" w:lastColumn="0" w:noHBand="0" w:noVBand="0"/>
+      </w:tblPr>
+      <w:tblGrid>
+        <w:gridCol w:w="3000"/>
+        <w:gridCol w:w="3002"/>
+        <w:gridCol w:w="3002"/>
+      </w:tblGrid>
+      <w:tr>
+        <w:tc>
+          <w:tcPr>
+            <w:tcW w:w="1666" w:type="pct"/>
+            <w:shd w:val="clear" w:color="auto" w:fill="1F4E79"/>
+          </w:tcPr>
+          <w:p>
+            <w:pPr>
+              <w:rPr>
+                <w:rFonts w:cs="Arial"/>
+                <w:b/>
+                <w:sz w:val="17"/>
+                <w:lang w:val="es-AR"/>
+              </w:rPr>
+            </w:pPr>
+            <w:r>
+              <w:rPr>
+                <w:rFonts w:cs="Arial"/>
+                <w:b/>
+                <w:sz w:val="17"/>
+                <w:lang w:val="es-AR"/>
+              </w:rPr>
+              <w:t xml:space="preserve">Decisión del </w:t>
+            </w:r>
+            <w:proofErr w:type="spellStart"/>
+            <w:r>
+              <w:rPr>
+                <w:rFonts w:cs="Arial"/>
+                <w:b/>
+                <w:sz w:val="17"/>
+                <w:lang w:val="es-AR"/>
+              </w:rPr>
+              <w:t>wireframe</w:t>
+            </w:r>
+            <w:proofErr w:type="spellEnd"/>
+            <w:r>
+              <w:rPr>
+                <w:rFonts w:cs="Arial"/>
+                <w:b/>
+                <w:sz w:val="17"/>
+                <w:lang w:val="es-AR"/>
+              </w:rPr>
+              <w:t xml:space="preserve"> (B - Eficiencia)</w:t>
+            </w:r>
+          </w:p>
+        </w:tc>
+        <w:tc>
+          <w:tcPr>
+            <w:tcW w:w="1667" w:type="pct"/>
+            <w:shd w:val="clear" w:color="auto" w:fill="1F4E79"/>
+          </w:tcPr>
+          <w:p>
+            <w:pPr>
+              <w:rPr>
+                <w:rFonts w:cs="Arial"/>
+                <w:b/>
+                <w:sz w:val="17"/>
+                <w:lang w:val="es-AR"/>
+              </w:rPr>
+            </w:pPr>
+            <w:r>
+              <w:rPr>
+                <w:rFonts w:cs="Arial"/>
+                <w:b/>
+                <w:sz w:val="17"/>
+                <w:lang w:val="es-AR"/>
+              </w:rPr>
+              <w:t>Dato del TP2 (cita textual)</w:t>
+            </w:r>
+          </w:p>
+        </w:tc>
+        <w:tc>
+          <w:tcPr>
+            <w:tcW w:w="1667" w:type="pct"/>
+            <w:shd w:val="clear" w:color="auto" w:fill="1F4E79"/>
+          </w:tcPr>
+          <w:p>
+            <w:pPr>
+              <w:rPr>
+                <w:rFonts w:cs="Arial"/>
+                <w:b/>
+                <w:sz w:val="17"/>
+                <w:lang w:val="es-AR"/>
+              </w:rPr>
+            </w:pPr>
+            <w:r>
+              <w:rPr>
+                <w:rFonts w:cs="Arial"/>
+                <w:b/>
+                <w:sz w:val="17"/>
+                <w:lang w:val="es-AR"/>
+              </w:rPr>
+              <w:t>Por qué sustenta la decisión</w:t>
+            </w:r>
+          </w:p>
+        </w:tc>
+      </w:tr>
+      <w:tr>
+        <w:tc>
+          <w:tcPr>
+            <w:tcW w:w="1666" w:type="pct"/>
+          </w:tcPr>
+          <w:p>
+            <w:pPr>
+              <w:rPr>
+                <w:rFonts w:cs="Arial"/>
+                <w:sz w:val="17"/>
+                <w:lang w:val="es-AR"/>
+              </w:rPr>
+            </w:pPr>
+            <w:r>
+              <w:rPr>
+                <w:rFonts w:cs="Arial"/>
+                <w:sz w:val="17"/>
+                <w:lang w:val="es-AR"/>
+              </w:rPr>
+              <w:t>El origen queda precargado con el último usado y la ruta se resuelve en ~2 toques, sin pantallas intermedias de revisión.</w:t>
+            </w:r>
+          </w:p>
+        </w:tc>
+        <w:tc>
+          <w:tcPr>
+            <w:tcW w:w="1667" w:type="pct"/>
+          </w:tcPr>
+          <w:p>
+            <w:pPr>
+              <w:rPr>
+                <w:rFonts w:cs="Arial"/>
+                <w:sz w:val="17"/>
+                <w:lang w:val="es-AR"/>
+              </w:rPr>
+            </w:pPr>
+            <w:r>
+              <w:rPr>
+                <w:rFonts w:cs="Arial" w:hint="eastAsia"/>
+                <w:sz w:val="17"/>
+                <w:lang w:val="es-AR"/>
+              </w:rPr>
+              <w:t>Pregunta 4: "Aproximadamente,</w:t>
+            </w:r>
+            <w:r>
+              <w:rPr>
+                <w:rFonts w:cs="Arial"/>
+                <w:sz w:val="17"/>
+                <w:lang w:val="es-AR"/>
+              </w:rPr>
+              <w:t xml:space="preserve"> ¿</w:t>
+            </w:r>
+            <w:r>
+              <w:rPr>
+                <w:rFonts w:cs="Arial" w:hint="eastAsia"/>
+                <w:sz w:val="17"/>
+                <w:lang w:val="es-AR"/>
+              </w:rPr>
+              <w:t xml:space="preserve">cuánto tiempo perdiste la última vez que te costó encontrar un lugar en el campus?" </w:t>
+            </w:r>
+            <w:r>
+              <w:rPr>
+                <w:rFonts w:cs="Arial" w:hint="eastAsia"/>
+                <w:sz w:val="17"/>
+                <w:lang w:val="es-AR"/>
+              </w:rPr>
+              <w:t>→</w:t>
+            </w:r>
+            <w:r>
+              <w:rPr>
+                <w:rFonts w:cs="Arial" w:hint="eastAsia"/>
+                <w:sz w:val="17"/>
+                <w:lang w:val="es-AR"/>
+              </w:rPr>
+              <w:t xml:space="preserve"> "Entre 5 y 10 minutos": 4. Pregunta 5</w:t>
+            </w:r>
+            <w:proofErr w:type="gramStart"/>
+            <w:r>
+              <w:rPr>
+                <w:rFonts w:cs="Arial" w:hint="eastAsia"/>
+                <w:sz w:val="17"/>
+                <w:lang w:val="es-AR"/>
+              </w:rPr>
+              <w:t>: "</w:t>
+            </w:r>
+            <w:r>
+              <w:rPr>
+                <w:rFonts w:cs="Arial"/>
+                <w:sz w:val="17"/>
+                <w:lang w:val="es-AR"/>
+              </w:rPr>
+              <w:t>¿</w:t>
+            </w:r>
+            <w:proofErr w:type="gramEnd"/>
+            <w:r>
+              <w:rPr>
+                <w:rFonts w:cs="Arial" w:hint="eastAsia"/>
+                <w:sz w:val="17"/>
+                <w:lang w:val="es-AR"/>
+              </w:rPr>
+              <w:t xml:space="preserve">Alguna vez llegaste tarde a una clase, examen o trámite </w:t>
+            </w:r>
+            <w:r>
+              <w:rPr>
+                <w:rFonts w:cs="Arial" w:hint="eastAsia"/>
+                <w:sz w:val="17"/>
+                <w:lang w:val="es-AR"/>
+              </w:rPr>
+              <w:lastRenderedPageBreak/>
+              <w:t xml:space="preserve">por no encontrar el lugar?" </w:t>
+            </w:r>
+            <w:r>
+              <w:rPr>
+                <w:rFonts w:cs="Arial" w:hint="eastAsia"/>
+                <w:sz w:val="17"/>
+                <w:lang w:val="es-AR"/>
+              </w:rPr>
+              <w:t>→</w:t>
+            </w:r>
+            <w:r>
+              <w:rPr>
+                <w:rFonts w:cs="Arial" w:hint="eastAsia"/>
+                <w:sz w:val="17"/>
+                <w:lang w:val="es-AR"/>
+              </w:rPr>
+              <w:t xml:space="preserve"> "Una vez": </w:t>
+            </w:r>
+            <w:r>
+              <w:rPr>
+                <w:rFonts w:cs="Arial"/>
+                <w:sz w:val="17"/>
+                <w:lang w:val="es-AR"/>
+              </w:rPr>
+              <w:t>3 / "Más de una vez": 1.</w:t>
+            </w:r>
+          </w:p>
+        </w:tc>
+        <w:tc>
+          <w:tcPr>
+            <w:tcW w:w="1667" w:type="pct"/>
+          </w:tcPr>
+          <w:p>
+            <w:pPr>
+              <w:rPr>
+                <w:rFonts w:cs="Arial"/>
+                <w:sz w:val="17"/>
+                <w:lang w:val="es-AR"/>
+              </w:rPr>
+            </w:pPr>
+            <w:r>
+              <w:rPr>
+                <w:rFonts w:cs="Arial"/>
+                <w:sz w:val="17"/>
+                <w:lang w:val="es-AR"/>
+              </w:rPr>
+              <w:lastRenderedPageBreak/>
+              <w:t xml:space="preserve">El usuario ya arranca con un presupuesto de tiempo ajustado y antecedente de llegar tarde: cada pantalla intermedia que la aplicación agregue compite directamente contra esos minutos. Precargar el origen y </w:t>
+            </w:r>
+            <w:r>
+              <w:rPr>
+                <w:rFonts w:cs="Arial"/>
+                <w:sz w:val="17"/>
+                <w:lang w:val="es-AR"/>
+              </w:rPr>
+              <w:lastRenderedPageBreak/>
+              <w:t>resolver en el mismo panel traduce ese hallazgo a la estructura de la pantalla.</w:t>
+            </w:r>
+          </w:p>
+        </w:tc>
+      </w:tr>
+      <w:tr>
+        <w:tc>
+          <w:tcPr>
+            <w:tcW w:w="1666" w:type="pct"/>
+          </w:tcPr>
+          <w:p>
+            <w:pPr>
+              <w:rPr>
+                <w:rFonts w:cs="Arial"/>
+                <w:sz w:val="17"/>
+                <w:lang w:val="es-AR"/>
+              </w:rPr>
+            </w:pPr>
+            <w:r>
+              <w:rPr>
+                <w:rFonts w:cs="Arial"/>
+                <w:sz w:val="17"/>
+                <w:lang w:val="es-AR"/>
+              </w:rPr>
+              <w:lastRenderedPageBreak/>
+              <w:t>Todo el flujo ocurre en una sola pantalla/carga (mapa único con panel), sin navegar entre pantallas de búsqueda y de resultado.</w:t>
+            </w:r>
+          </w:p>
+        </w:tc>
+        <w:tc>
+          <w:tcPr>
+            <w:tcW w:w="1667" w:type="pct"/>
+          </w:tcPr>
+          <w:p>
+            <w:pPr>
+              <w:rPr>
+                <w:rFonts w:cs="Arial"/>
+                <w:sz w:val="17"/>
+                <w:lang w:val="es-AR"/>
+              </w:rPr>
+            </w:pPr>
+            <w:r>
+              <w:rPr>
+                <w:rFonts w:cs="Arial" w:hint="eastAsia"/>
+                <w:sz w:val="17"/>
+                <w:lang w:val="es-AR"/>
+              </w:rPr>
+              <w:t xml:space="preserve">Pregunta 9: "Mientras estás dentro del campus, </w:t>
+            </w:r>
+            <w:r>
+              <w:rPr>
+                <w:rFonts w:cs="Arial"/>
+                <w:sz w:val="17"/>
+                <w:lang w:val="es-AR"/>
+              </w:rPr>
+              <w:t>¿</w:t>
+            </w:r>
+            <w:r>
+              <w:rPr>
+                <w:rFonts w:cs="Arial" w:hint="eastAsia"/>
+                <w:sz w:val="17"/>
+                <w:lang w:val="es-AR"/>
+              </w:rPr>
+              <w:t xml:space="preserve">con qué </w:t>
+            </w:r>
+            <w:proofErr w:type="spellStart"/>
+            <w:r>
+              <w:rPr>
+                <w:rFonts w:cs="Arial" w:hint="eastAsia"/>
+                <w:sz w:val="17"/>
+                <w:lang w:val="es-AR"/>
+              </w:rPr>
+              <w:t>contás</w:t>
+            </w:r>
+            <w:proofErr w:type="spellEnd"/>
+            <w:r>
+              <w:rPr>
+                <w:rFonts w:cs="Arial" w:hint="eastAsia"/>
+                <w:sz w:val="17"/>
+                <w:lang w:val="es-AR"/>
+              </w:rPr>
+              <w:t xml:space="preserve"> normalmente para conectarte a internet?" </w:t>
+            </w:r>
+            <w:r>
+              <w:rPr>
+                <w:rFonts w:cs="Arial" w:hint="eastAsia"/>
+                <w:sz w:val="17"/>
+                <w:lang w:val="es-AR"/>
+              </w:rPr>
+              <w:t>→</w:t>
+            </w:r>
+            <w:r>
+              <w:rPr>
+                <w:rFonts w:cs="Arial" w:hint="eastAsia"/>
+                <w:sz w:val="17"/>
+                <w:lang w:val="es-AR"/>
+              </w:rPr>
+              <w:t xml:space="preserve"> "Datos móviles con señal irregular": 5 (100% de los encuestados).</w:t>
+            </w:r>
+          </w:p>
+        </w:tc>
+        <w:tc>
+          <w:tcPr>
+            <w:tcW w:w="1667" w:type="pct"/>
+          </w:tcPr>
+          <w:p>
+            <w:pPr>
+              <w:rPr>
+                <w:rFonts w:cs="Arial"/>
+                <w:sz w:val="17"/>
+                <w:lang w:val="es-AR"/>
+              </w:rPr>
+            </w:pPr>
+            <w:r>
+              <w:rPr>
+                <w:rFonts w:cs="Arial"/>
+                <w:sz w:val="17"/>
+                <w:lang w:val="es-AR"/>
+              </w:rPr>
+              <w:t>Con conexión irregular, cada cambio de pantalla es una carga de red adicional que puede fallar. Resolver la consulta en una sola pantalla reduce los puntos donde una señal mala puede cortar el flujo.</w:t>
+            </w:r>
+          </w:p>
+        </w:tc>
+      </w:tr>
+      <w:tr>
+        <w:tc>
+          <w:tcPr>
+            <w:tcW w:w="1666" w:type="pct"/>
+          </w:tcPr>
+          <w:p>
+            <w:pPr>
+              <w:rPr>
+                <w:rFonts w:cs="Arial"/>
+                <w:sz w:val="17"/>
+                <w:lang w:val="es-AR"/>
+              </w:rPr>
+            </w:pPr>
+            <w:r>
+              <w:rPr>
+                <w:rFonts w:cs="Arial"/>
+                <w:sz w:val="17"/>
+                <w:lang w:val="es-AR"/>
+              </w:rPr>
+              <w:t xml:space="preserve">El resultado muestra ambas alternativas ("Techado" / "Más corto") como un </w:t>
+            </w:r>
+            <w:proofErr w:type="spellStart"/>
+            <w:r>
+              <w:rPr>
+                <w:rFonts w:cs="Arial"/>
+                <w:sz w:val="17"/>
+                <w:lang w:val="es-AR"/>
+              </w:rPr>
+              <w:t>toggle</w:t>
+            </w:r>
+            <w:proofErr w:type="spellEnd"/>
+            <w:r>
+              <w:rPr>
+                <w:rFonts w:cs="Arial"/>
+                <w:sz w:val="17"/>
+                <w:lang w:val="es-AR"/>
+              </w:rPr>
+              <w:t xml:space="preserve"> de un toque, sin pantalla de confirmación aparte.</w:t>
+            </w:r>
+          </w:p>
+        </w:tc>
+        <w:tc>
+          <w:tcPr>
+            <w:tcW w:w="1667" w:type="pct"/>
+          </w:tcPr>
+          <w:p>
+            <w:pPr>
+              <w:rPr>
+                <w:rFonts w:cs="Arial"/>
+                <w:sz w:val="17"/>
+                <w:lang w:val="es-AR"/>
+              </w:rPr>
+            </w:pPr>
+            <w:r>
+              <w:rPr>
+                <w:rFonts w:cs="Arial" w:hint="eastAsia"/>
+                <w:sz w:val="17"/>
+                <w:lang w:val="es-AR"/>
+              </w:rPr>
+              <w:t xml:space="preserve">Pregunta 12: "Cuando llueve y </w:t>
+            </w:r>
+            <w:proofErr w:type="spellStart"/>
+            <w:r>
+              <w:rPr>
+                <w:rFonts w:cs="Arial" w:hint="eastAsia"/>
+                <w:sz w:val="17"/>
+                <w:lang w:val="es-AR"/>
+              </w:rPr>
+              <w:t>tenés</w:t>
+            </w:r>
+            <w:proofErr w:type="spellEnd"/>
+            <w:r>
+              <w:rPr>
+                <w:rFonts w:cs="Arial" w:hint="eastAsia"/>
+                <w:sz w:val="17"/>
+                <w:lang w:val="es-AR"/>
+              </w:rPr>
+              <w:t xml:space="preserve"> que llegar a algún lugar dentro del campus, </w:t>
+            </w:r>
+            <w:r>
+              <w:rPr>
+                <w:rFonts w:cs="Arial"/>
+                <w:sz w:val="17"/>
+                <w:lang w:val="es-AR"/>
+              </w:rPr>
+              <w:t>¿</w:t>
+            </w:r>
+            <w:r>
+              <w:rPr>
+                <w:rFonts w:cs="Arial" w:hint="eastAsia"/>
+                <w:sz w:val="17"/>
+                <w:lang w:val="es-AR"/>
+              </w:rPr>
+              <w:t xml:space="preserve">preferís desviarte de tu camino habitual para evitar mojarte?" </w:t>
+            </w:r>
+            <w:r>
+              <w:rPr>
+                <w:rFonts w:cs="Arial" w:hint="eastAsia"/>
+                <w:sz w:val="17"/>
+                <w:lang w:val="es-AR"/>
+              </w:rPr>
+              <w:t>→</w:t>
+            </w:r>
+            <w:r>
+              <w:rPr>
+                <w:rFonts w:cs="Arial" w:hint="eastAsia"/>
+                <w:sz w:val="17"/>
+                <w:lang w:val="es-AR"/>
+              </w:rPr>
+              <w:t xml:space="preserve"> "Sí, aunque tarde un poco más": 3 / "No, prefiero llegar por el camino más rápido": 2.</w:t>
+            </w:r>
+          </w:p>
+        </w:tc>
+        <w:tc>
+          <w:tcPr>
+            <w:tcW w:w="1667" w:type="pct"/>
+          </w:tcPr>
+          <w:p>
+            <w:pPr>
+              <w:rPr>
+                <w:rFonts w:cs="Arial"/>
+                <w:sz w:val="17"/>
+                <w:lang w:val="es-AR"/>
+              </w:rPr>
+            </w:pPr>
+            <w:r>
+              <w:rPr>
+                <w:rFonts w:cs="Arial"/>
+                <w:sz w:val="17"/>
+                <w:lang w:val="es-AR"/>
+              </w:rPr>
+              <w:t xml:space="preserve">La preferencia está dividida (60%/40%): no hay una respuesta "correcta" que el sistema pueda decidir por el usuario. Alcanza con dejar las dos opciones a un toque de distancia y que </w:t>
+            </w:r>
+            <w:r>
+              <w:rPr>
+                <w:rFonts w:cs="Arial"/>
+                <w:sz w:val="17"/>
+                <w:lang w:val="es-AR"/>
+              </w:rPr>
+              <w:t>cada uno</w:t>
+            </w:r>
+            <w:r>
+              <w:rPr>
+                <w:rFonts w:cs="Arial"/>
+                <w:sz w:val="17"/>
+                <w:lang w:val="es-AR"/>
+              </w:rPr>
+              <w:t xml:space="preserve"> elija, sin una pantalla de confirmación adicional como en la alternativa C.</w:t>
+            </w:r>
+          </w:p>
+        </w:tc>
+      </w:tr>
+    </w:tbl>
+    <w:p>
+      <w:pPr>
+        <w:rPr>
+          <w:rFonts w:cs="Arial"/>
+          <w:sz w:val="20"/>
+          <w:lang w:val="es-AR"/>
+        </w:rPr>
+      </w:pPr>
+    </w:p>
+    <w:p>
+      <w:pPr>
+        <w:rPr>
+          <w:rFonts w:cs="Arial"/>
+          <w:b/>
+          <w:sz w:val="20"/>
+          <w:lang w:val="es-AR"/>
+        </w:rPr>
+      </w:pPr>
+      <w:r>
+        <w:rPr>
+          <w:rFonts w:cs="Arial"/>
+          <w:b/>
+          <w:sz w:val="20"/>
+          <w:lang w:val="es-AR"/>
+        </w:rPr>
+        <w:t>10.2 Descarte</w:t>
+      </w:r>
+    </w:p>
+    <w:p>
+      <w:pPr>
+        <w:rPr>
+          <w:rFonts w:cs="Arial"/>
+          <w:sz w:val="20"/>
+          <w:lang w:val="es-AR"/>
+        </w:rPr>
+      </w:pPr>
+      <w:r>
+        <w:rPr>
+          <w:rFonts w:cs="Arial"/>
+          <w:sz w:val="20"/>
+          <w:lang w:val="es-AR"/>
+        </w:rPr>
+        <w:t xml:space="preserve">Dos rechazos fundamentados, documentados en las anotaciones de diseño del </w:t>
+      </w:r>
+      <w:proofErr w:type="spellStart"/>
+      <w:r>
+        <w:rPr>
+          <w:rFonts w:cs="Arial"/>
+          <w:sz w:val="20"/>
+          <w:lang w:val="es-AR"/>
+        </w:rPr>
+        <w:t>wireframe</w:t>
+      </w:r>
+      <w:proofErr w:type="spellEnd"/>
+      <w:r>
+        <w:rPr>
+          <w:rFonts w:cs="Arial"/>
+          <w:sz w:val="20"/>
+          <w:lang w:val="es-AR"/>
+        </w:rPr>
+        <w:t xml:space="preserve"> (</w:t>
+      </w:r>
+      <w:proofErr w:type="spellStart"/>
+      <w:r>
+        <w:rPr>
+          <w:rFonts w:cs="Arial"/>
+          <w:sz w:val="20"/>
+          <w:lang w:val="es-AR"/>
+        </w:rPr>
+        <w:t>docs</w:t>
+      </w:r>
+      <w:proofErr w:type="spellEnd"/>
+      <w:r>
+        <w:rPr>
+          <w:rFonts w:cs="Arial"/>
+          <w:sz w:val="20"/>
+          <w:lang w:val="es-AR"/>
+        </w:rPr>
+        <w:t>/</w:t>
+      </w:r>
+      <w:proofErr w:type="spellStart"/>
+      <w:r>
+        <w:rPr>
+          <w:rFonts w:cs="Arial"/>
+          <w:sz w:val="20"/>
+          <w:lang w:val="es-AR"/>
+        </w:rPr>
+        <w:t>diseno</w:t>
+      </w:r>
+      <w:proofErr w:type="spellEnd"/>
+      <w:r>
+        <w:rPr>
+          <w:rFonts w:cs="Arial"/>
+          <w:sz w:val="20"/>
+          <w:lang w:val="es-AR"/>
+        </w:rPr>
+        <w:t>/</w:t>
+      </w:r>
+      <w:proofErr w:type="spellStart"/>
+      <w:r>
+        <w:rPr>
+          <w:rFonts w:cs="Arial"/>
+          <w:sz w:val="20"/>
+          <w:lang w:val="es-AR"/>
+        </w:rPr>
+        <w:t>wireframe</w:t>
+      </w:r>
+      <w:proofErr w:type="spellEnd"/>
+      <w:r>
+        <w:rPr>
+          <w:rFonts w:cs="Arial"/>
+          <w:sz w:val="20"/>
+          <w:lang w:val="es-AR"/>
+        </w:rPr>
+        <w:t>/index.html) y en las alternativas generadas por Claude (</w:t>
+      </w:r>
+      <w:proofErr w:type="spellStart"/>
+      <w:r>
+        <w:rPr>
+          <w:rFonts w:cs="Arial"/>
+          <w:sz w:val="20"/>
+          <w:lang w:val="es-AR"/>
+        </w:rPr>
+        <w:t>docs</w:t>
+      </w:r>
+      <w:proofErr w:type="spellEnd"/>
+      <w:r>
+        <w:rPr>
+          <w:rFonts w:cs="Arial"/>
+          <w:sz w:val="20"/>
+          <w:lang w:val="es-AR"/>
+        </w:rPr>
+        <w:t>/</w:t>
+      </w:r>
+      <w:proofErr w:type="spellStart"/>
+      <w:r>
+        <w:rPr>
+          <w:rFonts w:cs="Arial"/>
+          <w:sz w:val="20"/>
+          <w:lang w:val="es-AR"/>
+        </w:rPr>
+        <w:t>diseno</w:t>
+      </w:r>
+      <w:proofErr w:type="spellEnd"/>
+      <w:r>
+        <w:rPr>
+          <w:rFonts w:cs="Arial"/>
+          <w:sz w:val="20"/>
+          <w:lang w:val="es-AR"/>
+        </w:rPr>
+        <w:t>/Alternativas-de-diseño.pdf):</w:t>
+      </w:r>
+    </w:p>
+    <w:tbl>
+      <w:tblPr>
+        <w:tblW w:w="5000" w:type="pct"/>
+        <w:tblBorders>
+          <w:top w:val="single" w:sz="4" w:space="0" w:color="auto"/>
+          <w:left w:val="single" w:sz="4" w:space="0" w:color="auto"/>
+          <w:bottom w:val="single" w:sz="4" w:space="0" w:color="auto"/>
+          <w:right w:val="single" w:sz="4" w:space="0" w:color="auto"/>
+          <w:insideH w:val="single" w:sz="4" w:space="0" w:color="auto"/>
+          <w:insideV w:val="single" w:sz="4" w:space="0" w:color="auto"/>
+        </w:tblBorders>
+        <w:tblCellMar>
+          <w:left w:w="70" w:type="dxa"/>
+          <w:right w:w="70" w:type="dxa"/>
+        </w:tblCellMar>
+        <w:tblLook w:val="0000" w:firstRow="0" w:lastRow="0" w:firstColumn="0" w:lastColumn="0" w:noHBand="0" w:noVBand="0"/>
+      </w:tblPr>
+      <w:tblGrid>
+        <w:gridCol w:w="3000"/>
+        <w:gridCol w:w="3002"/>
+        <w:gridCol w:w="3002"/>
+      </w:tblGrid>
+      <w:tr>
+        <w:tc>
+          <w:tcPr>
+            <w:tcW w:w="1666" w:type="pct"/>
+            <w:shd w:val="clear" w:color="auto" w:fill="1F4E79"/>
+          </w:tcPr>
+          <w:p>
+            <w:pPr>
+              <w:rPr>
+                <w:rFonts w:cs="Arial"/>
+                <w:b/>
+                <w:sz w:val="17"/>
+                <w:lang w:val="es-AR"/>
+              </w:rPr>
+            </w:pPr>
+            <w:r>
+              <w:rPr>
+                <w:rFonts w:cs="Arial"/>
+                <w:b/>
+                <w:sz w:val="17"/>
+                <w:lang w:val="es-AR"/>
+              </w:rPr>
+              <w:t>Propuesta de Claude</w:t>
+            </w:r>
+          </w:p>
+        </w:tc>
+        <w:tc>
+          <w:tcPr>
+            <w:tcW w:w="1667" w:type="pct"/>
+            <w:shd w:val="clear" w:color="auto" w:fill="1F4E79"/>
+          </w:tcPr>
+          <w:p>
+            <w:pPr>
+              <w:rPr>
+                <w:rFonts w:cs="Arial"/>
+                <w:b/>
+                <w:sz w:val="17"/>
+                <w:lang w:val="es-AR"/>
+              </w:rPr>
+            </w:pPr>
+            <w:r>
+              <w:rPr>
+                <w:rFonts w:cs="Arial"/>
+                <w:b/>
+                <w:sz w:val="17"/>
+                <w:lang w:val="es-AR"/>
+              </w:rPr>
+              <w:t>Hallazgo del TP2 que la contradice</w:t>
+            </w:r>
+          </w:p>
+        </w:tc>
+        <w:tc>
+          <w:tcPr>
+            <w:tcW w:w="1667" w:type="pct"/>
+            <w:shd w:val="clear" w:color="auto" w:fill="1F4E79"/>
+          </w:tcPr>
+          <w:p>
+            <w:pPr>
+              <w:rPr>
+                <w:rFonts w:cs="Arial"/>
+                <w:b/>
+                <w:sz w:val="17"/>
+                <w:lang w:val="es-AR"/>
+              </w:rPr>
+            </w:pPr>
+            <w:r>
+              <w:rPr>
+                <w:rFonts w:cs="Arial"/>
+                <w:b/>
+                <w:sz w:val="17"/>
+                <w:lang w:val="es-AR"/>
+              </w:rPr>
+              <w:t>Con qué se reemplazó</w:t>
+            </w:r>
+          </w:p>
+        </w:tc>
+      </w:tr>
+      <w:tr>
+        <w:tc>
+          <w:tcPr>
+            <w:tcW w:w="1666" w:type="pct"/>
+          </w:tcPr>
+          <w:p>
+            <w:pPr>
+              <w:rPr>
+                <w:rFonts w:cs="Arial"/>
+                <w:sz w:val="17"/>
+                <w:lang w:val="es-AR"/>
+              </w:rPr>
+            </w:pPr>
+            <w:r>
+              <w:rPr>
+                <w:rFonts w:cs="Arial"/>
+                <w:sz w:val="17"/>
+                <w:lang w:val="es-AR"/>
+              </w:rPr>
+              <w:t>Alternativa A - pantalla de bienvenida (A1) que explica el modelo en tres pasos antes de pedir el primer dato.</w:t>
+            </w:r>
+          </w:p>
+        </w:tc>
+        <w:tc>
+          <w:tcPr>
+            <w:tcW w:w="1667" w:type="pct"/>
+          </w:tcPr>
+          <w:p>
+            <w:pPr>
+              <w:rPr>
+                <w:rFonts w:cs="Arial"/>
+                <w:sz w:val="17"/>
+                <w:lang w:val="es-AR"/>
+              </w:rPr>
+            </w:pPr>
+            <w:r>
+              <w:rPr>
+                <w:rFonts w:cs="Arial"/>
+                <w:sz w:val="17"/>
+                <w:lang w:val="es-AR"/>
+              </w:rPr>
+              <w:t>Los cinco encuestados declararon señal de datos móviles irregular (pregunta 9), y cuatro de los cinco perdieron entre cinco y diez minutos la última vez que no encontraron un destino, llegando tarde al menos una vez (preguntas 4 y 5). Una pantalla de bienvenida agrega un paso fijo en cada uso, justo cuando el margen de tiempo es lo que menos sobra.</w:t>
+            </w:r>
+          </w:p>
+        </w:tc>
+        <w:tc>
+          <w:tcPr>
+            <w:tcW w:w="1667" w:type="pct"/>
+          </w:tcPr>
+          <w:p>
+            <w:pPr>
+              <w:rPr>
+                <w:rFonts w:cs="Arial"/>
+                <w:sz w:val="17"/>
+                <w:lang w:val="es-AR"/>
+              </w:rPr>
+            </w:pPr>
+            <w:r>
+              <w:rPr>
+                <w:rFonts w:cs="Arial"/>
+                <w:sz w:val="17"/>
+                <w:lang w:val="es-AR"/>
+              </w:rPr>
+              <w:t>El listado de "Últimos destinos" siempre visible en la pantalla de inicio de B, que cumple la misma función de orientar al usuario con ejemplos de qué se puede pedir, sin interponer una pantalla fija.</w:t>
+            </w:r>
+          </w:p>
+        </w:tc>
+      </w:tr>
+      <w:tr>
+        <w:tc>
+          <w:tcPr>
+            <w:tcW w:w="1666" w:type="pct"/>
+          </w:tcPr>
+          <w:p>
+            <w:pPr>
+              <w:rPr>
+                <w:rFonts w:cs="Arial"/>
+                <w:sz w:val="17"/>
+                <w:lang w:val="es-AR"/>
+              </w:rPr>
+            </w:pPr>
+            <w:r>
+              <w:rPr>
+                <w:rFonts w:cs="Arial"/>
+                <w:sz w:val="17"/>
+                <w:lang w:val="es-AR"/>
+              </w:rPr>
+              <w:t>Alternativa C - pedir confirmación explícita ("¿Te llevamos por adentro?") antes de aplicar el criterio con lluvia, y volver a confirmar para cambiar de opción.</w:t>
+            </w:r>
+          </w:p>
+        </w:tc>
+        <w:tc>
+          <w:tcPr>
+            <w:tcW w:w="1667" w:type="pct"/>
+          </w:tcPr>
+          <w:p>
+            <w:pPr>
+              <w:rPr>
+                <w:rFonts w:cs="Arial"/>
+                <w:sz w:val="17"/>
+                <w:lang w:val="es-AR"/>
+              </w:rPr>
+            </w:pPr>
+            <w:r>
+              <w:rPr>
+                <w:rFonts w:cs="Arial"/>
+                <w:sz w:val="17"/>
+                <w:lang w:val="es-AR"/>
+              </w:rPr>
+              <w:t>La preferencia frente a la lluvia está dividida (pregunta 12: 3 de 5 se desvían, 2 de 5 prefieren el camino más rápido) - no hay una opción correcta que amerite una confirmación obligatoria; y cambiar de criterio es una acción reversible con el mismo toque, por lo que confirmarla no evita ningún error real.</w:t>
+            </w:r>
+          </w:p>
+        </w:tc>
+        <w:tc>
+          <w:tcPr>
+            <w:tcW w:w="1667" w:type="pct"/>
+          </w:tcPr>
+          <w:p>
+            <w:pPr>
+              <w:rPr>
+                <w:rFonts w:cs="Arial"/>
+                <w:sz w:val="17"/>
+                <w:lang w:val="es-AR"/>
+              </w:rPr>
+            </w:pPr>
+            <w:r>
+              <w:rPr>
+                <w:rFonts w:cs="Arial"/>
+                <w:sz w:val="17"/>
+                <w:lang w:val="es-AR"/>
+              </w:rPr>
+              <w:t>En B, ambos criterios se muestran como un selector de dos opciones dentro del propio resultado (por ejemplo, "Techado - 6 min" / "Más corto - 4 min"); tocar la opción no activa redibuja la ruta y el tiempo en el momento, sin pantallas ni preguntas intermedias.</w:t>
+            </w:r>
+          </w:p>
+        </w:tc>
+      </w:tr>
+    </w:tbl>
+    <w:p>
+      <w:pPr>
+        <w:rPr>
+          <w:rFonts w:cs="Arial"/>
+          <w:sz w:val="20"/>
+          <w:lang w:val="es-AR"/>
+        </w:rPr>
+      </w:pPr>
+    </w:p>
+    <w:p>
+      <w:pPr>
+        <w:rPr>
+          <w:rFonts w:cs="Arial"/>
+          <w:b/>
+          <w:sz w:val="20"/>
+          <w:lang w:val="es-AR"/>
+        </w:rPr>
+      </w:pPr>
+      <w:r>
+        <w:rPr>
+          <w:rFonts w:cs="Arial"/>
+          <w:b/>
+          <w:sz w:val="20"/>
+          <w:lang w:val="es-AR"/>
+        </w:rPr>
+        <w:t>10.3 El elemento crítico</w:t>
+      </w:r>
+    </w:p>
+    <w:p>
+      <w:pPr>
+        <w:rPr>
+          <w:rFonts w:cs="Arial"/>
+          <w:sz w:val="20"/>
+          <w:lang w:val="es-AR"/>
+        </w:rPr>
+      </w:pPr>
+      <w:r>
+        <w:rPr>
+          <w:rFonts w:cs="Arial"/>
+          <w:sz w:val="20"/>
+          <w:lang w:val="es-AR"/>
+        </w:rPr>
+        <w:t>El elemento crítico es poder calcular la ruta más corta entre el origen y el destino, y trazarla sobre el mapa para que el usuario la siga. Sin este cálculo y su representación visual no hay producto que probar: no hay ruta que caminar ni forma de confirmar o refutar ninguna parte de la hipótesis. El resto de los elementos del MVP depende de que este cálculo exista para tener sentido.</w:t>
+      </w:r>
+    </w:p>
+    <w:p>
+      <w:pPr>
+        <w:rPr>
+          <w:rFonts w:cs="Arial"/>
+          <w:sz w:val="20"/>
+          <w:lang w:val="es-AR"/>
+        </w:rPr>
+      </w:pPr>
+      <w:r>
+        <w:rPr>
+          <w:rFonts w:cs="Arial"/>
+          <w:sz w:val="20"/>
+          <w:lang w:val="es-AR"/>
+        </w:rPr>
+        <w:t>No identificamos ningún elemento incluido en el MVP que pueda sacarse sin perder esa capacidad. La selección de origen y destino es el insumo necesario para calcular cualquier ruta, y la exclusión de tramos cerrados está explícita en el criterio de validación de la hipótesis ("sin intentar pasar por un acceso cerrado"). Sacar cualquiera de las dos implicaría dejar de probar una parte de lo que la hipótesis afirma.</w:t>
+      </w:r>
     </w:p>
     <w:sectPr>
       <w:headerReference w:type="default" r:id="rId15"/>

</xml_diff>